<commit_message>
auto articles article 2 test2
</commit_message>
<xml_diff>
--- a/completePDF/Meritocratic Republic of Canada.docx
+++ b/completePDF/Meritocratic Republic of Canada.docx
@@ -927,7 +927,7 @@
                 <w:noProof/>
                 <w:webHidden/>
               </w:rPr>
-              <w:t>14</w:t>
+              <w:t>15</w:t>
             </w:r>
             <w:r>
               <w:rPr>
@@ -1000,7 +1000,7 @@
                 <w:noProof/>
                 <w:webHidden/>
               </w:rPr>
-              <w:t>15</w:t>
+              <w:t>16</w:t>
             </w:r>
             <w:r>
               <w:rPr>
@@ -1073,7 +1073,7 @@
                 <w:noProof/>
                 <w:webHidden/>
               </w:rPr>
-              <w:t>20</w:t>
+              <w:t>22</w:t>
             </w:r>
             <w:r>
               <w:rPr>
@@ -1146,7 +1146,7 @@
                 <w:noProof/>
                 <w:webHidden/>
               </w:rPr>
-              <w:t>27</w:t>
+              <w:t>29</w:t>
             </w:r>
             <w:r>
               <w:rPr>
@@ -1219,7 +1219,7 @@
                 <w:noProof/>
                 <w:webHidden/>
               </w:rPr>
-              <w:t>32</w:t>
+              <w:t>34</w:t>
             </w:r>
             <w:r>
               <w:rPr>
@@ -1292,7 +1292,7 @@
                 <w:noProof/>
                 <w:webHidden/>
               </w:rPr>
-              <w:t>37</w:t>
+              <w:t>40</w:t>
             </w:r>
             <w:r>
               <w:rPr>
@@ -1365,7 +1365,7 @@
                 <w:noProof/>
                 <w:webHidden/>
               </w:rPr>
-              <w:t>43</w:t>
+              <w:t>46</w:t>
             </w:r>
             <w:r>
               <w:rPr>
@@ -1438,7 +1438,7 @@
                 <w:noProof/>
                 <w:webHidden/>
               </w:rPr>
-              <w:t>46</w:t>
+              <w:t>49</w:t>
             </w:r>
             <w:r>
               <w:rPr>
@@ -1511,7 +1511,7 @@
                 <w:noProof/>
                 <w:webHidden/>
               </w:rPr>
-              <w:t>49</w:t>
+              <w:t>53</w:t>
             </w:r>
             <w:r>
               <w:rPr>
@@ -1584,7 +1584,7 @@
                 <w:noProof/>
                 <w:webHidden/>
               </w:rPr>
-              <w:t>54</w:t>
+              <w:t>58</w:t>
             </w:r>
             <w:r>
               <w:rPr>
@@ -1657,7 +1657,7 @@
                 <w:noProof/>
                 <w:webHidden/>
               </w:rPr>
-              <w:t>65</w:t>
+              <w:t>70</w:t>
             </w:r>
             <w:r>
               <w:rPr>
@@ -1730,7 +1730,7 @@
                 <w:noProof/>
                 <w:webHidden/>
               </w:rPr>
-              <w:t>69</w:t>
+              <w:t>74</w:t>
             </w:r>
             <w:r>
               <w:rPr>
@@ -1803,7 +1803,7 @@
                 <w:noProof/>
                 <w:webHidden/>
               </w:rPr>
-              <w:t>73</w:t>
+              <w:t>79</w:t>
             </w:r>
             <w:r>
               <w:rPr>
@@ -1876,7 +1876,7 @@
                 <w:noProof/>
                 <w:webHidden/>
               </w:rPr>
-              <w:t>76</w:t>
+              <w:t>82</w:t>
             </w:r>
             <w:r>
               <w:rPr>
@@ -1949,7 +1949,7 @@
                 <w:noProof/>
                 <w:webHidden/>
               </w:rPr>
-              <w:t>82</w:t>
+              <w:t>88</w:t>
             </w:r>
             <w:r>
               <w:rPr>
@@ -2022,7 +2022,7 @@
                 <w:noProof/>
                 <w:webHidden/>
               </w:rPr>
-              <w:t>86</w:t>
+              <w:t>92</w:t>
             </w:r>
             <w:r>
               <w:rPr>
@@ -2095,7 +2095,7 @@
                 <w:noProof/>
                 <w:webHidden/>
               </w:rPr>
-              <w:t>92</w:t>
+              <w:t>98</w:t>
             </w:r>
             <w:r>
               <w:rPr>
@@ -2168,7 +2168,7 @@
                 <w:noProof/>
                 <w:webHidden/>
               </w:rPr>
-              <w:t>95</w:t>
+              <w:t>101</w:t>
             </w:r>
             <w:r>
               <w:rPr>
@@ -2241,7 +2241,7 @@
                 <w:noProof/>
                 <w:webHidden/>
               </w:rPr>
-              <w:t>103</w:t>
+              <w:t>109</w:t>
             </w:r>
             <w:r>
               <w:rPr>
@@ -2314,7 +2314,7 @@
                 <w:noProof/>
                 <w:webHidden/>
               </w:rPr>
-              <w:t>108</w:t>
+              <w:t>115</w:t>
             </w:r>
             <w:r>
               <w:rPr>
@@ -2387,7 +2387,7 @@
                 <w:noProof/>
                 <w:webHidden/>
               </w:rPr>
-              <w:t>112</w:t>
+              <w:t>119</w:t>
             </w:r>
             <w:r>
               <w:rPr>
@@ -2460,7 +2460,7 @@
                 <w:noProof/>
                 <w:webHidden/>
               </w:rPr>
-              <w:t>118</w:t>
+              <w:t>125</w:t>
             </w:r>
             <w:r>
               <w:rPr>
@@ -2533,7 +2533,7 @@
                 <w:noProof/>
                 <w:webHidden/>
               </w:rPr>
-              <w:t>123</w:t>
+              <w:t>130</w:t>
             </w:r>
             <w:r>
               <w:rPr>
@@ -2606,7 +2606,7 @@
                 <w:noProof/>
                 <w:webHidden/>
               </w:rPr>
-              <w:t>130</w:t>
+              <w:t>137</w:t>
             </w:r>
             <w:r>
               <w:rPr>
@@ -2679,7 +2679,7 @@
                 <w:noProof/>
                 <w:webHidden/>
               </w:rPr>
-              <w:t>135</w:t>
+              <w:t>142</w:t>
             </w:r>
             <w:r>
               <w:rPr>
@@ -2752,7 +2752,7 @@
                 <w:noProof/>
                 <w:webHidden/>
               </w:rPr>
-              <w:t>140</w:t>
+              <w:t>147</w:t>
             </w:r>
             <w:r>
               <w:rPr>
@@ -2825,7 +2825,7 @@
                 <w:noProof/>
                 <w:webHidden/>
               </w:rPr>
-              <w:t>146</w:t>
+              <w:t>153</w:t>
             </w:r>
             <w:r>
               <w:rPr>
@@ -2898,7 +2898,7 @@
                 <w:noProof/>
                 <w:webHidden/>
               </w:rPr>
-              <w:t>149</w:t>
+              <w:t>156</w:t>
             </w:r>
             <w:r>
               <w:rPr>
@@ -2971,7 +2971,7 @@
                 <w:noProof/>
                 <w:webHidden/>
               </w:rPr>
-              <w:t>153</w:t>
+              <w:t>160</w:t>
             </w:r>
             <w:r>
               <w:rPr>
@@ -3044,7 +3044,7 @@
                 <w:noProof/>
                 <w:webHidden/>
               </w:rPr>
-              <w:t>159</w:t>
+              <w:t>166</w:t>
             </w:r>
             <w:r>
               <w:rPr>
@@ -3117,7 +3117,7 @@
                 <w:noProof/>
                 <w:webHidden/>
               </w:rPr>
-              <w:t>163</w:t>
+              <w:t>171</w:t>
             </w:r>
             <w:r>
               <w:rPr>
@@ -3190,7 +3190,7 @@
                 <w:noProof/>
                 <w:webHidden/>
               </w:rPr>
-              <w:t>167</w:t>
+              <w:t>175</w:t>
             </w:r>
             <w:r>
               <w:rPr>
@@ -3263,7 +3263,7 @@
                 <w:noProof/>
                 <w:webHidden/>
               </w:rPr>
-              <w:t>171</w:t>
+              <w:t>179</w:t>
             </w:r>
             <w:r>
               <w:rPr>
@@ -3336,7 +3336,7 @@
                 <w:noProof/>
                 <w:webHidden/>
               </w:rPr>
-              <w:t>173</w:t>
+              <w:t>181</w:t>
             </w:r>
             <w:r>
               <w:rPr>
@@ -3398,11 +3398,9 @@
       <w:r>
         <w:t xml:space="preserve"> </w:t>
       </w:r>
-      <w:proofErr w:type="gramStart"/>
       <w:r>
         <w:t>desires</w:t>
       </w:r>
-      <w:proofErr w:type="gramEnd"/>
       <w:r>
         <w:t xml:space="preserve"> a meritocracy. Everything which everybody complains about is as such because anti-merito</w:t>
       </w:r>
@@ -3419,15 +3417,7 @@
         <w:t xml:space="preserve"> in</w:t>
       </w:r>
       <w:r>
-        <w:t xml:space="preserve"> how to define it in practice, as practicable law to govern society, especially </w:t>
-      </w:r>
-      <w:proofErr w:type="gramStart"/>
-      <w:r>
-        <w:t>in the midst of</w:t>
-      </w:r>
-      <w:proofErr w:type="gramEnd"/>
-      <w:r>
-        <w:t xml:space="preserve"> modern pseudosciences and claimed expertise where none actually exists. The greatest threat to meritocracy is false merit in</w:t>
+        <w:t xml:space="preserve"> how to define it in practice, as practicable law to govern society, especially in the midst of modern pseudosciences and claimed expertise where none actually exists. The greatest threat to meritocracy is false merit in</w:t>
       </w:r>
       <w:r>
         <w:t xml:space="preserve"> politically or financially</w:t>
@@ -3442,15 +3432,7 @@
         <w:t xml:space="preserve"> fields of elaboration and social and scientific concern. </w:t>
       </w:r>
       <w:r>
-        <w:t xml:space="preserve">Thermodynamically, merit would be defined as </w:t>
-      </w:r>
-      <w:proofErr w:type="gramStart"/>
-      <w:r>
-        <w:t>negative-entropy</w:t>
-      </w:r>
-      <w:proofErr w:type="gramEnd"/>
-      <w:r>
-        <w:t>, as work which counteracts dispersion and dissolution</w:t>
+        <w:t>Thermodynamically, merit would be defined as negative-entropy, as work which counteracts dispersion and dissolution</w:t>
       </w:r>
       <w:r>
         <w:t xml:space="preserve"> and destruction</w:t>
@@ -3573,15 +3555,7 @@
         <w:t xml:space="preserve">meritocratically serve its people, requires demographic uniformity. </w:t>
       </w:r>
       <w:r>
-        <w:t xml:space="preserve">One of the most defining aspects of European peoples and the civilizations which they create is </w:t>
-      </w:r>
-      <w:proofErr w:type="gramStart"/>
-      <w:r>
-        <w:t>high-trust</w:t>
-      </w:r>
-      <w:proofErr w:type="gramEnd"/>
-      <w:r>
-        <w:t xml:space="preserve">, where reciprocity in deed and action is expected and </w:t>
+        <w:t xml:space="preserve">One of the most defining aspects of European peoples and the civilizations which they create is high-trust, where reciprocity in deed and action is expected and </w:t>
       </w:r>
       <w:r>
         <w:t xml:space="preserve">is </w:t>
@@ -3687,15 +3661,7 @@
     </w:p>
     <w:p>
       <w:r>
-        <w:t xml:space="preserve">The legal implementation of meritocracy is not at all about defining and specifying what is </w:t>
-      </w:r>
-      <w:proofErr w:type="gramStart"/>
-      <w:r>
-        <w:t>meritocratic, but</w:t>
-      </w:r>
-      <w:proofErr w:type="gramEnd"/>
-      <w:r>
-        <w:t xml:space="preserve"> is in allowing the freedom of competence. </w:t>
+        <w:t xml:space="preserve">The legal implementation of meritocracy is not at all about defining and specifying what is meritocratic, but is in allowing the freedom of competence. </w:t>
       </w:r>
       <w:r>
         <w:t>It is the captured institutions, cartels of any stripe, and partisan political groups which are inevitably protecting some racket of grift upon the population</w:t>
@@ -3716,15 +3682,7 @@
         <w:t xml:space="preserve"> as such explanations are provided in the precis of each Article</w:t>
       </w:r>
       <w:r>
-        <w:t xml:space="preserve">, but the one item which is most likely to </w:t>
-      </w:r>
-      <w:proofErr w:type="gramStart"/>
-      <w:r>
-        <w:t>effect</w:t>
-      </w:r>
-      <w:proofErr w:type="gramEnd"/>
-      <w:r>
-        <w:t xml:space="preserve"> the most beneficial results to our </w:t>
+        <w:t xml:space="preserve">, but the one item which is most likely to effect the most beneficial results to our </w:t>
       </w:r>
       <w:r>
         <w:lastRenderedPageBreak/>
@@ -3739,13 +3697,8 @@
       <w:r>
         <w:t xml:space="preserve"> and political intrigue utilizing these and other systems, it is more important than ever that individual voices with truth can be heard by the state and its citizens and that these voices, when lawfully and scientifically determined to be voicing valid alternative truths, to </w:t>
       </w:r>
-      <w:proofErr w:type="gramStart"/>
-      <w:r>
-        <w:t>have an effect on</w:t>
-      </w:r>
-      <w:proofErr w:type="gramEnd"/>
-      <w:r>
-        <w:t xml:space="preserve"> the conduct of affairs of the nation and the people. </w:t>
+      <w:r>
+        <w:t xml:space="preserve">have an effect on the conduct of affairs of the nation and the people. </w:t>
       </w:r>
       <w:r>
         <w:t>In fact, it would likely even be sufficient to implement only that one single Article, and everything else in this Constitution would eventually become state</w:t>
@@ -3759,29 +3712,13 @@
     </w:p>
     <w:p>
       <w:r>
-        <w:t xml:space="preserve">Artificial intelligence was used to assist in writing this document. The procedure was that I would suggest some concerns and request an </w:t>
-      </w:r>
-      <w:proofErr w:type="gramStart"/>
-      <w:r>
-        <w:t>Article</w:t>
-      </w:r>
-      <w:proofErr w:type="gramEnd"/>
-      <w:r>
-        <w:t xml:space="preserve"> to address it or to insert the concern into an existing Article. </w:t>
+        <w:t xml:space="preserve">Artificial intelligence was used to assist in writing this document. The procedure was that I would suggest some concerns and request an Article to address it or to insert the concern into an existing Article. </w:t>
       </w:r>
       <w:r>
         <w:t>The precis of each Article are AI generated summaries.</w:t>
       </w:r>
       <w:r>
-        <w:t xml:space="preserve"> All of the ideas and points addressed were mine, but I used AI to write them out in “</w:t>
-      </w:r>
-      <w:proofErr w:type="gramStart"/>
-      <w:r>
-        <w:t>constitutional-sounding</w:t>
-      </w:r>
-      <w:proofErr w:type="gramEnd"/>
-      <w:r>
-        <w:t>” language.</w:t>
+        <w:t xml:space="preserve"> All of the ideas and points addressed were mine, but I used AI to write them out in “constitutional-sounding” language.</w:t>
       </w:r>
       <w:r>
         <w:t xml:space="preserve"> </w:t>
@@ -4018,18 +3955,10 @@
     <w:p/>
     <w:p>
       <w:r>
-        <w:t xml:space="preserve">History has shown that </w:t>
-      </w:r>
-      <w:proofErr w:type="gramStart"/>
-      <w:r>
-        <w:t>i</w:t>
-      </w:r>
-      <w:r>
-        <w:t>n the course of</w:t>
-      </w:r>
-      <w:proofErr w:type="gramEnd"/>
-      <w:r>
-        <w:t xml:space="preserve"> human events it</w:t>
+        <w:t>History has shown that i</w:t>
+      </w:r>
+      <w:r>
+        <w:t>n the course of human events it</w:t>
       </w:r>
       <w:r>
         <w:t xml:space="preserve"> occasionally</w:t>
@@ -4413,15 +4342,7 @@
         <w:t>T</w:t>
       </w:r>
       <w:r>
-        <w:t xml:space="preserve">hey have plundered billions from the public treasury, rewarded failure with higher office, and shielded the guilty from all </w:t>
-      </w:r>
-      <w:proofErr w:type="gramStart"/>
-      <w:r>
-        <w:t>accountability</w:t>
-      </w:r>
-      <w:proofErr w:type="gramEnd"/>
-      <w:r>
-        <w:t>.</w:t>
+        <w:t>hey have plundered billions from the public treasury, rewarded failure with higher office, and shielded the guilty from all accountability.</w:t>
       </w:r>
     </w:p>
     <w:p>
@@ -4548,15 +4469,7 @@
         <w:tab/>
       </w:r>
       <w:r>
-        <w:t xml:space="preserve">They have forfeited every vestige of legitimacy by scorning the immemorial rights of the European peoples who conquered and settled this land with their blood, while working tirelessly to </w:t>
-      </w:r>
-      <w:proofErr w:type="gramStart"/>
-      <w:r>
-        <w:t>effect</w:t>
-      </w:r>
-      <w:proofErr w:type="gramEnd"/>
-      <w:r>
-        <w:t xml:space="preserve"> the demographic replacement of their descendants.  </w:t>
+        <w:t xml:space="preserve">They have forfeited every vestige of legitimacy by scorning the immemorial rights of the European peoples who conquered and settled this land with their blood, while working tirelessly to effect the demographic replacement of their descendants.  </w:t>
       </w:r>
     </w:p>
     <w:p>
@@ -5265,40 +5178,22 @@
       <w:r>
         <w:t xml:space="preserve"> </w:t>
       </w:r>
-      <w:proofErr w:type="gramStart"/>
-      <w:r>
-        <w:t>Social</w:t>
-      </w:r>
-      <w:proofErr w:type="gramEnd"/>
-      <w:r>
-        <w:t xml:space="preserve"> media and digital platforms shall:</w:t>
+      <w:r>
+        <w:t>Social media and digital platforms shall:</w:t>
       </w:r>
     </w:p>
     <w:p>
       <w:pPr>
         <w:ind w:left="1080" w:hanging="360"/>
       </w:pPr>
-      <w:proofErr w:type="spellStart"/>
-      <w:r>
-        <w:t>i</w:t>
-      </w:r>
-      <w:proofErr w:type="spellEnd"/>
-      <w:r>
-        <w:t>)</w:t>
-      </w:r>
-      <w:r>
-        <w:tab/>
-      </w:r>
-      <w:r>
-        <w:t xml:space="preserve">use algorithmic tuning only to increase exposure to content of interest to the individual </w:t>
-      </w:r>
-      <w:proofErr w:type="gramStart"/>
-      <w:r>
-        <w:t>user;</w:t>
-      </w:r>
-      <w:proofErr w:type="gramEnd"/>
-      <w:r>
-        <w:t xml:space="preserve"> </w:t>
+      <w:r>
+        <w:t>i)</w:t>
+      </w:r>
+      <w:r>
+        <w:tab/>
+      </w:r>
+      <w:r>
+        <w:t xml:space="preserve">use algorithmic tuning only to increase exposure to content of interest to the individual user; </w:t>
       </w:r>
     </w:p>
     <w:p>
@@ -5397,27 +5292,14 @@
       <w:pPr>
         <w:ind w:left="1080" w:hanging="360"/>
       </w:pPr>
-      <w:proofErr w:type="spellStart"/>
-      <w:r>
-        <w:t>i</w:t>
-      </w:r>
-      <w:proofErr w:type="spellEnd"/>
-      <w:r>
-        <w:t>)</w:t>
-      </w:r>
-      <w:r>
-        <w:tab/>
-      </w:r>
-      <w:r>
-        <w:t xml:space="preserve">A non-systemic violation affecting fewer than one thousand citizens that is fully </w:t>
-      </w:r>
-      <w:proofErr w:type="gramStart"/>
-      <w:r>
-        <w:t>rectified</w:t>
-      </w:r>
-      <w:proofErr w:type="gramEnd"/>
-      <w:r>
-        <w:t xml:space="preserve"> and all affected accounts unconditionally restored within 24 hours of formal notice incurs no penalty beyond a mandatory public explanation and algorithmic audit.</w:t>
+      <w:r>
+        <w:t>i)</w:t>
+      </w:r>
+      <w:r>
+        <w:tab/>
+      </w:r>
+      <w:r>
+        <w:t>A non-systemic violation affecting fewer than one thousand citizens that is fully rectified and all affected accounts unconditionally restored within 24 hours of formal notice incurs no penalty beyond a mandatory public explanation and algorithmic audit.</w:t>
       </w:r>
     </w:p>
     <w:p>
@@ -5546,27 +5428,14 @@
       <w:pPr>
         <w:ind w:left="1080" w:hanging="360"/>
       </w:pPr>
-      <w:proofErr w:type="spellStart"/>
-      <w:r>
-        <w:t>i</w:t>
-      </w:r>
-      <w:proofErr w:type="spellEnd"/>
-      <w:r>
-        <w:t>)</w:t>
-      </w:r>
-      <w:r>
-        <w:tab/>
-      </w:r>
-      <w:r>
-        <w:t xml:space="preserve">objective falsity or deliberate material </w:t>
-      </w:r>
-      <w:proofErr w:type="gramStart"/>
-      <w:r>
-        <w:t>omission;</w:t>
-      </w:r>
-      <w:proofErr w:type="gramEnd"/>
-      <w:r>
-        <w:t xml:space="preserve"> </w:t>
+      <w:r>
+        <w:t>i)</w:t>
+      </w:r>
+      <w:r>
+        <w:tab/>
+      </w:r>
+      <w:r>
+        <w:t xml:space="preserve">objective falsity or deliberate material omission; </w:t>
       </w:r>
     </w:p>
     <w:p>
@@ -5580,15 +5449,7 @@
         <w:tab/>
       </w:r>
       <w:r>
-        <w:t xml:space="preserve">actual knowledge or wilful blindness of the responsible </w:t>
-      </w:r>
-      <w:proofErr w:type="gramStart"/>
-      <w:r>
-        <w:t>officers;</w:t>
-      </w:r>
-      <w:proofErr w:type="gramEnd"/>
-      <w:r>
-        <w:t xml:space="preserve"> </w:t>
+        <w:t xml:space="preserve">actual knowledge or wilful blindness of the responsible officers; </w:t>
       </w:r>
     </w:p>
     <w:p>
@@ -5637,13 +5498,8 @@
       <w:pPr>
         <w:ind w:left="1080" w:hanging="360"/>
       </w:pPr>
-      <w:proofErr w:type="spellStart"/>
-      <w:r>
-        <w:t>i</w:t>
-      </w:r>
-      <w:proofErr w:type="spellEnd"/>
-      <w:r>
-        <w:t>)</w:t>
+      <w:r>
+        <w:t>i)</w:t>
       </w:r>
       <w:r>
         <w:tab/>
@@ -6008,15 +5864,7 @@
         <w:t>hundred</w:t>
       </w:r>
       <w:r>
-        <w:t xml:space="preserve"> citizen signatures and </w:t>
-      </w:r>
-      <w:proofErr w:type="gramStart"/>
-      <w:r>
-        <w:t>a prima-facie</w:t>
-      </w:r>
-      <w:proofErr w:type="gramEnd"/>
-      <w:r>
-        <w:t xml:space="preserve"> written argument not exceeding </w:t>
+        <w:t xml:space="preserve"> citizen signatures and a prima-facie written argument not exceeding </w:t>
       </w:r>
       <w:r>
         <w:t>three</w:t>
@@ -6072,25 +5920,15 @@
       <w:pPr>
         <w:ind w:left="1080" w:hanging="360"/>
       </w:pPr>
-      <w:proofErr w:type="spellStart"/>
-      <w:r>
-        <w:t>i</w:t>
-      </w:r>
-      <w:proofErr w:type="spellEnd"/>
-      <w:r>
-        <w:t>)</w:t>
-      </w:r>
-      <w:r>
-        <w:tab/>
-      </w:r>
-      <w:r>
-        <w:t xml:space="preserve">three senior judges chosen by lot, who serve under their normal judicial identity and jointly </w:t>
-      </w:r>
-      <w:proofErr w:type="gramStart"/>
-      <w:r>
-        <w:t>preside;</w:t>
-      </w:r>
-      <w:proofErr w:type="gramEnd"/>
+      <w:r>
+        <w:t>i)</w:t>
+      </w:r>
+      <w:r>
+        <w:tab/>
+      </w:r>
+      <w:r>
+        <w:t>three senior judges chosen by lot, who serve under their normal judicial identity and jointly preside;</w:t>
+      </w:r>
     </w:p>
     <w:p>
       <w:pPr>
@@ -6176,15 +6014,7 @@
     </w:p>
     <w:p>
       <w:r>
-        <w:t xml:space="preserve">Service on a Special Tribunal is a compulsory civic duty for those selected, equivalent to jury duty. Selected experts and lay members shall receive full salary replacement from the state for the duration of the proceedings plus a per-diem </w:t>
-      </w:r>
-      <w:proofErr w:type="spellStart"/>
-      <w:r>
-        <w:t>honourarium</w:t>
-      </w:r>
-      <w:proofErr w:type="spellEnd"/>
-      <w:r>
-        <w:t xml:space="preserve"> equal to twice the national median daily wage. Refusal to serve without grave cause (certified medical incapacity or extreme hardship) is punishable by a fine of one year’s median wage and permanent disqualification from any future public contract, grant, or academic position funded by the Republic.</w:t>
+        <w:t>Service on a Special Tribunal is a compulsory civic duty for those selected, equivalent to jury duty. Selected experts and lay members shall receive full salary replacement from the state for the duration of the proceedings plus a per-diem honourarium equal to twice the national median daily wage. Refusal to serve without grave cause (certified medical incapacity or extreme hardship) is punishable by a fine of one year’s median wage and permanent disqualification from any future public contract, grant, or academic position funded by the Republic.</w:t>
       </w:r>
     </w:p>
     <w:p>
@@ -6206,27 +6036,11 @@
         <w:pStyle w:val="ListParagraph"/>
       </w:pPr>
       <w:r>
-        <w:t xml:space="preserve">The identities of the fourteen non-judicial members shall remain permanently sealed and known only to the Registrar of the Supreme Court. In all proceedings and </w:t>
-      </w:r>
-      <w:proofErr w:type="gramStart"/>
-      <w:r>
-        <w:t>decisions</w:t>
-      </w:r>
-      <w:proofErr w:type="gramEnd"/>
-      <w:r>
-        <w:t xml:space="preserve"> they shall appear solely under randomly assigned numerical identifiers. Any attempt to discover, </w:t>
+        <w:t xml:space="preserve">The identities of the fourteen non-judicial members shall remain permanently sealed and known only to the Registrar of the Supreme Court. In all proceedings and decisions they shall appear solely under randomly assigned numerical identifiers. Any attempt to discover, </w:t>
       </w:r>
       <w:r>
         <w:lastRenderedPageBreak/>
-        <w:t xml:space="preserve">publish, or act upon the sealed identities of </w:t>
-      </w:r>
-      <w:proofErr w:type="spellStart"/>
-      <w:r>
-        <w:t>anonymised</w:t>
-      </w:r>
-      <w:proofErr w:type="spellEnd"/>
-      <w:r>
-        <w:t xml:space="preserve"> members is a felony carrying a mandatory minimum sentence of seven years’ imprisonment.</w:t>
+        <w:t>publish, or act upon the sealed identities of anonymised members is a felony carrying a mandatory minimum sentence of seven years’ imprisonment.</w:t>
       </w:r>
     </w:p>
     <w:p>
@@ -6276,29 +6090,13 @@
         <w:pStyle w:val="ListParagraph"/>
       </w:pPr>
       <w:r>
-        <w:t xml:space="preserve">Proceedings shall be fully adversarial, equally funded, open to the public, and </w:t>
-      </w:r>
-      <w:proofErr w:type="gramStart"/>
-      <w:r>
-        <w:t>live-streamed</w:t>
-      </w:r>
-      <w:proofErr w:type="gramEnd"/>
-      <w:r>
-        <w:t xml:space="preserve"> with</w:t>
+        <w:t>Proceedings shall be fully adversarial, equally funded, open to the public, and live-streamed with</w:t>
       </w:r>
       <w:r>
         <w:t xml:space="preserve"> securely anonymizing</w:t>
       </w:r>
       <w:r>
-        <w:t xml:space="preserve"> voice and image alteration for the fourteen </w:t>
-      </w:r>
-      <w:proofErr w:type="spellStart"/>
-      <w:r>
-        <w:t>anonymised</w:t>
-      </w:r>
-      <w:proofErr w:type="spellEnd"/>
-      <w:r>
-        <w:t xml:space="preserve"> members.</w:t>
+        <w:t xml:space="preserve"> voice and image alteration for the fourteen anonymised members.</w:t>
       </w:r>
     </w:p>
     <w:p>
@@ -6360,27 +6158,14 @@
       <w:pPr>
         <w:ind w:left="1080" w:hanging="360"/>
       </w:pPr>
-      <w:proofErr w:type="spellStart"/>
-      <w:r>
-        <w:t>i</w:t>
-      </w:r>
-      <w:proofErr w:type="spellEnd"/>
-      <w:r>
-        <w:t>)</w:t>
-      </w:r>
-      <w:r>
-        <w:tab/>
-      </w:r>
-      <w:r>
-        <w:t xml:space="preserve">Uphold: the challenged claim is </w:t>
-      </w:r>
-      <w:proofErr w:type="gramStart"/>
-      <w:r>
-        <w:t>reaffirmed;</w:t>
-      </w:r>
-      <w:proofErr w:type="gramEnd"/>
-      <w:r>
-        <w:t xml:space="preserve"> </w:t>
+      <w:r>
+        <w:t>i)</w:t>
+      </w:r>
+      <w:r>
+        <w:tab/>
+      </w:r>
+      <w:r>
+        <w:t xml:space="preserve">Uphold: the challenged claim is reaffirmed; </w:t>
       </w:r>
     </w:p>
     <w:p>
@@ -6414,15 +6199,7 @@
     </w:p>
     <w:p>
       <w:r>
-        <w:t xml:space="preserve">If no single outcome receives the votes of </w:t>
-      </w:r>
-      <w:proofErr w:type="gramStart"/>
-      <w:r>
-        <w:t>the simple majority of</w:t>
-      </w:r>
-      <w:proofErr w:type="gramEnd"/>
-      <w:r>
-        <w:t xml:space="preserve"> members, the decision shall be recorded as Inconclusive.</w:t>
+        <w:t>If no single outcome receives the votes of the simple majority of members, the decision shall be recorded as Inconclusive.</w:t>
       </w:r>
       <w:r>
         <w:t xml:space="preserve"> </w:t>
@@ -6488,14 +6265,9 @@
       <w:pPr>
         <w:ind w:left="1080" w:hanging="360"/>
       </w:pPr>
-      <w:proofErr w:type="spellStart"/>
       <w:r>
         <w:lastRenderedPageBreak/>
-        <w:t>i</w:t>
-      </w:r>
-      <w:proofErr w:type="spellEnd"/>
-      <w:r>
-        <w:t>)</w:t>
+        <w:t>i)</w:t>
       </w:r>
       <w:r>
         <w:tab/>
@@ -6532,7 +6304,10 @@
         <w:ind w:left="360" w:hanging="360"/>
       </w:pPr>
       <w:r>
-        <w:t>3)</w:t>
+        <w:t>3</w:t>
+      </w:r>
+      <w:r>
+        <w:t>.</w:t>
       </w:r>
       <w:r>
         <w:tab/>
@@ -6604,10 +6379,8 @@
         <w:t>The Repository shall operate under the oversight of the Supreme Court and shall be funded as a non-discretionary line item in the national budget.</w:t>
       </w:r>
     </w:p>
-    <w:p/>
-    <w:p>
-      <w:r>
-        <w:lastRenderedPageBreak/>
+    <w:p>
+      <w:r>
         <w:br w:type="page"/>
       </w:r>
     </w:p>
@@ -7056,15 +6829,7 @@
         <w:t>A</w:t>
       </w:r>
       <w:r>
-        <w:t xml:space="preserve">ny citizen proven in a court of law to have negligently caused death or serious injury </w:t>
-      </w:r>
-      <w:proofErr w:type="gramStart"/>
-      <w:r>
-        <w:t>through the use of</w:t>
-      </w:r>
-      <w:proofErr w:type="gramEnd"/>
-      <w:r>
-        <w:t xml:space="preserve"> a firearm, outside the reasonable bounds of lawful self-defence, shall be liable to severe penalty, including imprisonment for a term of not less than ten years, forfeiture </w:t>
+        <w:t xml:space="preserve">ny citizen proven in a court of law to have negligently caused death or serious injury through the use of a firearm, outside the reasonable bounds of lawful self-defence, shall be liable to severe penalty, including imprisonment for a term of not less than ten years, forfeiture </w:t>
       </w:r>
       <w:r>
         <w:lastRenderedPageBreak/>
@@ -7110,15 +6875,7 @@
         <w:tab/>
       </w:r>
       <w:r>
-        <w:t xml:space="preserve">In any prosecution under this Article, if the citizen is acquitted, the charges are dismissed on the merits, or </w:t>
-      </w:r>
-      <w:proofErr w:type="gramStart"/>
-      <w:r>
-        <w:t>no-billed</w:t>
-      </w:r>
-      <w:proofErr w:type="gramEnd"/>
-      <w:r>
-        <w:t xml:space="preserve"> by a grand jury (where applicable), the citizen shall be entitled to full recovery from the State of all legal costs, reasonable attorney fees, and compensation for lost wages or other demonstrable hardship.</w:t>
+        <w:t>In any prosecution under this Article, if the citizen is acquitted, the charges are dismissed on the merits, or no-billed by a grand jury (where applicable), the citizen shall be entitled to full recovery from the State of all legal costs, reasonable attorney fees, and compensation for lost wages or other demonstrable hardship.</w:t>
       </w:r>
     </w:p>
     <w:p/>
@@ -7176,15 +6933,7 @@
         <w:t>H</w:t>
       </w:r>
       <w:r>
-        <w:t xml:space="preserve">istory warns that disarmament paths lead inexorably to oppression, as seen in regimes that equated armed citizens to threats. No authority can be safely empowered to strip this right, for it would invite endless encroachments where </w:t>
-      </w:r>
-      <w:proofErr w:type="spellStart"/>
-      <w:r>
-        <w:t>self-defense</w:t>
-      </w:r>
-      <w:proofErr w:type="spellEnd"/>
-      <w:r>
-        <w:t xml:space="preserve"> is reframed as vigilantism; thus, the right to bear arms must remain sacrosanct, rooted in faith that a competent populace will uphold order through vigilant merit, just as with speech and inquiry. Furthermore, the Article offers robust protections for defenders, presuming reasonableness in force and placing the onus on the state to disprove it beyond doubt, shielding individuals from ruinous prosecutions for good-faith actions while limiting non-citizens</w:t>
+        <w:t>istory warns that disarmament paths lead inexorably to oppression, as seen in regimes that equated armed citizens to threats. No authority can be safely empowered to strip this right, for it would invite endless encroachments where self-defense is reframed as vigilantism; thus, the right to bear arms must remain sacrosanct, rooted in faith that a competent populace will uphold order through vigilant merit, just as with speech and inquiry. Furthermore, the Article offers robust protections for defenders, presuming reasonableness in force and placing the onus on the state to disprove it beyond doubt, shielding individuals from ruinous prosecutions for good-faith actions while limiting non-citizens</w:t>
       </w:r>
       <w:r>
         <w:t>’</w:t>
@@ -7723,15 +7472,7 @@
         <w:t>fourteen</w:t>
       </w:r>
       <w:r>
-        <w:t xml:space="preserve"> years </w:t>
-      </w:r>
-      <w:proofErr w:type="gramStart"/>
-      <w:r>
-        <w:t>old</w:t>
-      </w:r>
-      <w:proofErr w:type="gramEnd"/>
-      <w:r>
-        <w:t xml:space="preserve"> and the age difference is no more than </w:t>
+        <w:t xml:space="preserve"> years old and the age difference is no more than </w:t>
       </w:r>
       <w:r>
         <w:t>f</w:t>
@@ -7766,15 +7507,7 @@
         <w:tab/>
       </w:r>
       <w:r>
-        <w:t>The non-</w:t>
-      </w:r>
-      <w:proofErr w:type="gramStart"/>
-      <w:r>
-        <w:t>medically-necessary</w:t>
-      </w:r>
-      <w:proofErr w:type="gramEnd"/>
-      <w:r>
-        <w:t xml:space="preserve"> genital mutilation of minors (male or female) is prohibited without exception. Religious, cultural, or customary practices do not qualify as medical necessity under any circumstances. Claims of hygienic, preventive, or prophylactic benefit are excluded from medical necessity.</w:t>
+        <w:t>The non-medically-necessary genital mutilation of minors (male or female) is prohibited without exception. Religious, cultural, or customary practices do not qualify as medical necessity under any circumstances. Claims of hygienic, preventive, or prophylactic benefit are excluded from medical necessity.</w:t>
       </w:r>
     </w:p>
     <w:p>
@@ -8039,15 +7772,7 @@
     </w:p>
     <w:p>
       <w:r>
-        <w:t>The comprehensive bans on non-</w:t>
-      </w:r>
-      <w:proofErr w:type="gramStart"/>
-      <w:r>
-        <w:t>medically-necessary</w:t>
-      </w:r>
-      <w:proofErr w:type="gramEnd"/>
-      <w:r>
-        <w:t xml:space="preserve"> genital mutilation, exposure to pornography equated to child abuse, and genetic engineering of embryos or humans</w:t>
+        <w:t>The comprehensive bans on non-medically-necessary genital mutilation, exposure to pornography equated to child abuse, and genetic engineering of embryos or humans</w:t>
       </w:r>
       <w:r>
         <w:t>,</w:t>
@@ -8083,15 +7808,7 @@
         <w:t>H</w:t>
       </w:r>
       <w:r>
-        <w:t xml:space="preserve">istory warns that paths of permissive experimentation </w:t>
-      </w:r>
-      <w:proofErr w:type="gramStart"/>
-      <w:r>
-        <w:t>lead</w:t>
-      </w:r>
-      <w:proofErr w:type="gramEnd"/>
-      <w:r>
-        <w:t xml:space="preserve"> to endless violations, as seen in regimes that reframed mutilation as affirmation. No authority can be safely empowered to alter these fundamentals, for it invites encroachments where innocence is politicized as oppression; thus, protections for children must remain absolute, rooted in the conviction that natural integrity is good, just as with speech and inquiry, or else civilization loses its</w:t>
+        <w:t>istory warns that paths of permissive experimentation lead to endless violations, as seen in regimes that reframed mutilation as affirmation. No authority can be safely empowered to alter these fundamentals, for it invites encroachments where innocence is politicized as oppression; thus, protections for children must remain absolute, rooted in the conviction that natural integrity is good, just as with speech and inquiry, or else civilization loses its</w:t>
       </w:r>
       <w:r>
         <w:t xml:space="preserve"> biological</w:t>
@@ -8103,15 +7820,7 @@
         <w:t>foundation and purpose</w:t>
       </w:r>
       <w:r>
-        <w:t xml:space="preserve">. Furthermore, the Article provides stringent safeguards against perpetrators, imposing mandatory sentences without parole, paving the way for a meritocratic future </w:t>
-      </w:r>
-      <w:proofErr w:type="gramStart"/>
-      <w:r>
-        <w:t>where</w:t>
-      </w:r>
-      <w:proofErr w:type="gramEnd"/>
-      <w:r>
-        <w:t xml:space="preserve"> posterity flourishes untainted, preserving the European character of the nation against erosive forces.</w:t>
+        <w:t>. Furthermore, the Article provides stringent safeguards against perpetrators, imposing mandatory sentences without parole, paving the way for a meritocratic future where posterity flourishes untainted, preserving the European character of the nation against erosive forces.</w:t>
       </w:r>
     </w:p>
     <w:p/>
@@ -8426,15 +8135,7 @@
         <w:t>life becomes valueless</w:t>
       </w:r>
       <w:r>
-        <w:t xml:space="preserve">. Furthermore, the Article establishes stringent safeguards against violators by imposing murder charges for unauthorized terminations, while ensuring that good-faith medical judgments in permitted cases are not penalized and providing anonymous surrender options; this structure encourages ethical parenting without fear of unwarranted repercussions, paving the way for a meritocratic future where families </w:t>
-      </w:r>
-      <w:proofErr w:type="gramStart"/>
-      <w:r>
-        <w:t>prosper</w:t>
-      </w:r>
-      <w:proofErr w:type="gramEnd"/>
-      <w:r>
-        <w:t xml:space="preserve"> and the European character of the nation is preserved against depopulating forces.</w:t>
+        <w:t>. Furthermore, the Article establishes stringent safeguards against violators by imposing murder charges for unauthorized terminations, while ensuring that good-faith medical judgments in permitted cases are not penalized and providing anonymous surrender options; this structure encourages ethical parenting without fear of unwarranted repercussions, paving the way for a meritocratic future where families prosper and the European character of the nation is preserved against depopulating forces.</w:t>
       </w:r>
     </w:p>
     <w:p/>
@@ -8720,23 +8421,7 @@
         <w:tab/>
       </w:r>
       <w:r>
-        <w:t xml:space="preserve">Any form of preferential treatment, quota, set-aside, affirmative action, “diversity target”, “equity adjustment”, or discrimination (positive or negative) </w:t>
-      </w:r>
-      <w:proofErr w:type="gramStart"/>
-      <w:r>
-        <w:t>on the basis of</w:t>
-      </w:r>
-      <w:proofErr w:type="gramEnd"/>
-      <w:r>
-        <w:t xml:space="preserve"> race, ethnicity, sex, sexual orientation, religion, or any identity category whatsoever is permanently prohibited. “Diversity, Equity, and Inclusion” programmes and offices in any public or </w:t>
-      </w:r>
-      <w:proofErr w:type="gramStart"/>
-      <w:r>
-        <w:t>publicly-regulated</w:t>
-      </w:r>
-      <w:proofErr w:type="gramEnd"/>
-      <w:r>
-        <w:t xml:space="preserve"> institution are abolished forthwith and may never be re-established under any name.</w:t>
+        <w:t>Any form of preferential treatment, quota, set-aside, affirmative action, “diversity target”, “equity adjustment”, or discrimination (positive or negative) on the basis of race, ethnicity, sex, sexual orientation, religion, or any identity category whatsoever is permanently prohibited. “Diversity, Equity, and Inclusion” programmes and offices in any public or publicly-regulated institution are abolished forthwith and may never be re-established under any name.</w:t>
       </w:r>
     </w:p>
     <w:p>
@@ -8851,13 +8536,8 @@
         <w:tab/>
       </w:r>
       <w:r>
-        <w:t xml:space="preserve">permanent disqualification from all public office and public </w:t>
-      </w:r>
-      <w:proofErr w:type="gramStart"/>
-      <w:r>
-        <w:t>contract;</w:t>
-      </w:r>
-      <w:proofErr w:type="gramEnd"/>
+        <w:t>permanent disqualification from all public office and public contract;</w:t>
+      </w:r>
     </w:p>
     <w:p>
       <w:pPr>
@@ -8870,13 +8550,8 @@
         <w:tab/>
       </w:r>
       <w:r>
-        <w:t xml:space="preserve">imprisonment for not less than fifteen years and up to </w:t>
-      </w:r>
-      <w:proofErr w:type="gramStart"/>
-      <w:r>
-        <w:t>life;</w:t>
-      </w:r>
-      <w:proofErr w:type="gramEnd"/>
+        <w:t>imprisonment for not less than fifteen years and up to life;</w:t>
+      </w:r>
     </w:p>
     <w:p>
       <w:pPr>
@@ -8906,13 +8581,8 @@
       <w:r>
         <w:t xml:space="preserve">forfeiture of all personal assets </w:t>
       </w:r>
-      <w:proofErr w:type="gramStart"/>
-      <w:r>
-        <w:t>exceeding</w:t>
-      </w:r>
-      <w:proofErr w:type="gramEnd"/>
-      <w:r>
-        <w:t xml:space="preserve"> twice the offender’s lawfully declared net worth on the date of taking office or appointment, until the restitution is satisfied.</w:t>
+      <w:r>
+        <w:t>exceeding twice the offender’s lawfully declared net worth on the date of taking office or appointment, until the restitution is satisfied.</w:t>
       </w:r>
     </w:p>
     <w:p>
@@ -9245,15 +8915,7 @@
         <w:tab/>
       </w:r>
       <w:r>
-        <w:t xml:space="preserve">Civil birth, baptismal, marriage, and death records from any recognised European jurisdiction or ecclesiastical </w:t>
-      </w:r>
-      <w:proofErr w:type="gramStart"/>
-      <w:r>
-        <w:t>authority;</w:t>
-      </w:r>
-      <w:proofErr w:type="gramEnd"/>
-      <w:r>
-        <w:t xml:space="preserve">  </w:t>
+        <w:t xml:space="preserve">Civil birth, baptismal, marriage, and death records from any recognised European jurisdiction or ecclesiastical authority;  </w:t>
       </w:r>
     </w:p>
     <w:p>
@@ -9267,15 +8929,7 @@
         <w:tab/>
       </w:r>
       <w:r>
-        <w:t xml:space="preserve">Statutory declarations from two citizens of full standing attesting to personal knowledge of the applicant’s unbroken European </w:t>
-      </w:r>
-      <w:proofErr w:type="gramStart"/>
-      <w:r>
-        <w:t>lineage;</w:t>
-      </w:r>
-      <w:proofErr w:type="gramEnd"/>
-      <w:r>
-        <w:t xml:space="preserve">  </w:t>
+        <w:t xml:space="preserve">Statutory declarations from two citizens of full standing attesting to personal knowledge of the applicant’s unbroken European lineage;  </w:t>
       </w:r>
     </w:p>
     <w:p>
@@ -9351,13 +9005,8 @@
         <w:tab/>
       </w:r>
       <w:r>
-        <w:t xml:space="preserve">Minimum five years of continuous lawful </w:t>
-      </w:r>
-      <w:proofErr w:type="gramStart"/>
-      <w:r>
-        <w:t>residence;</w:t>
-      </w:r>
-      <w:proofErr w:type="gramEnd"/>
+        <w:t>Minimum five years of continuous lawful residence;</w:t>
+      </w:r>
     </w:p>
     <w:p>
       <w:pPr>
@@ -9370,15 +9019,7 @@
         <w:tab/>
       </w:r>
       <w:r>
-        <w:t xml:space="preserve">Demonstrated mastery of English or </w:t>
-      </w:r>
-      <w:proofErr w:type="gramStart"/>
-      <w:r>
-        <w:t>French;</w:t>
-      </w:r>
-      <w:proofErr w:type="gramEnd"/>
-      <w:r>
-        <w:t xml:space="preserve"> </w:t>
+        <w:t xml:space="preserve">Demonstrated mastery of English or French; </w:t>
       </w:r>
     </w:p>
     <w:p>
@@ -9398,13 +9039,8 @@
       <w:r>
         <w:t xml:space="preserve">section </w:t>
       </w:r>
-      <w:proofErr w:type="gramStart"/>
-      <w:r>
-        <w:t>3;</w:t>
-      </w:r>
-      <w:proofErr w:type="gramEnd"/>
-      <w:r>
-        <w:t xml:space="preserve">  </w:t>
+      <w:r>
+        <w:t xml:space="preserve">3;  </w:t>
       </w:r>
     </w:p>
     <w:p>
@@ -9417,13 +9053,8 @@
       <w:r>
         <w:tab/>
       </w:r>
-      <w:proofErr w:type="gramStart"/>
-      <w:r>
-        <w:t>Good</w:t>
-      </w:r>
-      <w:proofErr w:type="gramEnd"/>
-      <w:r>
-        <w:t xml:space="preserve"> character and demonstrated contribution to the Republic;</w:t>
+      <w:r>
+        <w:t>Good character and demonstrated contribution to the Republic;</w:t>
       </w:r>
     </w:p>
     <w:p>
@@ -9436,13 +9067,8 @@
       <w:r>
         <w:tab/>
       </w:r>
-      <w:proofErr w:type="gramStart"/>
-      <w:r>
-        <w:t>Public</w:t>
-      </w:r>
-      <w:proofErr w:type="gramEnd"/>
-      <w:r>
-        <w:t xml:space="preserve"> renunciation of any previous citizenship and pledge of allegiance</w:t>
+      <w:r>
+        <w:t>Public renunciation of any previous citizenship and pledge of allegiance</w:t>
       </w:r>
       <w:r>
         <w:t xml:space="preserve"> to the Republic</w:t>
@@ -9724,25 +9350,15 @@
       <w:pPr>
         <w:ind w:left="1080" w:hanging="360"/>
       </w:pPr>
-      <w:proofErr w:type="spellStart"/>
-      <w:r>
-        <w:t>i</w:t>
-      </w:r>
-      <w:proofErr w:type="spellEnd"/>
-      <w:r>
-        <w:t>)</w:t>
-      </w:r>
-      <w:r>
-        <w:tab/>
-      </w:r>
-      <w:r>
-        <w:t xml:space="preserve">an encrypted digital master ledger with real-time replication across multiple sovereign data </w:t>
-      </w:r>
-      <w:proofErr w:type="gramStart"/>
-      <w:r>
-        <w:t>centres;</w:t>
-      </w:r>
-      <w:proofErr w:type="gramEnd"/>
+      <w:r>
+        <w:t>i)</w:t>
+      </w:r>
+      <w:r>
+        <w:tab/>
+      </w:r>
+      <w:r>
+        <w:t>an encrypted digital master ledger with real-time replication across multiple sovereign data centres;</w:t>
+      </w:r>
     </w:p>
     <w:p>
       <w:pPr>
@@ -9761,13 +9377,8 @@
         <w:t xml:space="preserve"> and</w:t>
       </w:r>
       <w:r>
-        <w:t xml:space="preserve"> flood-proof vaults in at least three </w:t>
-      </w:r>
-      <w:proofErr w:type="gramStart"/>
-      <w:r>
-        <w:t>provinces;</w:t>
-      </w:r>
-      <w:proofErr w:type="gramEnd"/>
+        <w:t xml:space="preserve"> flood-proof vaults in at least three provinces;</w:t>
+      </w:r>
       <w:r>
         <w:t xml:space="preserve"> </w:t>
       </w:r>
@@ -9783,13 +9394,8 @@
         <w:tab/>
       </w:r>
       <w:r>
-        <w:t xml:space="preserve">micro-etched or equivalently permanent physical media capable of surviving at least one thousand years without powered maintenance (e.g., optically inscribed sapphire or nickel plates) stored in deep underground </w:t>
-      </w:r>
-      <w:proofErr w:type="gramStart"/>
-      <w:r>
-        <w:t>facilities;</w:t>
-      </w:r>
-      <w:proofErr w:type="gramEnd"/>
+        <w:t>micro-etched or equivalently permanent physical media capable of surviving at least one thousand years without powered maintenance (e.g., optically inscribed sapphire or nickel plates) stored in deep underground facilities;</w:t>
+      </w:r>
     </w:p>
     <w:p>
       <w:pPr>
@@ -9815,27 +9421,14 @@
       <w:r>
         <w:t xml:space="preserve"> inaccessible, the most recent verified paper or physical-media copy shall immediately become the sole legal master. </w:t>
       </w:r>
-      <w:proofErr w:type="gramStart"/>
-      <w:r>
-        <w:t>In the event that</w:t>
-      </w:r>
-      <w:proofErr w:type="gramEnd"/>
-      <w:r>
-        <w:t xml:space="preserve"> no copies become accessible or available, selection shall be performed by blind randomized selection from the public.</w:t>
+      <w:r>
+        <w:t>In the event that no copies become accessible or available, selection shall be performed by blind randomized selection from the public.</w:t>
       </w:r>
       <w:r>
         <w:t xml:space="preserve"> </w:t>
       </w:r>
       <w:r>
-        <w:t xml:space="preserve">The Supreme Court shall maintain permanent standing procedures and trained custodial personnel to </w:t>
-      </w:r>
-      <w:proofErr w:type="gramStart"/>
-      <w:r>
-        <w:t>effect</w:t>
-      </w:r>
-      <w:proofErr w:type="gramEnd"/>
-      <w:r>
-        <w:t xml:space="preserve"> th</w:t>
+        <w:t>The Supreme Court shall maintain permanent standing procedures and trained custodial personnel to effect th</w:t>
       </w:r>
       <w:r>
         <w:t>ese</w:t>
@@ -9875,15 +9468,7 @@
         <w:pStyle w:val="ListParagraph"/>
       </w:pPr>
       <w:r>
-        <w:t xml:space="preserve">No entry in the Registry may be altered, deleted, or redacted but for clerical correction of manifest error certified by unanimous order of three senior justices. Automatic expungement occurs only upon proof of the individual’s death or formal renunciation of citizenship, and the historical record of the entry shall remain archived in </w:t>
-      </w:r>
-      <w:proofErr w:type="spellStart"/>
-      <w:r>
-        <w:t>anonymised</w:t>
-      </w:r>
-      <w:proofErr w:type="spellEnd"/>
-      <w:r>
-        <w:t xml:space="preserve"> form for statistical and audit purposes.</w:t>
+        <w:t>No entry in the Registry may be altered, deleted, or redacted but for clerical correction of manifest error certified by unanimous order of three senior justices. Automatic expungement occurs only upon proof of the individual’s death or formal renunciation of citizenship, and the historical record of the entry shall remain archived in anonymised form for statistical and audit purposes.</w:t>
       </w:r>
       <w:r>
         <w:t xml:space="preserve"> </w:t>
@@ -10110,11 +9695,9 @@
       <w:r>
         <w:t xml:space="preserve">Registration shall include submission of the parents’ citizenship identification </w:t>
       </w:r>
-      <w:proofErr w:type="gramStart"/>
       <w:r>
         <w:t>strings</w:t>
       </w:r>
-      <w:proofErr w:type="gramEnd"/>
       <w:r>
         <w:t xml:space="preserve"> and any additional proof required under section 3 to confirm the child</w:t>
       </w:r>
@@ -10159,13 +9742,8 @@
       <w:pPr>
         <w:ind w:left="720" w:hanging="360"/>
       </w:pPr>
-      <w:proofErr w:type="spellStart"/>
-      <w:r>
-        <w:t>i</w:t>
-      </w:r>
-      <w:proofErr w:type="spellEnd"/>
-      <w:r>
-        <w:t>)</w:t>
+      <w:r>
+        <w:t>i)</w:t>
       </w:r>
       <w:r>
         <w:tab/>
@@ -10198,13 +9776,8 @@
       <w:pPr>
         <w:ind w:left="1080" w:hanging="360"/>
       </w:pPr>
-      <w:proofErr w:type="spellStart"/>
-      <w:r>
-        <w:t>i</w:t>
-      </w:r>
-      <w:proofErr w:type="spellEnd"/>
-      <w:r>
-        <w:t>)</w:t>
+      <w:r>
+        <w:t>i)</w:t>
       </w:r>
       <w:r>
         <w:tab/>
@@ -10228,13 +9801,8 @@
         <w:t>, as 24-hour format</w:t>
       </w:r>
       <w:r>
-        <w:t xml:space="preserve"> HH:</w:t>
-      </w:r>
-      <w:proofErr w:type="gramStart"/>
-      <w:r>
-        <w:t>MM:SS</w:t>
-      </w:r>
-      <w:proofErr w:type="gramEnd"/>
+        <w:t xml:space="preserve"> HH:MM:SS</w:t>
+      </w:r>
       <w:r>
         <w:t>, local time</w:t>
       </w:r>
@@ -10374,15 +9942,7 @@
         <w:t xml:space="preserve"> of death, entered only upon verified posthumous notification</w:t>
       </w:r>
       <w:r>
-        <w:t xml:space="preserve">, in the same format as subclauses </w:t>
-      </w:r>
-      <w:proofErr w:type="spellStart"/>
-      <w:r>
-        <w:t>i</w:t>
-      </w:r>
-      <w:proofErr w:type="spellEnd"/>
-      <w:r>
-        <w:t>)</w:t>
+        <w:t>, in the same format as subclauses i)</w:t>
       </w:r>
       <w:r>
         <w:t>,</w:t>
@@ -10485,27 +10045,14 @@
       <w:pPr>
         <w:ind w:left="720" w:hanging="360"/>
       </w:pPr>
-      <w:proofErr w:type="spellStart"/>
-      <w:r>
-        <w:t>i</w:t>
-      </w:r>
-      <w:proofErr w:type="spellEnd"/>
-      <w:r>
-        <w:t>)</w:t>
-      </w:r>
-      <w:r>
-        <w:tab/>
-      </w:r>
-      <w:r>
-        <w:t xml:space="preserve">inserts, deletes, alters, or falsifies any entry in the National Registry of Citizens or the National Registry of Qualified Experts except for manifest clerical correction certified by unanimous order of three senior </w:t>
-      </w:r>
-      <w:proofErr w:type="gramStart"/>
-      <w:r>
-        <w:t>justices;</w:t>
-      </w:r>
-      <w:proofErr w:type="gramEnd"/>
-      <w:r>
-        <w:t xml:space="preserve"> </w:t>
+      <w:r>
+        <w:t>i)</w:t>
+      </w:r>
+      <w:r>
+        <w:tab/>
+      </w:r>
+      <w:r>
+        <w:t xml:space="preserve">inserts, deletes, alters, or falsifies any entry in the National Registry of Citizens or the National Registry of Qualified Experts except for manifest clerical correction certified by unanimous order of three senior justices; </w:t>
       </w:r>
     </w:p>
     <w:p>
@@ -10519,15 +10066,7 @@
         <w:tab/>
       </w:r>
       <w:r>
-        <w:t xml:space="preserve">omits or delays the registration of any legitimately conferred degree or </w:t>
-      </w:r>
-      <w:proofErr w:type="gramStart"/>
-      <w:r>
-        <w:t>citizenship;</w:t>
-      </w:r>
-      <w:proofErr w:type="gramEnd"/>
-      <w:r>
-        <w:t xml:space="preserve"> </w:t>
+        <w:t xml:space="preserve">omits or delays the registration of any legitimately conferred degree or citizenship; </w:t>
       </w:r>
     </w:p>
     <w:p>
@@ -10550,15 +10089,7 @@
         <w:t>analog</w:t>
       </w:r>
       <w:r>
-        <w:t xml:space="preserve"> backups of either </w:t>
-      </w:r>
-      <w:proofErr w:type="gramStart"/>
-      <w:r>
-        <w:t>registry;</w:t>
-      </w:r>
-      <w:proofErr w:type="gramEnd"/>
-      <w:r>
-        <w:t xml:space="preserve"> </w:t>
+        <w:t xml:space="preserve"> backups of either registry; </w:t>
       </w:r>
     </w:p>
     <w:p>
@@ -10786,13 +10317,8 @@
       <w:pPr>
         <w:ind w:left="1080" w:hanging="360"/>
       </w:pPr>
-      <w:proofErr w:type="spellStart"/>
-      <w:r>
-        <w:t>i</w:t>
-      </w:r>
-      <w:proofErr w:type="spellEnd"/>
-      <w:r>
-        <w:t>)</w:t>
+      <w:r>
+        <w:t>i)</w:t>
       </w:r>
       <w:r>
         <w:tab/>
@@ -10806,27 +10332,14 @@
         <w:ind w:left="1440" w:hanging="360"/>
       </w:pPr>
       <w:r>
-        <w:t>(</w:t>
-      </w:r>
-      <w:proofErr w:type="spellStart"/>
-      <w:r>
-        <w:t>i</w:t>
-      </w:r>
-      <w:proofErr w:type="spellEnd"/>
-      <w:r>
-        <w:t>)</w:t>
-      </w:r>
-      <w:r>
-        <w:tab/>
-      </w:r>
-      <w:r>
-        <w:t xml:space="preserve">All holders of temporary visas, work permits, study permits, visitor status, and undocumented </w:t>
-      </w:r>
-      <w:proofErr w:type="gramStart"/>
-      <w:r>
-        <w:t>entrants;</w:t>
-      </w:r>
-      <w:proofErr w:type="gramEnd"/>
+        <w:t>(i)</w:t>
+      </w:r>
+      <w:r>
+        <w:tab/>
+      </w:r>
+      <w:r>
+        <w:t>All holders of temporary visas, work permits, study permits, visitor status, and undocumented entrants;</w:t>
+      </w:r>
     </w:p>
     <w:p>
       <w:pPr>
@@ -10839,13 +10352,8 @@
         <w:tab/>
       </w:r>
       <w:r>
-        <w:t xml:space="preserve">Permanent residents granted status most recently, proceeding chronologically backward by date of </w:t>
-      </w:r>
-      <w:proofErr w:type="gramStart"/>
-      <w:r>
-        <w:t>landing;</w:t>
-      </w:r>
-      <w:proofErr w:type="gramEnd"/>
+        <w:t>Permanent residents granted status most recently, proceeding chronologically backward by date of landing;</w:t>
+      </w:r>
     </w:p>
     <w:p>
       <w:pPr>
@@ -10901,15 +10409,7 @@
         <w:tab/>
       </w:r>
       <w:r>
-        <w:t xml:space="preserve">Non-qualifying residents may apply for limited hardship exceptions through a special judicial panel, but no exception shall be granted on grounds of economic contribution, length of residence alone, or family ties formed </w:t>
-      </w:r>
-      <w:proofErr w:type="gramStart"/>
-      <w:r>
-        <w:t>subsequent to</w:t>
-      </w:r>
-      <w:proofErr w:type="gramEnd"/>
-      <w:r>
-        <w:t xml:space="preserve"> arrival unless all dependents independently qualify under Article 9 descent requirements. Exceptions shall expire after five years and are non-renewable.</w:t>
+        <w:t>Non-qualifying residents may apply for limited hardship exceptions through a special judicial panel, but no exception shall be granted on grounds of economic contribution, length of residence alone, or family ties formed subsequent to arrival unless all dependents independently qualify under Article 9 descent requirements. Exceptions shall expire after five years and are non-renewable.</w:t>
       </w:r>
     </w:p>
     <w:p>
@@ -11391,13 +10891,8 @@
       <w:pPr>
         <w:ind w:left="1080" w:hanging="360"/>
       </w:pPr>
-      <w:proofErr w:type="spellStart"/>
-      <w:r>
-        <w:t>i</w:t>
-      </w:r>
-      <w:proofErr w:type="spellEnd"/>
-      <w:r>
-        <w:t>)</w:t>
+      <w:r>
+        <w:t>i)</w:t>
       </w:r>
       <w:r>
         <w:tab/>
@@ -11431,15 +10926,7 @@
         <w:t>4</w:t>
       </w:r>
       <w:r>
-        <w:t xml:space="preserve"> has completed its report or until the Supreme Court, by unanimous vote of nine senior justices sitting </w:t>
-      </w:r>
-      <w:proofErr w:type="spellStart"/>
-      <w:r>
-        <w:t>en</w:t>
-      </w:r>
-      <w:proofErr w:type="spellEnd"/>
-      <w:r>
-        <w:t xml:space="preserve"> banc, certifies that no tampering or sabotage has occurred. The three-judge stay panel has no jurisdiction.</w:t>
+        <w:t xml:space="preserve"> has completed its report or until the Supreme Court, by unanimous vote of nine senior justices sitting en banc, certifies that no tampering or sabotage has occurred. The three-judge stay panel has no jurisdiction.</w:t>
       </w:r>
     </w:p>
     <w:p>
@@ -11487,15 +10974,7 @@
     </w:p>
     <w:p>
       <w:r>
-        <w:t xml:space="preserve">Article 11 establishes an ironclad barrier against the abuse of emergency powers, rendering their </w:t>
-      </w:r>
-      <w:proofErr w:type="spellStart"/>
-      <w:r>
-        <w:t>weaponisation</w:t>
-      </w:r>
-      <w:proofErr w:type="spellEnd"/>
-      <w:r>
-        <w:t xml:space="preserve"> for ideological or tyrannical ends constitutionally impossible. No emergency may ever suspend or limit any provision of the Constitution or Charter. Temporary operational orders are confined to foreign invasion, declared war, or imminent catastrophes manifestly threatening physical survival, and are restricted solely to defence coordination, evacuation, or life-saving measures within the immediate zone of danger. Explicitly prohibited are the most common vectors of modern tyranny: firearm confiscation, asset freezing, speech or assembly restrictions, habeas corpus suspension, and medical mandates.</w:t>
+        <w:t>Article 11 establishes an ironclad barrier against the abuse of emergency powers, rendering their weaponisation for ideological or tyrannical ends constitutionally impossible. No emergency may ever suspend or limit any provision of the Constitution or Charter. Temporary operational orders are confined to foreign invasion, declared war, or imminent catastrophes manifestly threatening physical survival, and are restricted solely to defence coordination, evacuation, or life-saving measures within the immediate zone of danger. Explicitly prohibited are the most common vectors of modern tyranny: firearm confiscation, asset freezing, speech or assembly restrictions, habeas corpus suspension, and medical mandates.</w:t>
       </w:r>
     </w:p>
     <w:p>
@@ -11538,15 +11017,7 @@
       </w:r>
       <w:r>
         <w:lastRenderedPageBreak/>
-        <w:t xml:space="preserve">governance demands that power remain transparent, temporally bounded, and accountable, ensuring excellence prevails over panic and that posterity inherits a nation where freedom is never negotiable, even amid </w:t>
-      </w:r>
-      <w:proofErr w:type="gramStart"/>
-      <w:r>
-        <w:t>catastrophe</w:t>
-      </w:r>
-      <w:proofErr w:type="gramEnd"/>
-      <w:r>
-        <w:t>.</w:t>
+        <w:t>governance demands that power remain transparent, temporally bounded, and accountable, ensuring excellence prevails over panic and that posterity inherits a nation where freedom is never negotiable, even amid catastrophe.</w:t>
       </w:r>
     </w:p>
     <w:p>
@@ -11611,15 +11082,7 @@
         <w:tab/>
       </w:r>
       <w:r>
-        <w:t xml:space="preserve">Every holder of public office or judicial appointment is a temporary servant of the people, subject </w:t>
-      </w:r>
-      <w:proofErr w:type="gramStart"/>
-      <w:r>
-        <w:t>at all times</w:t>
-      </w:r>
-      <w:proofErr w:type="gramEnd"/>
-      <w:r>
-        <w:t xml:space="preserve"> to immediate recall by petition of ten percent of the electors in the relevant jurisdiction.</w:t>
+        <w:t>Every holder of public office or judicial appointment is a temporary servant of the people, subject at all times to immediate recall by petition of ten percent of the electors in the relevant jurisdiction.</w:t>
       </w:r>
       <w:r>
         <w:t xml:space="preserve"> Their purpose is to facilitate the wishes of the people subject to the constraints of this Constitution. They are not </w:t>
@@ -11899,15 +11362,7 @@
         <w:tab/>
       </w:r>
       <w:r>
-        <w:t xml:space="preserve">Elections for House members shall use </w:t>
-      </w:r>
-      <w:proofErr w:type="gramStart"/>
-      <w:r>
-        <w:t>first-past</w:t>
-      </w:r>
-      <w:proofErr w:type="gramEnd"/>
-      <w:r>
-        <w:t>-the-post voting in each riding, with tabulation incorporating ranked preferences via the Schulze method to resolve ties or runoffs without separate rounds. Ballots shall list candidates in random order.</w:t>
+        <w:t>Elections for House members shall use first-past-the-post voting in each riding, with tabulation incorporating ranked preferences via the Schulze method to resolve ties or runoffs without separate rounds. Ballots shall list candidates in random order.</w:t>
       </w:r>
     </w:p>
     <w:p>
@@ -12062,15 +11517,7 @@
         <w:tab/>
       </w:r>
       <w:r>
-        <w:t xml:space="preserve">The House of the Republic, by a two-thirds vote, or the Prime Minister, may refer any bill that has passed the House to a binding national referendum before final assent. The referendum shall be held within one hundred twenty days. If a majority of votes cast approve the bill, the Prime Minister shall grant assent without delay. If rejected, the bill is defeated. This power exists to resolve matters of profound national controversy or constitutional significance where direct expression of the people’s will </w:t>
-      </w:r>
-      <w:proofErr w:type="gramStart"/>
-      <w:r>
-        <w:t>is</w:t>
-      </w:r>
-      <w:proofErr w:type="gramEnd"/>
-      <w:r>
-        <w:t xml:space="preserve"> deemed essential to legitimacy.</w:t>
+        <w:t>The House of the Republic, by a two-thirds vote, or the Prime Minister, may refer any bill that has passed the House to a binding national referendum before final assent. The referendum shall be held within one hundred twenty days. If a majority of votes cast approve the bill, the Prime Minister shall grant assent without delay. If rejected, the bill is defeated. This power exists to resolve matters of profound national controversy or constitutional significance where direct expression of the people’s will is deemed essential to legitimacy.</w:t>
       </w:r>
     </w:p>
     <w:p>
@@ -12108,23 +11555,7 @@
         <w:tab/>
       </w:r>
       <w:r>
-        <w:t xml:space="preserve">The Speaker of the House is elected by the members at the opening of each new House cohort cycle and serves for six years. The Speaker may not be removed except by a two-thirds vote for cause. The Speaker’s role is </w:t>
-      </w:r>
-      <w:proofErr w:type="gramStart"/>
-      <w:r>
-        <w:t>time-keeping</w:t>
-      </w:r>
-      <w:proofErr w:type="gramEnd"/>
-      <w:r>
-        <w:t xml:space="preserve"> and enforcing decorum. Members shall </w:t>
-      </w:r>
-      <w:proofErr w:type="gramStart"/>
-      <w:r>
-        <w:t>conduct themselves professionally at all times</w:t>
-      </w:r>
-      <w:proofErr w:type="gramEnd"/>
-      <w:r>
-        <w:t>, focusing on substantive issues, facts, and policy matters. Decorum violations include, but are not limited to, personal insults, innuendo, character assassination, deliberate falsehoods, lies by omission, or any disruptive behavior that undermines meritocratic</w:t>
+        <w:t>The Speaker of the House is elected by the members at the opening of each new House cohort cycle and serves for six years. The Speaker may not be removed except by a two-thirds vote for cause. The Speaker’s role is time-keeping and enforcing decorum. Members shall conduct themselves professionally at all times, focusing on substantive issues, facts, and policy matters. Decorum violations include, but are not limited to, personal insults, innuendo, character assassination, deliberate falsehoods, lies by omission, or any disruptive behavior that undermines meritocratic</w:t>
       </w:r>
       <w:r>
         <w:t xml:space="preserve">, professional, civil, </w:t>
@@ -12146,27 +11577,14 @@
       <w:pPr>
         <w:ind w:left="1080" w:hanging="360"/>
       </w:pPr>
-      <w:proofErr w:type="spellStart"/>
-      <w:r>
-        <w:t>i</w:t>
-      </w:r>
-      <w:proofErr w:type="spellEnd"/>
-      <w:r>
-        <w:t>)</w:t>
-      </w:r>
-      <w:r>
-        <w:tab/>
-      </w:r>
-      <w:r>
-        <w:t xml:space="preserve">verbal </w:t>
-      </w:r>
-      <w:proofErr w:type="gramStart"/>
-      <w:r>
-        <w:t>warning;</w:t>
-      </w:r>
-      <w:proofErr w:type="gramEnd"/>
-      <w:r>
-        <w:t xml:space="preserve"> </w:t>
+      <w:r>
+        <w:t>i)</w:t>
+      </w:r>
+      <w:r>
+        <w:tab/>
+      </w:r>
+      <w:r>
+        <w:t xml:space="preserve">verbal warning; </w:t>
       </w:r>
     </w:p>
     <w:p>
@@ -12180,15 +11598,7 @@
         <w:tab/>
       </w:r>
       <w:r>
-        <w:t xml:space="preserve">deduction of the member’s remaining question or answer time in that </w:t>
-      </w:r>
-      <w:proofErr w:type="gramStart"/>
-      <w:r>
-        <w:t>session;</w:t>
-      </w:r>
-      <w:proofErr w:type="gramEnd"/>
-      <w:r>
-        <w:t xml:space="preserve"> </w:t>
+        <w:t xml:space="preserve">deduction of the member’s remaining question or answer time in that session; </w:t>
       </w:r>
     </w:p>
     <w:p>
@@ -12202,15 +11612,7 @@
         <w:tab/>
       </w:r>
       <w:r>
-        <w:t xml:space="preserve">temporary expulsion from the chamber for the remainder of the day’s </w:t>
-      </w:r>
-      <w:proofErr w:type="gramStart"/>
-      <w:r>
-        <w:t>sitting;</w:t>
-      </w:r>
-      <w:proofErr w:type="gramEnd"/>
-      <w:r>
-        <w:t xml:space="preserve"> </w:t>
+        <w:t xml:space="preserve">temporary expulsion from the chamber for the remainder of the day’s sitting; </w:t>
       </w:r>
     </w:p>
     <w:p>
@@ -12588,15 +11990,7 @@
         <w:tab/>
       </w:r>
       <w:r>
-        <w:t xml:space="preserve">No elected official, minister, or civil servant above the rank of director may receive annual compensation from public funds </w:t>
-      </w:r>
-      <w:proofErr w:type="gramStart"/>
-      <w:r>
-        <w:t>exceeding</w:t>
-      </w:r>
-      <w:proofErr w:type="gramEnd"/>
-      <w:r>
-        <w:t xml:space="preserve"> twice the median wage of the Canadian people.</w:t>
+        <w:t>No elected official, minister, or civil servant above the rank of director may receive annual compensation from public funds exceeding twice the median wage of the Canadian people.</w:t>
       </w:r>
     </w:p>
     <w:p>
@@ -12665,15 +12059,7 @@
         <w:tab/>
       </w:r>
       <w:r>
-        <w:t xml:space="preserve">Any public servant, corporate officer acting under colour of law, or judge found guilty of corruption, gross negligence, waste of public funds, insider trading, financial fraud, collusion to offshore Canadian jobs, or the awarding of contracts or employment </w:t>
-      </w:r>
-      <w:proofErr w:type="gramStart"/>
-      <w:r>
-        <w:t>on the basis of</w:t>
-      </w:r>
-      <w:proofErr w:type="gramEnd"/>
-      <w:r>
-        <w:t xml:space="preserve"> </w:t>
+        <w:t xml:space="preserve">Any public servant, corporate officer acting under colour of law, or judge found guilty of corruption, gross negligence, waste of public funds, insider trading, financial fraud, collusion to offshore Canadian jobs, or the awarding of contracts or employment on the basis of </w:t>
       </w:r>
       <w:r>
         <w:t>factors other</w:t>
@@ -13526,15 +12912,7 @@
         <w:tab/>
       </w:r>
       <w:r>
-        <w:t xml:space="preserve">Anonymous, </w:t>
-      </w:r>
-      <w:proofErr w:type="gramStart"/>
-      <w:r>
-        <w:t>cryptographically-secure</w:t>
-      </w:r>
-      <w:proofErr w:type="gramEnd"/>
-      <w:r>
-        <w:t>, open-source digital voting systems whose complete source code and cryptographic design are permanently available for public inspection and independent audit shall be the primary method for all elections and referenda. Voting shall be accessible via secure applications on personal devices (such as computers or smartphones), enabling remote casting from home where feasible, with authentication tied to the National Registry of Citizens. Systems must incorporate end-to-end verifiability, coercion-resistance measures, and unbreakable anonymity. In-person polling options shall always remain available to accommodate citizens preferring controlled environments.</w:t>
+        <w:t>Anonymous, cryptographically-secure, open-source digital voting systems whose complete source code and cryptographic design are permanently available for public inspection and independent audit shall be the primary method for all elections and referenda. Voting shall be accessible via secure applications on personal devices (such as computers or smartphones), enabling remote casting from home where feasible, with authentication tied to the National Registry of Citizens. Systems must incorporate end-to-end verifiability, coercion-resistance measures, and unbreakable anonymity. In-person polling options shall always remain available to accommodate citizens preferring controlled environments.</w:t>
       </w:r>
       <w:r>
         <w:t xml:space="preserve"> </w:t>
@@ -13817,15 +13195,7 @@
         <w:pStyle w:val="ListParagraph"/>
       </w:pPr>
       <w:r>
-        <w:t xml:space="preserve">The state payment shall replace 100 % of the higher-earning </w:t>
-      </w:r>
-      <w:proofErr w:type="gramStart"/>
-      <w:r>
-        <w:t>spouse’s</w:t>
-      </w:r>
-      <w:proofErr w:type="gramEnd"/>
-      <w:r>
-        <w:t xml:space="preserve"> verified average annual insurable earnings over the previous 24 months, subject to: </w:t>
+        <w:t xml:space="preserve">The state payment shall replace 100 % of the higher-earning spouse’s verified average annual insurable earnings over the previous 24 months, subject to: </w:t>
       </w:r>
     </w:p>
     <w:p>
@@ -13839,15 +13209,7 @@
         <w:tab/>
       </w:r>
       <w:r>
-        <w:t xml:space="preserve">A hard cap of the </w:t>
-      </w:r>
-      <w:proofErr w:type="gramStart"/>
-      <w:r>
-        <w:t>MIE;</w:t>
-      </w:r>
-      <w:proofErr w:type="gramEnd"/>
-      <w:r>
-        <w:t xml:space="preserve"> </w:t>
+        <w:t xml:space="preserve">A hard cap of the MIE; </w:t>
       </w:r>
     </w:p>
     <w:p>
@@ -13875,29 +13237,13 @@
         <w:tab/>
       </w:r>
       <w:r>
-        <w:t xml:space="preserve">A </w:t>
-      </w:r>
-      <w:proofErr w:type="spellStart"/>
-      <w:r>
-        <w:t>clawback</w:t>
-      </w:r>
-      <w:proofErr w:type="spellEnd"/>
-      <w:r>
-        <w:t xml:space="preserve"> of 30 % of benefits received if the family’s post-benefit net income exceeds twice the median wage in the following tax year.</w:t>
+        <w:t>A clawback of 30 % of benefits received if the family’s post-benefit net income exceeds twice the median wage in the following tax year.</w:t>
       </w:r>
     </w:p>
     <w:p>
       <w:r>
         <w:lastRenderedPageBreak/>
-        <w:t xml:space="preserve">Benefits are non-means-tested beyond contributions and the </w:t>
-      </w:r>
-      <w:proofErr w:type="spellStart"/>
-      <w:r>
-        <w:t>clawback</w:t>
-      </w:r>
-      <w:proofErr w:type="spellEnd"/>
-      <w:r>
-        <w:t xml:space="preserve">. </w:t>
+        <w:t xml:space="preserve">Benefits are non-means-tested beyond contributions and the clawback. </w:t>
       </w:r>
       <w:r>
         <w:t>If one parent remains home full-time thereafter to raise the couple’s minor children until the youngest child reaches the age of fourteen, that parent qualifies for the means-tested support under Article 27, section 4, assessed against total family assets and income, for the duration of that period.</w:t>
@@ -14067,13 +13413,8 @@
         <w:pStyle w:val="ListParagraph"/>
       </w:pPr>
       <w:r>
-        <w:t xml:space="preserve">Divorce exists solely as a remedy for marriages irretrievably broken on legitimate grounds, never as a state-sanctioned instrument of vengeance, spite, retribution, or legal warfare between spouses. The Republic prohibits the use of divorce </w:t>
-      </w:r>
-      <w:proofErr w:type="gramStart"/>
-      <w:r>
-        <w:t>proceedings</w:t>
-      </w:r>
-      <w:proofErr w:type="gramEnd"/>
+        <w:t>Divorce exists solely as a remedy for marriages irretrievably broken on legitimate grounds, never as a state-sanctioned instrument of vengeance, spite, retribution, or legal warfare between spouses. The Republic prohibits the use of divorce proceedings</w:t>
+      </w:r>
       <w:r>
         <w:t xml:space="preserve"> </w:t>
       </w:r>
@@ -14114,27 +13455,14 @@
       <w:pPr>
         <w:ind w:left="1080" w:hanging="360"/>
       </w:pPr>
-      <w:proofErr w:type="spellStart"/>
-      <w:r>
-        <w:t>i</w:t>
-      </w:r>
-      <w:proofErr w:type="spellEnd"/>
-      <w:r>
-        <w:t>)</w:t>
-      </w:r>
-      <w:r>
-        <w:tab/>
-      </w:r>
-      <w:r>
-        <w:t xml:space="preserve">proven physical or psychological abuse of spouse or </w:t>
-      </w:r>
-      <w:proofErr w:type="gramStart"/>
-      <w:r>
-        <w:t>child;</w:t>
-      </w:r>
-      <w:proofErr w:type="gramEnd"/>
-      <w:r>
-        <w:t xml:space="preserve"> </w:t>
+      <w:r>
+        <w:t>i)</w:t>
+      </w:r>
+      <w:r>
+        <w:tab/>
+      </w:r>
+      <w:r>
+        <w:t xml:space="preserve">proven physical or psychological abuse of spouse or child; </w:t>
       </w:r>
     </w:p>
     <w:p>
@@ -14148,15 +13476,7 @@
         <w:tab/>
       </w:r>
       <w:r>
-        <w:t xml:space="preserve">proven </w:t>
-      </w:r>
-      <w:proofErr w:type="gramStart"/>
-      <w:r>
-        <w:t>infidelity;</w:t>
-      </w:r>
-      <w:proofErr w:type="gramEnd"/>
-      <w:r>
-        <w:t xml:space="preserve">  </w:t>
+        <w:t xml:space="preserve">proven infidelity;  </w:t>
       </w:r>
     </w:p>
     <w:p>
@@ -14170,15 +13490,7 @@
         <w:tab/>
       </w:r>
       <w:r>
-        <w:t xml:space="preserve">mutual </w:t>
-      </w:r>
-      <w:proofErr w:type="gramStart"/>
-      <w:r>
-        <w:t>consent;</w:t>
-      </w:r>
-      <w:proofErr w:type="gramEnd"/>
-      <w:r>
-        <w:t xml:space="preserve">  </w:t>
+        <w:t xml:space="preserve">mutual consent;  </w:t>
       </w:r>
     </w:p>
     <w:p>
@@ -14192,15 +13504,7 @@
         <w:tab/>
       </w:r>
       <w:r>
-        <w:t xml:space="preserve">unilateral petition where the petitioner forfeits all claims to custody, visitation, and marital </w:t>
-      </w:r>
-      <w:proofErr w:type="gramStart"/>
-      <w:r>
-        <w:t>assets;</w:t>
-      </w:r>
-      <w:proofErr w:type="gramEnd"/>
-      <w:r>
-        <w:t xml:space="preserve">  </w:t>
+        <w:t xml:space="preserve">unilateral petition where the petitioner forfeits all claims to custody, visitation, and marital assets;  </w:t>
       </w:r>
     </w:p>
     <w:p>
@@ -14247,13 +13551,8 @@
       <w:pPr>
         <w:ind w:left="1080" w:hanging="360"/>
       </w:pPr>
-      <w:proofErr w:type="spellStart"/>
-      <w:r>
-        <w:t>i</w:t>
-      </w:r>
-      <w:proofErr w:type="spellEnd"/>
-      <w:r>
-        <w:t>)</w:t>
+      <w:r>
+        <w:t>i)</w:t>
       </w:r>
       <w:r>
         <w:tab/>
@@ -14353,13 +13652,8 @@
       <w:pPr>
         <w:ind w:left="1080" w:hanging="360"/>
       </w:pPr>
-      <w:proofErr w:type="spellStart"/>
-      <w:r>
-        <w:t>i</w:t>
-      </w:r>
-      <w:proofErr w:type="spellEnd"/>
-      <w:r>
-        <w:t>)</w:t>
+      <w:r>
+        <w:t>i)</w:t>
       </w:r>
       <w:r>
         <w:tab/>
@@ -14531,13 +13825,8 @@
       <w:pPr>
         <w:ind w:left="1080" w:hanging="360"/>
       </w:pPr>
-      <w:proofErr w:type="spellStart"/>
-      <w:r>
-        <w:t>i</w:t>
-      </w:r>
-      <w:proofErr w:type="spellEnd"/>
-      <w:r>
-        <w:t>)</w:t>
+      <w:r>
+        <w:t>i)</w:t>
       </w:r>
       <w:r>
         <w:tab/>
@@ -15011,13 +14300,8 @@
       <w:r>
         <w:tab/>
       </w:r>
-      <w:proofErr w:type="gramStart"/>
-      <w:r>
-        <w:t>Public</w:t>
-      </w:r>
-      <w:proofErr w:type="gramEnd"/>
-      <w:r>
-        <w:t xml:space="preserve"> loan guarantees or direct financing for student tuition shall be conditional: institutions must co-guarantee a portion of loans for each program, proportional to historical graduate employment and income outcomes in fields related to the degree. In cases of sustained underperformance (defined by regulation as below-threshold employment rates or income repayment capacity over a multi-year period), the institution shall assume liability for repayment of the unguaranteed portion, ensuring alignment of institutional incentives with student and national merit.</w:t>
+      <w:r>
+        <w:t>Public loan guarantees or direct financing for student tuition shall be conditional: institutions must co-guarantee a portion of loans for each program, proportional to historical graduate employment and income outcomes in fields related to the degree. In cases of sustained underperformance (defined by regulation as below-threshold employment rates or income repayment capacity over a multi-year period), the institution shall assume liability for repayment of the unguaranteed portion, ensuring alignment of institutional incentives with student and national merit.</w:t>
       </w:r>
     </w:p>
     <w:p>
@@ -15298,13 +14582,8 @@
         <w:tab/>
       </w:r>
       <w:r>
-        <w:t xml:space="preserve">foods fully sourced from Canadian agriculture and </w:t>
-      </w:r>
-      <w:proofErr w:type="gramStart"/>
-      <w:r>
-        <w:t>processing;</w:t>
-      </w:r>
-      <w:proofErr w:type="gramEnd"/>
+        <w:t>foods fully sourced from Canadian agriculture and processing;</w:t>
+      </w:r>
     </w:p>
     <w:p>
       <w:pPr>
@@ -15317,13 +14596,8 @@
         <w:tab/>
       </w:r>
       <w:r>
-        <w:t xml:space="preserve">family farms and small-to-medium enterprises over consolidated corporate entities, consistent with Section 1 and the anti-monopoly provisions of Article </w:t>
-      </w:r>
-      <w:proofErr w:type="gramStart"/>
-      <w:r>
-        <w:t>24;</w:t>
-      </w:r>
-      <w:proofErr w:type="gramEnd"/>
+        <w:t>family farms and small-to-medium enterprises over consolidated corporate entities, consistent with Section 1 and the anti-monopoly provisions of Article 24;</w:t>
+      </w:r>
     </w:p>
     <w:p>
       <w:pPr>
@@ -15374,15 +14648,7 @@
     </w:p>
     <w:p>
       <w:r>
-        <w:t xml:space="preserve">Article 19 constitutionally mandates regenerative and organic agriculture as the governing standard of the Meritocratic Republic of Canada. Synthetic pesticides, herbicides including </w:t>
-      </w:r>
-      <w:proofErr w:type="gramStart"/>
-      <w:r>
-        <w:t>glyphosate</w:t>
-      </w:r>
-      <w:proofErr w:type="gramEnd"/>
-      <w:r>
-        <w:t xml:space="preserve"> and all phosphonate-based compounds, neonicotinoids, and genetically modified organisms are permanently prohibited in their manufacture, importation, sale, distribution, and use. Any proposed new agricultural chemical or input carries the absolute burden of proving multi-generational safety to soil biology, pollinators, wildlife, water systems, and human fertility and health before the Special Tribunal of Scientific Review under Article 2.</w:t>
+        <w:t>Article 19 constitutionally mandates regenerative and organic agriculture as the governing standard of the Meritocratic Republic of Canada. Synthetic pesticides, herbicides including glyphosate and all phosphonate-based compounds, neonicotinoids, and genetically modified organisms are permanently prohibited in their manufacture, importation, sale, distribution, and use. Any proposed new agricultural chemical or input carries the absolute burden of proving multi-generational safety to soil biology, pollinators, wildlife, water systems, and human fertility and health before the Special Tribunal of Scientific Review under Article 2.</w:t>
       </w:r>
     </w:p>
     <w:p>
@@ -15460,34 +14726,10 @@
         <w:tab/>
       </w:r>
       <w:r>
-        <w:t xml:space="preserve">The Bank of Canada is hereby affirmed as a 100 % publicly owned institution reporting directly to the House of the Republic. Its sole mandate is the preservation of the purchasing power of the currency, the facilitation of maximum voluntary and productive employment of Canadian citizens who seek it, and the financing of legitimate public infrastructure and defence at zero or near-zero interest. In all its operations the Bank shall respect the prior rights of parents to direct household labor and family </w:t>
-      </w:r>
-      <w:proofErr w:type="gramStart"/>
-      <w:r>
-        <w:t>formation, and</w:t>
-      </w:r>
-      <w:proofErr w:type="gramEnd"/>
-      <w:r>
-        <w:t xml:space="preserve"> shall never adopt or recommend any policy that penalises or </w:t>
-      </w:r>
-      <w:proofErr w:type="spellStart"/>
-      <w:r>
-        <w:t>disincentivises</w:t>
-      </w:r>
-      <w:proofErr w:type="spellEnd"/>
-      <w:r>
-        <w:t xml:space="preserve"> single-income households. </w:t>
-      </w:r>
-      <w:r>
-        <w:t xml:space="preserve">All profits of the Bank of Canada belong exclusively to the Canadian people and shall be paid annually into general </w:t>
-      </w:r>
-      <w:proofErr w:type="gramStart"/>
-      <w:r>
-        <w:t>revenue</w:t>
-      </w:r>
-      <w:proofErr w:type="gramEnd"/>
-      <w:r>
-        <w:t xml:space="preserve"> or the sovereign wealth fund created under Article 22.</w:t>
+        <w:t xml:space="preserve">The Bank of Canada is hereby affirmed as a 100 % publicly owned institution reporting directly to the House of the Republic. Its sole mandate is the preservation of the purchasing power of the currency, the facilitation of maximum voluntary and productive employment of Canadian citizens who seek it, and the financing of legitimate public infrastructure and defence at zero or near-zero interest. In all its operations the Bank shall respect the prior rights of parents to direct household labor and family formation, and shall never adopt or recommend any policy that penalises or disincentivises single-income households. </w:t>
+      </w:r>
+      <w:r>
+        <w:t>All profits of the Bank of Canada belong exclusively to the Canadian people and shall be paid annually into general revenue or the sovereign wealth fund created under Article 22.</w:t>
       </w:r>
     </w:p>
     <w:p>
@@ -15819,15 +15061,7 @@
         <w:tab/>
       </w:r>
       <w:r>
-        <w:t xml:space="preserve">No Canadian government, province, municipality, crown corporation, or public pension fund may ever borrow from, lend to, or </w:t>
-      </w:r>
-      <w:proofErr w:type="gramStart"/>
-      <w:r>
-        <w:t>enter into</w:t>
-      </w:r>
-      <w:proofErr w:type="gramEnd"/>
-      <w:r>
-        <w:t xml:space="preserve"> derivative contracts with the Bank for International Settlements, the International Monetary Fund, the World Bank, or any banking cartel. Existing obligations to such entities shall be subject to immediate merit-based review by a special parliamentary committee upon ratification, with the authority to declare them odious and void where appropriate, or to </w:t>
+        <w:t xml:space="preserve">No Canadian government, province, municipality, crown corporation, or public pension fund may ever borrow from, lend to, or enter into derivative contracts with the Bank for International Settlements, the International Monetary Fund, the World Bank, or any banking cartel. Existing obligations to such entities shall be subject to immediate merit-based review by a special parliamentary committee upon ratification, with the authority to declare them odious and void where appropriate, or to </w:t>
       </w:r>
       <w:r>
         <w:lastRenderedPageBreak/>
@@ -16056,15 +15290,7 @@
         <w:tab/>
       </w:r>
       <w:r>
-        <w:t xml:space="preserve">Every human being </w:t>
-      </w:r>
-      <w:proofErr w:type="gramStart"/>
-      <w:r>
-        <w:t>present</w:t>
-      </w:r>
-      <w:proofErr w:type="gramEnd"/>
-      <w:r>
-        <w:t xml:space="preserve"> on Canadian soil, whether citizen, resident, or visitor, possesses the inviolable right to immediate emergency medical care of the highest merit-evaluated standard of care, as determined by the Medical Price and Practice Board based on proven, evidence-based protocols, necessary to preserve life or prevent permanent disability in cases of accidental injury, acute medical crisis, or the natural process of childbirth.</w:t>
+        <w:t>Every human being present on Canadian soil, whether citizen, resident, or visitor, possesses the inviolable right to immediate emergency medical care of the highest merit-evaluated standard of care, as determined by the Medical Price and Practice Board based on proven, evidence-based protocols, necessary to preserve life or prevent permanent disability in cases of accidental injury, acute medical crisis, or the natural process of childbirth.</w:t>
       </w:r>
     </w:p>
     <w:p>
@@ -16134,15 +15360,7 @@
         <w:tab/>
       </w:r>
       <w:r>
-        <w:t xml:space="preserve">price gouging or collusive pricing above reasonable cost-plus-fair-profit margins as determined annually by the </w:t>
-      </w:r>
-      <w:proofErr w:type="gramStart"/>
-      <w:r>
-        <w:t>Board;</w:t>
-      </w:r>
-      <w:proofErr w:type="gramEnd"/>
-      <w:r>
-        <w:t xml:space="preserve"> </w:t>
+        <w:t xml:space="preserve">price gouging or collusive pricing above reasonable cost-plus-fair-profit margins as determined annually by the Board; </w:t>
       </w:r>
     </w:p>
     <w:p>
@@ -16157,13 +15375,72 @@
         <w:tab/>
       </w:r>
       <w:r>
-        <w:t xml:space="preserve">refusal to publish transparent, all-in pricing in advance of </w:t>
-      </w:r>
-      <w:proofErr w:type="gramStart"/>
-      <w:r>
-        <w:t>treatment;</w:t>
-      </w:r>
-      <w:proofErr w:type="gramEnd"/>
+        <w:t xml:space="preserve">refusal to publish transparent, all-in pricing in advance of treatment; </w:t>
+      </w:r>
+    </w:p>
+    <w:p>
+      <w:pPr>
+        <w:ind w:left="720" w:hanging="360"/>
+      </w:pPr>
+      <w:r>
+        <w:t>c)</w:t>
+      </w:r>
+      <w:r>
+        <w:tab/>
+      </w:r>
+      <w:r>
+        <w:t xml:space="preserve">balance-billing patients beyond published prices; </w:t>
+      </w:r>
+    </w:p>
+    <w:p>
+      <w:pPr>
+        <w:ind w:left="720" w:hanging="360"/>
+      </w:pPr>
+      <w:r>
+        <w:t>d)</w:t>
+      </w:r>
+      <w:r>
+        <w:tab/>
+      </w:r>
+      <w:r>
+        <w:t xml:space="preserve">tying or bundling of services to force purchase of unnecessary procedures or products; </w:t>
+      </w:r>
+    </w:p>
+    <w:p>
+      <w:pPr>
+        <w:ind w:left="720" w:hanging="360"/>
+      </w:pPr>
+      <w:r>
+        <w:t>e)</w:t>
+      </w:r>
+      <w:r>
+        <w:tab/>
+      </w:r>
+      <w:r>
+        <w:t xml:space="preserve">paying or receiving kickbacks, referral fees, or any inducement for patient steering. </w:t>
+      </w:r>
+    </w:p>
+    <w:p>
+      <w:r>
+        <w:t>Violation by any licensed provider or corporate officer shall result in permanent loss of licence to practise or sell in the Republic, personal fines of up to ten times the illicit gain, and imprisonment for repeat or egregious offences.</w:t>
+      </w:r>
+    </w:p>
+    <w:p>
+      <w:pPr>
+        <w:ind w:left="360" w:hanging="360"/>
+      </w:pPr>
+      <w:r>
+        <w:t>6.</w:t>
+      </w:r>
+      <w:r>
+        <w:tab/>
+      </w:r>
+      <w:r>
+        <w:t>The Medical Price and Practice Board shall consist of five members appointed for single ten-year terms</w:t>
+      </w:r>
+      <w:r>
+        <w:t>.</w:t>
+      </w:r>
       <w:r>
         <w:t xml:space="preserve"> </w:t>
       </w:r>
@@ -16173,21 +15450,40 @@
         <w:ind w:left="720" w:hanging="360"/>
       </w:pPr>
       <w:r>
-        <w:t>c)</w:t>
-      </w:r>
-      <w:r>
-        <w:tab/>
-      </w:r>
-      <w:r>
-        <w:t xml:space="preserve">balance-billing patients beyond published </w:t>
-      </w:r>
-      <w:proofErr w:type="gramStart"/>
-      <w:r>
-        <w:t>prices;</w:t>
-      </w:r>
-      <w:proofErr w:type="gramEnd"/>
-      <w:r>
-        <w:t xml:space="preserve"> </w:t>
+        <w:t>a)</w:t>
+      </w:r>
+      <w:r>
+        <w:tab/>
+      </w:r>
+      <w:r>
+        <w:t xml:space="preserve">two </w:t>
+      </w:r>
+      <w:r>
+        <w:t xml:space="preserve">qualified </w:t>
+      </w:r>
+      <w:r>
+        <w:t xml:space="preserve">health </w:t>
+      </w:r>
+      <w:r>
+        <w:t>expert</w:t>
+      </w:r>
+      <w:r>
+        <w:t>s</w:t>
+      </w:r>
+      <w:r>
+        <w:t xml:space="preserve"> chosen by </w:t>
+      </w:r>
+      <w:r>
+        <w:t xml:space="preserve">lot from the </w:t>
+      </w:r>
+      <w:r>
+        <w:t xml:space="preserve">National </w:t>
+      </w:r>
+      <w:r>
+        <w:t>Registry of Qualified Experts</w:t>
+      </w:r>
+      <w:r>
+        <w:t>;</w:t>
       </w:r>
     </w:p>
     <w:p>
@@ -16195,113 +15491,6 @@
         <w:ind w:left="720" w:hanging="360"/>
       </w:pPr>
       <w:r>
-        <w:t>d)</w:t>
-      </w:r>
-      <w:r>
-        <w:tab/>
-      </w:r>
-      <w:r>
-        <w:t xml:space="preserve">tying or bundling of services to force purchase of unnecessary procedures or </w:t>
-      </w:r>
-      <w:proofErr w:type="gramStart"/>
-      <w:r>
-        <w:t>products;</w:t>
-      </w:r>
-      <w:proofErr w:type="gramEnd"/>
-      <w:r>
-        <w:t xml:space="preserve"> </w:t>
-      </w:r>
-    </w:p>
-    <w:p>
-      <w:pPr>
-        <w:ind w:left="720" w:hanging="360"/>
-      </w:pPr>
-      <w:r>
-        <w:t>e)</w:t>
-      </w:r>
-      <w:r>
-        <w:tab/>
-      </w:r>
-      <w:r>
-        <w:t xml:space="preserve">paying or receiving kickbacks, referral fees, or any inducement for patient steering. </w:t>
-      </w:r>
-    </w:p>
-    <w:p>
-      <w:r>
-        <w:t>Violation by any licensed provider or corporate officer shall result in permanent loss of licence to practise or sell in the Republic, personal fines of up to ten times the illicit gain, and imprisonment for repeat or egregious offences.</w:t>
-      </w:r>
-    </w:p>
-    <w:p>
-      <w:pPr>
-        <w:ind w:left="360" w:hanging="360"/>
-      </w:pPr>
-      <w:r>
-        <w:t>6.</w:t>
-      </w:r>
-      <w:r>
-        <w:tab/>
-      </w:r>
-      <w:r>
-        <w:t>The Medical Price and Practice Board shall consist of five members appointed for single ten-year terms</w:t>
-      </w:r>
-      <w:r>
-        <w:t>.</w:t>
-      </w:r>
-      <w:r>
-        <w:t xml:space="preserve"> </w:t>
-      </w:r>
-    </w:p>
-    <w:p>
-      <w:pPr>
-        <w:ind w:left="720" w:hanging="360"/>
-      </w:pPr>
-      <w:r>
-        <w:t>a)</w:t>
-      </w:r>
-      <w:r>
-        <w:tab/>
-      </w:r>
-      <w:r>
-        <w:t xml:space="preserve">two </w:t>
-      </w:r>
-      <w:r>
-        <w:t xml:space="preserve">qualified </w:t>
-      </w:r>
-      <w:r>
-        <w:t xml:space="preserve">health </w:t>
-      </w:r>
-      <w:r>
-        <w:t>expert</w:t>
-      </w:r>
-      <w:r>
-        <w:t>s</w:t>
-      </w:r>
-      <w:r>
-        <w:t xml:space="preserve"> chosen by </w:t>
-      </w:r>
-      <w:r>
-        <w:t xml:space="preserve">lot from the </w:t>
-      </w:r>
-      <w:r>
-        <w:t xml:space="preserve">National </w:t>
-      </w:r>
-      <w:r>
-        <w:t xml:space="preserve">Registry of Qualified </w:t>
-      </w:r>
-      <w:proofErr w:type="gramStart"/>
-      <w:r>
-        <w:t>Experts</w:t>
-      </w:r>
-      <w:r>
-        <w:t>;</w:t>
-      </w:r>
-      <w:proofErr w:type="gramEnd"/>
-    </w:p>
-    <w:p>
-      <w:pPr>
-        <w:ind w:left="720" w:hanging="360"/>
-      </w:pPr>
-      <w:r>
         <w:t>b)</w:t>
       </w:r>
       <w:r>
@@ -16310,16 +15499,11 @@
       <w:r>
         <w:t xml:space="preserve">one </w:t>
       </w:r>
-      <w:proofErr w:type="gramStart"/>
       <w:r>
         <w:t>lay-</w:t>
       </w:r>
       <w:r>
-        <w:t>citizen</w:t>
-      </w:r>
-      <w:proofErr w:type="gramEnd"/>
-      <w:r>
-        <w:t xml:space="preserve"> chosen by lot</w:t>
+        <w:t>citizen chosen by lot</w:t>
       </w:r>
       <w:r>
         <w:t xml:space="preserve"> from the </w:t>
@@ -16613,15 +15797,7 @@
         <w:t xml:space="preserve"> </w:t>
       </w:r>
       <w:r>
-        <w:t xml:space="preserve">Large-scale industrial wind turbines, solar arrays, and all other low energy-flux-density generation systems are hereby recognized as incompatible with the constitutional imperative of progressively increasing energy flux density. The Republic shall immediately cease all subsidies, tax credits, preferential procurement, mandates, feed-in tariffs, and other state supports for such systems. Existing installations shall be systematically </w:t>
-      </w:r>
-      <w:proofErr w:type="gramStart"/>
-      <w:r>
-        <w:t>decommissioned</w:t>
-      </w:r>
-      <w:proofErr w:type="gramEnd"/>
-      <w:r>
-        <w:t xml:space="preserve"> and the sites restored to higher-value uses (agriculture, natural habitat, residential, or industrial) according to a schedule established by law, with priority given to those occupying prime agricultural land, ecologically sensitive areas, or coastal migration corridors. No new low-flux-density installations may be approved or constructed.</w:t>
+        <w:t>Large-scale industrial wind turbines, solar arrays, and all other low energy-flux-density generation systems are hereby recognized as incompatible with the constitutional imperative of progressively increasing energy flux density. The Republic shall immediately cease all subsidies, tax credits, preferential procurement, mandates, feed-in tariffs, and other state supports for such systems. Existing installations shall be systematically decommissioned and the sites restored to higher-value uses (agriculture, natural habitat, residential, or industrial) according to a schedule established by law, with priority given to those occupying prime agricultural land, ecologically sensitive areas, or coastal migration corridors. No new low-flux-density installations may be approved or constructed.</w:t>
       </w:r>
       <w:r>
         <w:t xml:space="preserve"> </w:t>
@@ -16735,15 +15911,7 @@
         <w:tab/>
       </w:r>
       <w:r>
-        <w:t xml:space="preserve">No trade agreement may be entered that </w:t>
-      </w:r>
-      <w:proofErr w:type="gramStart"/>
-      <w:r>
-        <w:t>subordinates</w:t>
-      </w:r>
-      <w:proofErr w:type="gramEnd"/>
-      <w:r>
-        <w:t xml:space="preserve"> domestic industrial policy to foreign or supranational jurisdiction. Existing agreements incompatible with this provision shall be abrogated within two years of ratification.</w:t>
+        <w:t>No trade agreement may be entered that subordinates domestic industrial policy to foreign or supranational jurisdiction. Existing agreements incompatible with this provision shall be abrogated within two years of ratification.</w:t>
       </w:r>
     </w:p>
     <w:p>
@@ -16819,15 +15987,7 @@
         <w:tab/>
       </w:r>
       <w:r>
-        <w:t xml:space="preserve">No substance, pharmaceutical (including hormonal contraceptives), fluoride, psychotropic compound, </w:t>
-      </w:r>
-      <w:proofErr w:type="gramStart"/>
-      <w:r>
-        <w:t>nano-material</w:t>
-      </w:r>
-      <w:proofErr w:type="gramEnd"/>
-      <w:r>
-        <w:t xml:space="preserve">, or any other additive, may be introduced into public drinking water except for the minimum disinfectants strictly necessary for microbiological safety and only with explicit, recorded legislative approval renewable every five years. </w:t>
+        <w:t xml:space="preserve">No substance, pharmaceutical (including hormonal contraceptives), fluoride, psychotropic compound, nano-material, or any other additive, may be introduced into public drinking water except for the minimum disinfectants strictly necessary for microbiological safety and only with explicit, recorded legislative approval renewable every five years. </w:t>
       </w:r>
     </w:p>
     <w:p>
@@ -16854,13 +16014,8 @@
       <w:r>
         <w:tab/>
       </w:r>
-      <w:proofErr w:type="gramStart"/>
-      <w:r>
-        <w:t>Waste-water</w:t>
-      </w:r>
-      <w:proofErr w:type="gramEnd"/>
-      <w:r>
-        <w:t xml:space="preserve"> and industrial effluent </w:t>
+      <w:r>
+        <w:t xml:space="preserve">Waste-water and industrial effluent </w:t>
       </w:r>
     </w:p>
     <w:p>
@@ -16917,15 +16072,7 @@
         <w:tab/>
       </w:r>
       <w:r>
-        <w:t xml:space="preserve">All infrastructure, energy, water-purification, </w:t>
-      </w:r>
-      <w:proofErr w:type="gramStart"/>
-      <w:r>
-        <w:t>waste-water</w:t>
-      </w:r>
-      <w:proofErr w:type="gramEnd"/>
-      <w:r>
-        <w:t>, and transportation projects authorised under this Article shall be financed primarily through direct, interest-free credit issued by the Bank of Canada as public money, or through the sovereign wealth fund. No such project may be delayed, scaled back, or cancelled on the pretext of fiscal incapacity or indebtedness to private banking institutions.</w:t>
+        <w:t>All infrastructure, energy, water-purification, waste-water, and transportation projects authorised under this Article shall be financed primarily through direct, interest-free credit issued by the Bank of Canada as public money, or through the sovereign wealth fund. No such project may be delayed, scaled back, or cancelled on the pretext of fiscal incapacity or indebtedness to private banking institutions.</w:t>
       </w:r>
     </w:p>
     <w:p>
@@ -16967,15 +16114,7 @@
         <w:tab/>
       </w:r>
       <w:r>
-        <w:t xml:space="preserve">Every citizen’s private </w:t>
-      </w:r>
-      <w:proofErr w:type="gramStart"/>
-      <w:r>
-        <w:t>communications</w:t>
-      </w:r>
-      <w:proofErr w:type="gramEnd"/>
-      <w:r>
-        <w:t xml:space="preserve"> whether voice, text, video, financial, medical, or any other, are inviolable. No government, corporation, or foreign entity may intercept, store, analyse, or compel the surrender of the content or metadata of any citizen’s communications without a judicial warrant issued on probable cause of a specific, serious </w:t>
+        <w:t xml:space="preserve">Every citizen’s private communications whether voice, text, video, financial, medical, or any other, are inviolable. No government, corporation, or foreign entity may intercept, store, analyse, or compel the surrender of the content or metadata of any citizen’s communications without a judicial warrant issued on probable cause of a specific, serious </w:t>
       </w:r>
       <w:r>
         <w:lastRenderedPageBreak/>
@@ -17035,15 +16174,7 @@
         <w:tab/>
       </w:r>
       <w:r>
-        <w:t xml:space="preserve">have </w:t>
-      </w:r>
-      <w:proofErr w:type="gramStart"/>
-      <w:r>
-        <w:t>a majority of</w:t>
-      </w:r>
-      <w:proofErr w:type="gramEnd"/>
-      <w:r>
-        <w:t xml:space="preserve"> directors who are citizens of unmixed European descent,</w:t>
+        <w:t>have a majority of directors who are citizens of unmixed European descent,</w:t>
       </w:r>
     </w:p>
     <w:p>
@@ -17127,15 +16258,7 @@
         <w:tab/>
       </w:r>
       <w:r>
-        <w:t xml:space="preserve">Bulk or </w:t>
-      </w:r>
-      <w:proofErr w:type="spellStart"/>
-      <w:r>
-        <w:t>suspicionless</w:t>
-      </w:r>
-      <w:proofErr w:type="spellEnd"/>
-      <w:r>
-        <w:t xml:space="preserve"> collection of communications metadata by any entity, domestic or foreign, is prohibited in perpetuity. Violation is high treason.</w:t>
+        <w:t>Bulk or suspicionless collection of communications metadata by any entity, domestic or foreign, is prohibited in perpetuity. Violation is high treason.</w:t>
       </w:r>
     </w:p>
     <w:p/>
@@ -17305,16 +16428,11 @@
         <w:tab/>
       </w:r>
       <w:r>
-        <w:t>fully open-</w:t>
-      </w:r>
-      <w:proofErr w:type="gramStart"/>
-      <w:r>
-        <w:t>source</w:t>
+        <w:t>fully open-source</w:t>
       </w:r>
       <w:r>
         <w:t>;</w:t>
       </w:r>
-      <w:proofErr w:type="gramEnd"/>
     </w:p>
     <w:p>
       <w:pPr>
@@ -17532,15 +16650,7 @@
     </w:p>
     <w:p>
       <w:r>
-        <w:t xml:space="preserve">Evidence shall include, but not be limited </w:t>
-      </w:r>
-      <w:proofErr w:type="gramStart"/>
-      <w:r>
-        <w:t>to:</w:t>
-      </w:r>
-      <w:proofErr w:type="gramEnd"/>
-      <w:r>
-        <w:t xml:space="preserve"> standardised IQ and aptitude testing (paper-based, no digital aids), physical-fitness batteries, fertility statistics, marriage and birth rates by age cohort, time-use diaries, and neurological studies. If the Tribunal finds such decline by a two-thirds majority, it shall issue binding corrective orders. Permissible remedies include, without limitation:</w:t>
+        <w:t>Evidence shall include, but not be limited to: standardised IQ and aptitude testing (paper-based, no digital aids), physical-fitness batteries, fertility statistics, marriage and birth rates by age cohort, time-use diaries, and neurological studies. If the Tribunal finds such decline by a two-thirds majority, it shall issue binding corrective orders. Permissible remedies include, without limitation:</w:t>
       </w:r>
     </w:p>
     <w:p>
@@ -17749,15 +16859,7 @@
         <w:t xml:space="preserve">, </w:t>
       </w:r>
       <w:r>
-        <w:t xml:space="preserve">it counters the perils of autonomous systems that might impose biased or unaccountable rulings, fostering a resilient society </w:t>
-      </w:r>
-      <w:proofErr w:type="gramStart"/>
-      <w:r>
-        <w:t>where</w:t>
-      </w:r>
-      <w:proofErr w:type="gramEnd"/>
-      <w:r>
-        <w:t xml:space="preserve"> excellence stems from human agency.</w:t>
+        <w:t>it counters the perils of autonomous systems that might impose biased or unaccountable rulings, fostering a resilient society where excellence stems from human agency.</w:t>
       </w:r>
     </w:p>
     <w:p>
@@ -17843,15 +16945,7 @@
         <w:tab/>
       </w:r>
       <w:r>
-        <w:t xml:space="preserve">Every </w:t>
-      </w:r>
-      <w:proofErr w:type="gramStart"/>
-      <w:r>
-        <w:t>citizen’s</w:t>
-      </w:r>
-      <w:proofErr w:type="gramEnd"/>
-      <w:r>
-        <w:t xml:space="preserve"> lawfully acquired real, personal, intellectual, and financial property is inviolable. No government, agency, court, or private entity acting under colour of law may seize, freeze, encumber, diminish, or destroy such property except by due process of law for a public use explicitly authorised by a two-thirds vote of the House of the Republic and upon prior payment of full, fair, and immediate cash compensation at a price mutually agreed or determined by a jury of twelve property-owning citizens.</w:t>
+        <w:t>Every citizen’s lawfully acquired real, personal, intellectual, and financial property is inviolable. No government, agency, court, or private entity acting under colour of law may seize, freeze, encumber, diminish, or destroy such property except by due process of law for a public use explicitly authorised by a two-thirds vote of the House of the Republic and upon prior payment of full, fair, and immediate cash compensation at a price mutually agreed or determined by a jury of twelve property-owning citizens.</w:t>
       </w:r>
       <w:r>
         <w:t xml:space="preserve"> </w:t>
@@ -17897,15 +16991,7 @@
         <w:t>9</w:t>
       </w:r>
       <w:r>
-        <w:t xml:space="preserve">. No international body, foreign government, non-citizen, or corporation more than ten percent </w:t>
-      </w:r>
-      <w:proofErr w:type="gramStart"/>
-      <w:r>
-        <w:t>foreign-owned</w:t>
-      </w:r>
-      <w:proofErr w:type="gramEnd"/>
-      <w:r>
-        <w:t xml:space="preserve"> may ever own, lease, or exercise control over any part of the National Domain.</w:t>
+        <w:t>. No international body, foreign government, non-citizen, or corporation more than ten percent foreign-owned may ever own, lease, or exercise control over any part of the National Domain.</w:t>
       </w:r>
       <w:r>
         <w:t xml:space="preserve"> </w:t>
@@ -18207,37 +17293,141 @@
         <w:tab/>
       </w:r>
       <w:r>
-        <w:t xml:space="preserve">stratospheric aerosol injection, marine cloud brightening, space-based solar reflection, or any artificial solar-radiation </w:t>
-      </w:r>
-      <w:proofErr w:type="gramStart"/>
-      <w:r>
-        <w:t>modification;</w:t>
-      </w:r>
-      <w:proofErr w:type="gramEnd"/>
+        <w:t xml:space="preserve">stratospheric aerosol injection, marine cloud brightening, space-based solar reflection, or any artificial solar-radiation modification; </w:t>
+      </w:r>
+    </w:p>
+    <w:p>
+      <w:pPr>
+        <w:ind w:left="720" w:hanging="360"/>
+      </w:pPr>
+      <w:r>
+        <w:t>b)</w:t>
+      </w:r>
+      <w:r>
+        <w:tab/>
+      </w:r>
+      <w:r>
+        <w:t xml:space="preserve">cloud seeding, hail suppression (except as permitted below), rain enhancement, fog dispersal, or any release of chemical, biological, or electromagnetic agents intended to alter precipitation, temperature, or atmospheric conditions; </w:t>
+      </w:r>
+    </w:p>
+    <w:p>
+      <w:pPr>
+        <w:ind w:left="720" w:hanging="360"/>
+      </w:pPr>
+      <w:r>
+        <w:t>c)</w:t>
+      </w:r>
+      <w:r>
+        <w:tab/>
+      </w:r>
+      <w:r>
+        <w:t xml:space="preserve">high-energy radio-frequency, laser, or directed-energy systems designed to modify weather systems; </w:t>
+      </w:r>
+    </w:p>
+    <w:p>
+      <w:pPr>
+        <w:ind w:left="720" w:hanging="360"/>
+      </w:pPr>
+      <w:r>
+        <w:t>d)</w:t>
+      </w:r>
+      <w:r>
+        <w:tab/>
+      </w:r>
+      <w:r>
+        <w:t>large-scale carbon-capture-and-storage technologies (chemical, biological, mechanical, or otherwise), excepting natural soil sequestration through traditional or regenerative farming practices.</w:t>
+      </w:r>
       <w:r>
         <w:t xml:space="preserve"> </w:t>
       </w:r>
     </w:p>
     <w:p>
       <w:pPr>
+        <w:ind w:left="360" w:hanging="360"/>
+      </w:pPr>
+      <w:r>
+        <w:t>2.</w:t>
+      </w:r>
+      <w:r>
+        <w:tab/>
+      </w:r>
+      <w:r>
+        <w:t>Any geoengineering activity wherever conducted, including but not limited to international waters, airspace, space, or the territory of another state</w:t>
+      </w:r>
+      <w:r>
+        <w:t>,</w:t>
+      </w:r>
+      <w:r>
+        <w:t xml:space="preserve"> that is verifiably intended to or does materially alter weather, climate, sunlight, precipitation, or atmospheric conditions over any part of the territory, exclusive economic zone, or continental shelf of the Republic of Canada shall be deemed an act of aggression against the Canadian people. The </w:t>
+      </w:r>
+      <w:r>
+        <w:t>Prime Minister</w:t>
+      </w:r>
+      <w:r>
+        <w:t xml:space="preserve"> is authorised to respond with all necessary military force, up to and including pre-emptive or retaliatory strikes against the responsible platforms, vessels, aircraft, installations, or command centres, without need for prior declaration of war or approval of any foreign or supranational body.</w:t>
+      </w:r>
+    </w:p>
+    <w:p>
+      <w:pPr>
+        <w:ind w:left="360" w:hanging="360"/>
+      </w:pPr>
+      <w:r>
+        <w:t>3.</w:t>
+      </w:r>
+      <w:r>
+        <w:tab/>
+      </w:r>
+      <w:r>
+        <w:t xml:space="preserve">Provincial authorities may authorise temporary, localised hail-suppression or tornado-dissipation operations using established, non-persistent agents (e.g., silver iodide flares) only when a specific, imminent, and severe storm threatens a major population centre or critical infrastructure, and only for </w:t>
+      </w:r>
+      <w:r>
+        <w:lastRenderedPageBreak/>
+        <w:t>the duration of that immediate threat. Every such operation must be publicly announced 24 hours in advance or immediately if urgency forbids, live-streamed when possible, independently monitored, and fully reported to the provincial legislature within seven days. Any use outside these strict limits shall be punished as treason.</w:t>
+      </w:r>
+      <w:r>
+        <w:t xml:space="preserve"> </w:t>
+      </w:r>
+    </w:p>
+    <w:p>
+      <w:pPr>
+        <w:ind w:left="360" w:hanging="360"/>
+      </w:pPr>
+      <w:r>
+        <w:t>4.</w:t>
+      </w:r>
+      <w:r>
+        <w:tab/>
+      </w:r>
+      <w:r>
+        <w:t>The Ministry of National Defence may conduct research, development, and deployment of geoengineering or weather modification technologies solely for defensive countermeasure purposes, strictly limited to neutralising verified hostile geoengineering acts by foreign adversaries that threaten Canadian territory, citizens, or military operations. Such activities:</w:t>
+      </w:r>
+    </w:p>
+    <w:p>
+      <w:pPr>
         <w:ind w:left="720" w:hanging="360"/>
       </w:pPr>
       <w:r>
+        <w:t>a)</w:t>
+      </w:r>
+      <w:r>
+        <w:tab/>
+      </w:r>
+      <w:r>
+        <w:t>must be authorised in advance by the Prime Minister upon recommendation of the Minister of National Defence, based on clear and present evidence of foreign aggression;</w:t>
+      </w:r>
+    </w:p>
+    <w:p>
+      <w:pPr>
+        <w:ind w:left="720" w:hanging="360"/>
+      </w:pPr>
+      <w:r>
         <w:t>b)</w:t>
       </w:r>
       <w:r>
         <w:tab/>
       </w:r>
       <w:r>
-        <w:t xml:space="preserve">cloud seeding, hail suppression (except as permitted below), rain enhancement, fog dispersal, or any release of chemical, biological, or electromagnetic agents intended to alter precipitation, temperature, or atmospheric </w:t>
-      </w:r>
-      <w:proofErr w:type="gramStart"/>
-      <w:r>
-        <w:t>conditions;</w:t>
-      </w:r>
-      <w:proofErr w:type="gramEnd"/>
-      <w:r>
-        <w:t xml:space="preserve"> </w:t>
+        <w:t>shall be confined to the minimum scope, duration, and intensity necessary to counteract the specific threat, with no residual or proactive environmental impact permitted beyond the immediate defensive objective;</w:t>
       </w:r>
     </w:p>
     <w:p>
@@ -18251,167 +17441,8 @@
         <w:tab/>
       </w:r>
       <w:r>
-        <w:t xml:space="preserve">high-energy </w:t>
-      </w:r>
-      <w:proofErr w:type="gramStart"/>
-      <w:r>
-        <w:t>radio-frequency</w:t>
-      </w:r>
-      <w:proofErr w:type="gramEnd"/>
-      <w:r>
-        <w:t xml:space="preserve">, laser, or directed-energy systems designed to modify weather systems; </w:t>
-      </w:r>
-    </w:p>
-    <w:p>
-      <w:pPr>
-        <w:ind w:left="720" w:hanging="360"/>
-      </w:pPr>
-      <w:r>
-        <w:t>d)</w:t>
-      </w:r>
-      <w:r>
-        <w:tab/>
-      </w:r>
-      <w:r>
-        <w:t>large-scale carbon-capture-and-storage technologies (chemical, biological, mechanical, or otherwise), excepting natural soil sequestration through traditional or regenerative farming practices.</w:t>
-      </w:r>
-      <w:r>
-        <w:t xml:space="preserve"> </w:t>
-      </w:r>
-    </w:p>
-    <w:p>
-      <w:pPr>
-        <w:ind w:left="360" w:hanging="360"/>
-      </w:pPr>
-      <w:r>
-        <w:t>2.</w:t>
-      </w:r>
-      <w:r>
-        <w:tab/>
-      </w:r>
-      <w:r>
-        <w:t>Any geoengineering activity wherever conducted, including but not limited to international waters, airspace, space, or the territory of another state</w:t>
-      </w:r>
-      <w:r>
-        <w:t>,</w:t>
-      </w:r>
-      <w:r>
-        <w:t xml:space="preserve"> that is verifiably intended to or does materially alter weather, climate, sunlight, precipitation, or atmospheric conditions over any part of the territory, exclusive economic zone, or continental shelf of the Republic of Canada shall be deemed an act of aggression against the Canadian people. The </w:t>
-      </w:r>
-      <w:r>
-        <w:t>Prime Minister</w:t>
-      </w:r>
-      <w:r>
-        <w:t xml:space="preserve"> is authorised to respond with all necessary military force, up to and including pre-emptive or retaliatory strikes against the responsible platforms, vessels, aircraft, installations, or command centres, without need for prior declaration of war or approval of any foreign or supranational body.</w:t>
-      </w:r>
-    </w:p>
-    <w:p>
-      <w:pPr>
-        <w:ind w:left="360" w:hanging="360"/>
-      </w:pPr>
-      <w:r>
-        <w:t>3.</w:t>
-      </w:r>
-      <w:r>
-        <w:tab/>
-      </w:r>
-      <w:r>
-        <w:t xml:space="preserve">Provincial authorities may authorise temporary, localised hail-suppression or tornado-dissipation operations using established, non-persistent agents (e.g., silver iodide flares) only when a specific, imminent, and severe storm threatens a major population centre or critical infrastructure, and only for </w:t>
-      </w:r>
-      <w:r>
-        <w:lastRenderedPageBreak/>
-        <w:t>the duration of that immediate threat. Every such operation must be publicly announced 24 hours in advance or immediately if urgency forbids, live-</w:t>
-      </w:r>
-      <w:proofErr w:type="gramStart"/>
-      <w:r>
-        <w:t>streamed</w:t>
-      </w:r>
-      <w:proofErr w:type="gramEnd"/>
-      <w:r>
-        <w:t xml:space="preserve"> when possible, independently monitored, and fully reported to the provincial legislature within seven days. Any use outside these strict limits shall be punished as treason.</w:t>
-      </w:r>
-      <w:r>
-        <w:t xml:space="preserve"> </w:t>
-      </w:r>
-    </w:p>
-    <w:p>
-      <w:pPr>
-        <w:ind w:left="360" w:hanging="360"/>
-      </w:pPr>
-      <w:r>
-        <w:t>4.</w:t>
-      </w:r>
-      <w:r>
-        <w:tab/>
-      </w:r>
-      <w:r>
-        <w:t>The Ministry of National Defence may conduct research, development, and deployment of geoengineering or weather modification technologies solely for defensive countermeasure purposes, strictly limited to neutralising verified hostile geoengineering acts by foreign adversaries that threaten Canadian territory, citizens, or military operations. Such activities:</w:t>
-      </w:r>
-    </w:p>
-    <w:p>
-      <w:pPr>
-        <w:ind w:left="720" w:hanging="360"/>
-      </w:pPr>
-      <w:r>
-        <w:t>a)</w:t>
-      </w:r>
-      <w:r>
-        <w:tab/>
-      </w:r>
-      <w:r>
-        <w:t xml:space="preserve">must be authorised in advance by the Prime Minister upon recommendation of the Minister of National Defence, based on clear and present evidence of foreign </w:t>
-      </w:r>
-      <w:proofErr w:type="gramStart"/>
-      <w:r>
-        <w:t>aggression;</w:t>
-      </w:r>
-      <w:proofErr w:type="gramEnd"/>
-    </w:p>
-    <w:p>
-      <w:pPr>
-        <w:ind w:left="720" w:hanging="360"/>
-      </w:pPr>
-      <w:r>
-        <w:t>b)</w:t>
-      </w:r>
-      <w:r>
-        <w:tab/>
-      </w:r>
-      <w:r>
-        <w:t xml:space="preserve">shall be confined to the minimum scope, duration, and intensity necessary to counteract the specific threat, with no residual or proactive environmental impact permitted beyond the immediate defensive </w:t>
-      </w:r>
-      <w:proofErr w:type="gramStart"/>
-      <w:r>
-        <w:t>objective;</w:t>
-      </w:r>
-      <w:proofErr w:type="gramEnd"/>
-    </w:p>
-    <w:p>
-      <w:pPr>
-        <w:ind w:left="720" w:hanging="360"/>
-      </w:pPr>
-      <w:r>
-        <w:t>c)</w:t>
-      </w:r>
-      <w:r>
-        <w:tab/>
-      </w:r>
-      <w:r>
-        <w:t xml:space="preserve">are subject to annual independent review by a merit-selected special tribunal convened under the provisions of Article 2 (Freedom of Inquiry and Redress), comprising </w:t>
-      </w:r>
-      <w:proofErr w:type="spellStart"/>
-      <w:r>
-        <w:t>anonymised</w:t>
-      </w:r>
-      <w:proofErr w:type="spellEnd"/>
-      <w:r>
-        <w:t xml:space="preserve"> experts in environmental science, meteorology, and national security, who shall verify compliance with this exception and recommend termination if merit-based criteria are not </w:t>
-      </w:r>
-      <w:proofErr w:type="gramStart"/>
-      <w:r>
-        <w:t>met;</w:t>
-      </w:r>
-      <w:proofErr w:type="gramEnd"/>
+        <w:t>are subject to annual independent review by a merit-selected special tribunal convened under the provisions of Article 2 (Freedom of Inquiry and Redress), comprising anonymised experts in environmental science, meteorology, and national security, who shall verify compliance with this exception and recommend termination if merit-based criteria are not met;</w:t>
+      </w:r>
     </w:p>
     <w:p>
       <w:pPr>
@@ -18458,15 +17489,7 @@
         <w:tab/>
       </w:r>
       <w:r>
-        <w:t xml:space="preserve">issuance and management of hunting, fishing, and trapping licences and </w:t>
-      </w:r>
-      <w:proofErr w:type="gramStart"/>
-      <w:r>
-        <w:t>seasons;</w:t>
-      </w:r>
-      <w:proofErr w:type="gramEnd"/>
-      <w:r>
-        <w:t xml:space="preserve"> </w:t>
+        <w:t xml:space="preserve">issuance and management of hunting, fishing, and trapping licences and seasons; </w:t>
       </w:r>
     </w:p>
     <w:p>
@@ -18480,15 +17503,7 @@
         <w:tab/>
       </w:r>
       <w:r>
-        <w:t xml:space="preserve">classification, protection, and active recovery of endangered or threatened native </w:t>
-      </w:r>
-      <w:proofErr w:type="gramStart"/>
-      <w:r>
-        <w:t>species;</w:t>
-      </w:r>
-      <w:proofErr w:type="gramEnd"/>
-      <w:r>
-        <w:t xml:space="preserve"> </w:t>
+        <w:t xml:space="preserve">classification, protection, and active recovery of endangered or threatened native species; </w:t>
       </w:r>
     </w:p>
     <w:p>
@@ -18502,15 +17517,7 @@
         <w:tab/>
       </w:r>
       <w:r>
-        <w:t xml:space="preserve">setting and enforcement of air- and water-quality standards throughout the province, including industrial emissions, urban air pollution, and agricultural </w:t>
-      </w:r>
-      <w:proofErr w:type="gramStart"/>
-      <w:r>
-        <w:t>runoff;</w:t>
-      </w:r>
-      <w:proofErr w:type="gramEnd"/>
-      <w:r>
-        <w:t xml:space="preserve"> </w:t>
+        <w:t xml:space="preserve">setting and enforcement of air- and water-quality standards throughout the province, including industrial emissions, urban air pollution, and agricultural runoff; </w:t>
       </w:r>
     </w:p>
     <w:p>
@@ -18524,15 +17531,7 @@
         <w:tab/>
       </w:r>
       <w:r>
-        <w:t>oversight of waste collection, recycling, treatment, and disposal (including hazardous and medical waste</w:t>
-      </w:r>
-      <w:proofErr w:type="gramStart"/>
-      <w:r>
-        <w:t>);</w:t>
-      </w:r>
-      <w:proofErr w:type="gramEnd"/>
-      <w:r>
-        <w:t xml:space="preserve"> </w:t>
+        <w:t xml:space="preserve">oversight of waste collection, recycling, treatment, and disposal (including hazardous and medical waste); </w:t>
       </w:r>
     </w:p>
     <w:p>
@@ -18546,15 +17545,7 @@
         <w:tab/>
       </w:r>
       <w:r>
-        <w:t xml:space="preserve">remediation of contaminated sites and </w:t>
-      </w:r>
-      <w:proofErr w:type="gramStart"/>
-      <w:r>
-        <w:t>brownfields;</w:t>
-      </w:r>
-      <w:proofErr w:type="gramEnd"/>
-      <w:r>
-        <w:t xml:space="preserve"> </w:t>
+        <w:t xml:space="preserve">remediation of contaminated sites and brownfields; </w:t>
       </w:r>
     </w:p>
     <w:p>
@@ -18568,15 +17559,7 @@
         <w:tab/>
       </w:r>
       <w:r>
-        <w:t xml:space="preserve">establishment of bounties where necessary for invasive or overpopulated </w:t>
-      </w:r>
-      <w:proofErr w:type="gramStart"/>
-      <w:r>
-        <w:t>species;</w:t>
-      </w:r>
-      <w:proofErr w:type="gramEnd"/>
-      <w:r>
-        <w:t xml:space="preserve"> </w:t>
+        <w:t xml:space="preserve">establishment of bounties where necessary for invasive or overpopulated species; </w:t>
       </w:r>
     </w:p>
     <w:p>
@@ -18728,15 +17711,7 @@
         <w:t>could be used</w:t>
       </w:r>
       <w:r>
-        <w:t xml:space="preserve"> to control populations or induce scarcity. By deeming foreign geoengineering acts as aggression warranting military response, it upholds national </w:t>
-      </w:r>
-      <w:proofErr w:type="spellStart"/>
-      <w:r>
-        <w:t>self-defense</w:t>
-      </w:r>
-      <w:proofErr w:type="spellEnd"/>
-      <w:r>
-        <w:t>, countering existential perils amplified by satellite technologies or directed-energy systems that could impose artificial famines or climatic disruptions, ensuring that meritocratic prosperity thrives on genuine environmental stability rather than manipulat</w:t>
+        <w:t xml:space="preserve"> to control populations or induce scarcity. By deeming foreign geoengineering acts as aggression warranting military response, it upholds national self-defense, countering existential perils amplified by satellite technologies or directed-energy systems that could impose artificial famines or climatic disruptions, ensuring that meritocratic prosperity thrives on genuine environmental stability rather than manipulat</w:t>
       </w:r>
       <w:r>
         <w:t>ion</w:t>
@@ -18929,15 +17904,7 @@
         <w:tab/>
       </w:r>
       <w:r>
-        <w:t xml:space="preserve">All federal payments, subsidies, or tax exemptions granted solely </w:t>
-      </w:r>
-      <w:proofErr w:type="gramStart"/>
-      <w:r>
-        <w:t>on the basis of</w:t>
-      </w:r>
-      <w:proofErr w:type="gramEnd"/>
-      <w:r>
-        <w:t xml:space="preserve"> aboriginal ancestry cease immediately upon ratification, except for a single, transparent, ten-year transitional equalisation fund distributed on a per-capita basis to every resident of former reserve lands (regardless of ancestry) to ease the shift to full municipal taxation and services. After ten years, no further race- or ancestry-based payments may be made.</w:t>
+        <w:t>All federal payments, subsidies, or tax exemptions granted solely on the basis of aboriginal ancestry cease immediately upon ratification, except for a single, transparent, ten-year transitional equalisation fund distributed on a per-capita basis to every resident of former reserve lands (regardless of ancestry) to ease the shift to full municipal taxation and services. After ten years, no further race- or ancestry-based payments may be made.</w:t>
       </w:r>
       <w:r>
         <w:t xml:space="preserve"> </w:t>
@@ -19038,15 +18005,7 @@
         <w:tab/>
       </w:r>
       <w:r>
-        <w:t xml:space="preserve">The Republic recognises a duty of solidarity toward citizens who are temporarily unable to secure gainful employment or the </w:t>
-      </w:r>
-      <w:proofErr w:type="gramStart"/>
-      <w:r>
-        <w:t>basic necessities</w:t>
-      </w:r>
-      <w:proofErr w:type="gramEnd"/>
-      <w:r>
-        <w:t xml:space="preserve"> of life. The purpose of all such assistance is the rapid restoration of self-reliance.</w:t>
+        <w:t>The Republic recognises a duty of solidarity toward citizens who are temporarily unable to secure gainful employment or the basic necessities of life. The purpose of all such assistance is the rapid restoration of self-reliance.</w:t>
       </w:r>
     </w:p>
     <w:p>
@@ -19074,21 +18033,13 @@
         <w:tab/>
       </w:r>
       <w:r>
-        <w:t xml:space="preserve">immediate placement through a national labour-exchange service into suitable paid employment or apprenticeship, or, if no private-sector position is immediately available, into public-works or infrastructure projects funded under Article </w:t>
-      </w:r>
-      <w:proofErr w:type="gramStart"/>
+        <w:t>immediate placement through a national labour-exchange service into suitable paid employment or apprenticeship, or, if no private-sector position is immediately available, into public-works or infrastructure projects funded under Article 2</w:t>
+      </w:r>
       <w:r>
         <w:t>2</w:t>
       </w:r>
       <w:r>
-        <w:t>2</w:t>
-      </w:r>
-      <w:r>
-        <w:t>;</w:t>
-      </w:r>
-      <w:proofErr w:type="gramEnd"/>
-      <w:r>
-        <w:t xml:space="preserve"> </w:t>
+        <w:t xml:space="preserve">; </w:t>
       </w:r>
     </w:p>
     <w:p>
@@ -19102,15 +18053,7 @@
         <w:tab/>
       </w:r>
       <w:r>
-        <w:t xml:space="preserve">temporary, modest cash benefits sufficient to secure basic housing, food, and necessities from local private sources, paid directly to the </w:t>
-      </w:r>
-      <w:proofErr w:type="gramStart"/>
-      <w:r>
-        <w:t>citizen;</w:t>
-      </w:r>
-      <w:proofErr w:type="gramEnd"/>
-      <w:r>
-        <w:t xml:space="preserve"> </w:t>
+        <w:t xml:space="preserve">temporary, modest cash benefits sufficient to secure basic housing, food, and necessities from local private sources, paid directly to the citizen; </w:t>
       </w:r>
     </w:p>
     <w:p>
@@ -19759,13 +18702,8 @@
       <w:pPr>
         <w:ind w:left="1080" w:hanging="360"/>
       </w:pPr>
-      <w:proofErr w:type="spellStart"/>
-      <w:r>
-        <w:t>i</w:t>
-      </w:r>
-      <w:proofErr w:type="spellEnd"/>
-      <w:r>
-        <w:t>)</w:t>
+      <w:r>
+        <w:t>i)</w:t>
       </w:r>
       <w:r>
         <w:tab/>
@@ -19969,15 +18907,7 @@
         <w:tab/>
       </w:r>
       <w:r>
-        <w:t xml:space="preserve">No offensive military deployment beyond the territory of the Republic may be ordered or commenced </w:t>
-      </w:r>
-      <w:proofErr w:type="gramStart"/>
-      <w:r>
-        <w:t>on the basis of</w:t>
-      </w:r>
-      <w:proofErr w:type="gramEnd"/>
-      <w:r>
-        <w:t xml:space="preserve"> an intelligence assessment that a foreign state or non-state actor has attacked the Republic or its citizens until that assessment has been subjected to an accelerated Special Tribunal of Review (modelled on Article 2) convened within 72 hours of the assessment being presented to the Prime Minister or the House. The Tribunal’s decision is binding, and any deployment commenced in violation of this section is unlawful.</w:t>
+        <w:t>No offensive military deployment beyond the territory of the Republic may be ordered or commenced on the basis of an intelligence assessment that a foreign state or non-state actor has attacked the Republic or its citizens until that assessment has been subjected to an accelerated Special Tribunal of Review (modelled on Article 2) convened within 72 hours of the assessment being presented to the Prime Minister or the House. The Tribunal’s decision is binding, and any deployment commenced in violation of this section is unlawful.</w:t>
       </w:r>
     </w:p>
     <w:p>
@@ -20102,15 +19032,7 @@
         <w:t>’</w:t>
       </w:r>
       <w:r>
-        <w:t xml:space="preserve"> legacy. In doing so, it promotes a republic </w:t>
-      </w:r>
-      <w:proofErr w:type="gramStart"/>
-      <w:r>
-        <w:t>where</w:t>
-      </w:r>
-      <w:proofErr w:type="gramEnd"/>
-      <w:r>
-        <w:t xml:space="preserve"> security bolsters prosperity, allowing individuals to thrive without the shadows of unchecked power or existential vulnerability.</w:t>
+        <w:t xml:space="preserve"> legacy. In doing so, it promotes a republic where security bolsters prosperity, allowing individuals to thrive without the shadows of unchecked power or existential vulnerability.</w:t>
       </w:r>
       <w:r>
         <w:br w:type="page"/>
@@ -20266,15 +19188,7 @@
         <w:tab/>
       </w:r>
       <w:r>
-        <w:t xml:space="preserve">No province may </w:t>
-      </w:r>
-      <w:proofErr w:type="gramStart"/>
-      <w:r>
-        <w:t>enter into</w:t>
-      </w:r>
-      <w:proofErr w:type="gramEnd"/>
-      <w:r>
-        <w:t xml:space="preserve"> any treaty, compact, or agreement with a foreign power or international organisation without the prior consent of the House of the Republic by a two-thirds vote. Any such unauthorised agreement is void and its authors guilty of high treason.</w:t>
+        <w:t>No province may enter into any treaty, compact, or agreement with a foreign power or international organisation without the prior consent of the House of the Republic by a two-thirds vote. Any such unauthorised agreement is void and its authors guilty of high treason.</w:t>
       </w:r>
     </w:p>
     <w:p>
@@ -20287,13 +19201,8 @@
       <w:r>
         <w:tab/>
       </w:r>
-      <w:proofErr w:type="gramStart"/>
-      <w:r>
-        <w:t>In the event that</w:t>
-      </w:r>
-      <w:proofErr w:type="gramEnd"/>
-      <w:r>
-        <w:t xml:space="preserve"> any province persistently refuses to comply with a clear obligation imposed by this Constitution, the House of the Republic may, by a three-quarters vote after public inquiry, suspend the offending province’s legislative powers for a period not exceeding five years and place its administration under temporary national trusteeship until compliance is restored.</w:t>
+      <w:r>
+        <w:t>In the event that any province persistently refuses to comply with a clear obligation imposed by this Constitution, the House of the Republic may, by a three-quarters vote after public inquiry, suspend the offending province’s legislative powers for a period not exceeding five years and place its administration under temporary national trusteeship until compliance is restored.</w:t>
       </w:r>
     </w:p>
     <w:p>
@@ -20670,15 +19579,7 @@
         <w:tab/>
       </w:r>
       <w:r>
-        <w:t xml:space="preserve">Upon the ratification of this Constitution, all statutes, regulations, orders-in-council, judicial precedents, international treaties, conventions, agreements, compacts, and obligations </w:t>
-      </w:r>
-      <w:proofErr w:type="gramStart"/>
-      <w:r>
-        <w:t>entered into</w:t>
-      </w:r>
-      <w:proofErr w:type="gramEnd"/>
-      <w:r>
-        <w:t xml:space="preserve"> by or in the name of Canada, the Dominion of Canada, or any predecessor entity that are incompatible with the letter or spirit of this Constitution are declared null and void ab initio and of no legal force or effect. No court, official, or international body may recognise or enforce any such abrogated law or obligation.</w:t>
+        <w:t>Upon the ratification of this Constitution, all statutes, regulations, orders-in-council, judicial precedents, international treaties, conventions, agreements, compacts, and obligations entered into by or in the name of Canada, the Dominion of Canada, or any predecessor entity that are incompatible with the letter or spirit of this Constitution are declared null and void ab initio and of no legal force or effect. No court, official, or international body may recognise or enforce any such abrogated law or obligation.</w:t>
       </w:r>
     </w:p>
     <w:p>
@@ -20808,15 +19709,7 @@
     </w:p>
     <w:p>
       <w:r>
-        <w:t xml:space="preserve">This article also safeguards against stagnation by reserving the people’s unalienable right to </w:t>
-      </w:r>
-      <w:proofErr w:type="spellStart"/>
-      <w:r>
-        <w:t>refound</w:t>
-      </w:r>
-      <w:proofErr w:type="spellEnd"/>
-      <w:r>
-        <w:t xml:space="preserve"> the Constitution through deliberate processes, reflecting the meritocratic principle that governance must evolve with technological and existential challenges without hasty disruption. It prevents crimes such as elite capture or external attacks during transition by forewarning of potential assaults (economic, informational, or kinetic) and charging future generations to defend the framework by any means, aligning with the Charter’s emphasis on positive eugenics and family sovereignty to ensure the founding peoples’ legacy endures. The unamendable status of this section reinforces its role as a bulwark, thwarting attempts to entrench power structures that stifle inquiry or economic liberty, thereby enhancing the human experience of freedom in a future where artificial intelligence and warfare could otherwise exploit rigid or obsolete systems.</w:t>
+        <w:t>This article also safeguards against stagnation by reserving the people’s unalienable right to refound the Constitution through deliberate processes, reflecting the meritocratic principle that governance must evolve with technological and existential challenges without hasty disruption. It prevents crimes such as elite capture or external attacks during transition by forewarning of potential assaults (economic, informational, or kinetic) and charging future generations to defend the framework by any means, aligning with the Charter’s emphasis on positive eugenics and family sovereignty to ensure the founding peoples’ legacy endures. The unamendable status of this section reinforces its role as a bulwark, thwarting attempts to entrench power structures that stifle inquiry or economic liberty, thereby enhancing the human experience of freedom in a future where artificial intelligence and warfare could otherwise exploit rigid or obsolete systems.</w:t>
       </w:r>
     </w:p>
     <w:p>
@@ -20863,35 +19756,11 @@
     </w:p>
     <w:p>
       <w:r>
-        <w:t xml:space="preserve">Finally comes the noosphere, a new shell superimposed on top of the biosphere (and thus indirectly on the geosphere). It remained rudimentary in animals, but with humans it has exploded into burgeoning development. Human minds now reshape the planet at speeds unimaginable in earlier spheres. We migrate and concentrate atoms on an industrial scale with mining, manufacturing, building cities…augmenting the slow </w:t>
-      </w:r>
-      <w:proofErr w:type="spellStart"/>
-      <w:r>
-        <w:t>biomigration</w:t>
-      </w:r>
-      <w:proofErr w:type="spellEnd"/>
-      <w:r>
-        <w:t xml:space="preserve"> of atoms with rapid </w:t>
-      </w:r>
-      <w:proofErr w:type="spellStart"/>
-      <w:r>
-        <w:t>noomigration</w:t>
-      </w:r>
-      <w:proofErr w:type="spellEnd"/>
-      <w:r>
-        <w:t xml:space="preserve">. Like its predecessors, the noosphere contains objects and actions, but they are mental rather than biological or geological: ideas, cultures, technologies, systems of thought. These are every bit as real and </w:t>
+        <w:t xml:space="preserve">Finally comes the noosphere, a new shell superimposed on top of the biosphere (and thus indirectly on the geosphere). It remained rudimentary in animals, but with humans it has exploded into burgeoning development. Human minds now reshape the planet at speeds unimaginable in earlier spheres. We migrate and concentrate atoms on an industrial scale with mining, manufacturing, building cities…augmenting the slow biomigration of atoms with rapid noomigration. Like its predecessors, the noosphere contains objects and actions, but they are mental rather than biological or geological: ideas, cultures, technologies, systems of thought. These are every bit as real and </w:t>
       </w:r>
       <w:r>
         <w:lastRenderedPageBreak/>
-        <w:t xml:space="preserve">consequential as biological species or geological mountains: they are </w:t>
-      </w:r>
-      <w:proofErr w:type="spellStart"/>
-      <w:r>
-        <w:t>noological</w:t>
-      </w:r>
-      <w:proofErr w:type="spellEnd"/>
-      <w:r>
-        <w:t xml:space="preserve"> phenomena.</w:t>
+        <w:t>consequential as biological species or geological mountains: they are noological phenomena.</w:t>
       </w:r>
     </w:p>
     <w:p>
@@ -20901,15 +19770,7 @@
     </w:p>
     <w:p>
       <w:r>
-        <w:t xml:space="preserve">The classical list of argumentative fallacies offers one early attempt at such a catalogue, detailing mental parasitism that distorts reasoning and perception. But the phenomenon runs deeper. The clearest symptom of noetic parasitism is the experience of tyranny: the drive of some minds to control what others may think, say, feel, or do. This impulse has haunted recorded history and shaped much of it. In response, humanity has repeatedly designed political systems meant to limit such tyranny and restore mental freedom. The forces of tyrannical control over the mind of man </w:t>
-      </w:r>
-      <w:proofErr w:type="gramStart"/>
-      <w:r>
-        <w:t>is</w:t>
-      </w:r>
-      <w:proofErr w:type="gramEnd"/>
-      <w:r>
-        <w:t xml:space="preserve"> a real existent phenomenon which has always been a part of the human noetic social condition, and it is almost or possibly exclusively always connected with parasitical systems of grift.</w:t>
+        <w:t>The classical list of argumentative fallacies offers one early attempt at such a catalogue, detailing mental parasitism that distorts reasoning and perception. But the phenomenon runs deeper. The clearest symptom of noetic parasitism is the experience of tyranny: the drive of some minds to control what others may think, say, feel, or do. This impulse has haunted recorded history and shaped much of it. In response, humanity has repeatedly designed political systems meant to limit such tyranny and restore mental freedom. The forces of tyrannical control over the mind of man is a real existent phenomenon which has always been a part of the human noetic social condition, and it is almost or possibly exclusively always connected with parasitical systems of grift.</w:t>
       </w:r>
     </w:p>
     <w:p>

</xml_diff>

<commit_message>
auto articles article 2 test3
</commit_message>
<xml_diff>
--- a/completePDF/Meritocratic Republic of Canada.docx
+++ b/completePDF/Meritocratic Republic of Canada.docx
@@ -927,7 +927,7 @@
                 <w:noProof/>
                 <w:webHidden/>
               </w:rPr>
-              <w:t>15</w:t>
+              <w:t>14</w:t>
             </w:r>
             <w:r>
               <w:rPr>
@@ -1000,7 +1000,7 @@
                 <w:noProof/>
                 <w:webHidden/>
               </w:rPr>
-              <w:t>16</w:t>
+              <w:t>15</w:t>
             </w:r>
             <w:r>
               <w:rPr>
@@ -1073,7 +1073,7 @@
                 <w:noProof/>
                 <w:webHidden/>
               </w:rPr>
-              <w:t>22</w:t>
+              <w:t>20</w:t>
             </w:r>
             <w:r>
               <w:rPr>
@@ -1146,7 +1146,7 @@
                 <w:noProof/>
                 <w:webHidden/>
               </w:rPr>
-              <w:t>29</w:t>
+              <w:t>27</w:t>
             </w:r>
             <w:r>
               <w:rPr>
@@ -1219,7 +1219,7 @@
                 <w:noProof/>
                 <w:webHidden/>
               </w:rPr>
-              <w:t>34</w:t>
+              <w:t>32</w:t>
             </w:r>
             <w:r>
               <w:rPr>
@@ -1292,7 +1292,7 @@
                 <w:noProof/>
                 <w:webHidden/>
               </w:rPr>
-              <w:t>40</w:t>
+              <w:t>37</w:t>
             </w:r>
             <w:r>
               <w:rPr>
@@ -1365,7 +1365,7 @@
                 <w:noProof/>
                 <w:webHidden/>
               </w:rPr>
-              <w:t>46</w:t>
+              <w:t>43</w:t>
             </w:r>
             <w:r>
               <w:rPr>
@@ -1438,7 +1438,7 @@
                 <w:noProof/>
                 <w:webHidden/>
               </w:rPr>
-              <w:t>49</w:t>
+              <w:t>46</w:t>
             </w:r>
             <w:r>
               <w:rPr>
@@ -1511,7 +1511,7 @@
                 <w:noProof/>
                 <w:webHidden/>
               </w:rPr>
-              <w:t>53</w:t>
+              <w:t>49</w:t>
             </w:r>
             <w:r>
               <w:rPr>
@@ -1584,7 +1584,7 @@
                 <w:noProof/>
                 <w:webHidden/>
               </w:rPr>
-              <w:t>58</w:t>
+              <w:t>54</w:t>
             </w:r>
             <w:r>
               <w:rPr>
@@ -1657,7 +1657,7 @@
                 <w:noProof/>
                 <w:webHidden/>
               </w:rPr>
-              <w:t>70</w:t>
+              <w:t>65</w:t>
             </w:r>
             <w:r>
               <w:rPr>
@@ -1730,7 +1730,7 @@
                 <w:noProof/>
                 <w:webHidden/>
               </w:rPr>
-              <w:t>74</w:t>
+              <w:t>69</w:t>
             </w:r>
             <w:r>
               <w:rPr>
@@ -1803,7 +1803,7 @@
                 <w:noProof/>
                 <w:webHidden/>
               </w:rPr>
-              <w:t>79</w:t>
+              <w:t>73</w:t>
             </w:r>
             <w:r>
               <w:rPr>
@@ -1876,7 +1876,7 @@
                 <w:noProof/>
                 <w:webHidden/>
               </w:rPr>
-              <w:t>82</w:t>
+              <w:t>76</w:t>
             </w:r>
             <w:r>
               <w:rPr>
@@ -1949,7 +1949,7 @@
                 <w:noProof/>
                 <w:webHidden/>
               </w:rPr>
-              <w:t>88</w:t>
+              <w:t>82</w:t>
             </w:r>
             <w:r>
               <w:rPr>
@@ -2022,7 +2022,7 @@
                 <w:noProof/>
                 <w:webHidden/>
               </w:rPr>
-              <w:t>92</w:t>
+              <w:t>86</w:t>
             </w:r>
             <w:r>
               <w:rPr>
@@ -2095,7 +2095,7 @@
                 <w:noProof/>
                 <w:webHidden/>
               </w:rPr>
-              <w:t>98</w:t>
+              <w:t>92</w:t>
             </w:r>
             <w:r>
               <w:rPr>
@@ -2168,7 +2168,7 @@
                 <w:noProof/>
                 <w:webHidden/>
               </w:rPr>
-              <w:t>101</w:t>
+              <w:t>95</w:t>
             </w:r>
             <w:r>
               <w:rPr>
@@ -2241,7 +2241,7 @@
                 <w:noProof/>
                 <w:webHidden/>
               </w:rPr>
-              <w:t>109</w:t>
+              <w:t>103</w:t>
             </w:r>
             <w:r>
               <w:rPr>
@@ -2314,7 +2314,7 @@
                 <w:noProof/>
                 <w:webHidden/>
               </w:rPr>
-              <w:t>115</w:t>
+              <w:t>108</w:t>
             </w:r>
             <w:r>
               <w:rPr>
@@ -2387,7 +2387,7 @@
                 <w:noProof/>
                 <w:webHidden/>
               </w:rPr>
-              <w:t>119</w:t>
+              <w:t>112</w:t>
             </w:r>
             <w:r>
               <w:rPr>
@@ -2460,7 +2460,7 @@
                 <w:noProof/>
                 <w:webHidden/>
               </w:rPr>
-              <w:t>125</w:t>
+              <w:t>118</w:t>
             </w:r>
             <w:r>
               <w:rPr>
@@ -2533,7 +2533,7 @@
                 <w:noProof/>
                 <w:webHidden/>
               </w:rPr>
-              <w:t>130</w:t>
+              <w:t>123</w:t>
             </w:r>
             <w:r>
               <w:rPr>
@@ -2606,7 +2606,7 @@
                 <w:noProof/>
                 <w:webHidden/>
               </w:rPr>
-              <w:t>137</w:t>
+              <w:t>130</w:t>
             </w:r>
             <w:r>
               <w:rPr>
@@ -2679,7 +2679,7 @@
                 <w:noProof/>
                 <w:webHidden/>
               </w:rPr>
-              <w:t>142</w:t>
+              <w:t>135</w:t>
             </w:r>
             <w:r>
               <w:rPr>
@@ -2752,7 +2752,7 @@
                 <w:noProof/>
                 <w:webHidden/>
               </w:rPr>
-              <w:t>147</w:t>
+              <w:t>140</w:t>
             </w:r>
             <w:r>
               <w:rPr>
@@ -2825,7 +2825,7 @@
                 <w:noProof/>
                 <w:webHidden/>
               </w:rPr>
-              <w:t>153</w:t>
+              <w:t>146</w:t>
             </w:r>
             <w:r>
               <w:rPr>
@@ -2898,7 +2898,7 @@
                 <w:noProof/>
                 <w:webHidden/>
               </w:rPr>
-              <w:t>156</w:t>
+              <w:t>149</w:t>
             </w:r>
             <w:r>
               <w:rPr>
@@ -2971,7 +2971,7 @@
                 <w:noProof/>
                 <w:webHidden/>
               </w:rPr>
-              <w:t>160</w:t>
+              <w:t>153</w:t>
             </w:r>
             <w:r>
               <w:rPr>
@@ -3044,7 +3044,7 @@
                 <w:noProof/>
                 <w:webHidden/>
               </w:rPr>
-              <w:t>166</w:t>
+              <w:t>159</w:t>
             </w:r>
             <w:r>
               <w:rPr>
@@ -3117,7 +3117,7 @@
                 <w:noProof/>
                 <w:webHidden/>
               </w:rPr>
-              <w:t>171</w:t>
+              <w:t>163</w:t>
             </w:r>
             <w:r>
               <w:rPr>
@@ -3190,7 +3190,7 @@
                 <w:noProof/>
                 <w:webHidden/>
               </w:rPr>
-              <w:t>175</w:t>
+              <w:t>167</w:t>
             </w:r>
             <w:r>
               <w:rPr>
@@ -3263,7 +3263,7 @@
                 <w:noProof/>
                 <w:webHidden/>
               </w:rPr>
-              <w:t>179</w:t>
+              <w:t>171</w:t>
             </w:r>
             <w:r>
               <w:rPr>
@@ -3336,7 +3336,7 @@
                 <w:noProof/>
                 <w:webHidden/>
               </w:rPr>
-              <w:t>181</w:t>
+              <w:t>173</w:t>
             </w:r>
             <w:r>
               <w:rPr>
@@ -5795,7 +5795,7 @@
     </w:p>
     <w:p>
       <w:pPr>
-        <w:ind w:left="720" w:hanging="360"/>
+        <w:ind w:left="714" w:hanging="357"/>
       </w:pPr>
       <w:r>
         <w:t>d)</w:t>
@@ -6278,7 +6278,7 @@
     </w:p>
     <w:p>
       <w:pPr>
-        <w:ind w:left="1080" w:hanging="360"/>
+        <w:ind w:left="1077" w:hanging="357"/>
       </w:pPr>
       <w:r>
         <w:t>ii)</w:t>
@@ -6304,10 +6304,7 @@
         <w:ind w:left="360" w:hanging="360"/>
       </w:pPr>
       <w:r>
-        <w:t>3</w:t>
-      </w:r>
-      <w:r>
-        <w:t>.</w:t>
+        <w:t>3.</w:t>
       </w:r>
       <w:r>
         <w:tab/>
@@ -10963,7 +10960,6 @@
     </w:p>
     <w:p>
       <w:r>
-        <w:lastRenderedPageBreak/>
         <w:t xml:space="preserve">Precis: </w:t>
       </w:r>
     </w:p>
@@ -11013,11 +11009,7 @@
         <w:t xml:space="preserve">, </w:t>
       </w:r>
       <w:r>
-        <w:t xml:space="preserve">while preserving the European heritage of self-reliant citizenry capable of meeting existential threats without surrendering liberty. Meritocratic </w:t>
-      </w:r>
-      <w:r>
-        <w:lastRenderedPageBreak/>
-        <w:t>governance demands that power remain transparent, temporally bounded, and accountable, ensuring excellence prevails over panic and that posterity inherits a nation where freedom is never negotiable, even amid catastrophe.</w:t>
+        <w:t>while preserving the European heritage of self-reliant citizenry capable of meeting existential threats without surrendering liberty. Meritocratic governance demands that power remain transparent, temporally bounded, and accountable, ensuring excellence prevails over panic and that posterity inherits a nation where freedom is never negotiable, even amid catastrophe.</w:t>
       </w:r>
     </w:p>
     <w:p>
@@ -11040,7 +11032,6 @@
       <w:bookmarkStart w:id="104" w:name="_Toc215665043"/>
       <w:bookmarkStart w:id="105" w:name="_Toc229835216"/>
       <w:r>
-        <w:lastRenderedPageBreak/>
         <w:t xml:space="preserve">Article </w:t>
       </w:r>
       <w:r>
@@ -11169,7 +11160,6 @@
     </w:p>
     <w:p>
       <w:r>
-        <w:lastRenderedPageBreak/>
         <w:t xml:space="preserve">Precis: </w:t>
       </w:r>
     </w:p>
@@ -11209,11 +11199,7 @@
     </w:p>
     <w:p>
       <w:r>
-        <w:t xml:space="preserve">Moreover, by granting the unqualified right to binding referenda, Article 12 democratizes decision-making in a direct, unfiltered manner, safeguarding against legislative gridlock or judicial activism that could stifle innovation or impose unwanted changes in an era of rapid technological advancement. This tool prevents crimes like policy capture by special interests or the imposition of harmful agendas under the guise of expertise, as evidenced by past global events where populations were sidelined on issues of sovereignty and identity. </w:t>
-      </w:r>
-      <w:r>
-        <w:lastRenderedPageBreak/>
-        <w:t>In preserving these avenues for popular expression, the Article ensures that the Republic remains a bastion of human freedom, allowing the meritocratic posterity of European founders to shape their destiny without intermediaries diluting their voice.</w:t>
+        <w:t>Moreover, by granting the unqualified right to binding referenda, Article 12 democratizes decision-making in a direct, unfiltered manner, safeguarding against legislative gridlock or judicial activism that could stifle innovation or impose unwanted changes in an era of rapid technological advancement. This tool prevents crimes like policy capture by special interests or the imposition of harmful agendas under the guise of expertise, as evidenced by past global events where populations were sidelined on issues of sovereignty and identity. In preserving these avenues for popular expression, the Article ensures that the Republic remains a bastion of human freedom, allowing the meritocratic posterity of European founders to shape their destiny without intermediaries diluting their voice.</w:t>
       </w:r>
     </w:p>
     <w:p/>
@@ -11238,7 +11224,6 @@
       <w:bookmarkStart w:id="107" w:name="_Toc215665044"/>
       <w:bookmarkStart w:id="108" w:name="_Toc229835217"/>
       <w:r>
-        <w:lastRenderedPageBreak/>
         <w:t xml:space="preserve">Article </w:t>
       </w:r>
       <w:r>
@@ -11330,11 +11315,11 @@
         <w:tab/>
       </w:r>
       <w:r>
-        <w:t xml:space="preserve">No corporate entity, special interest group, foreign actor, or non-citizen may provide any form of donation, funding, endorsement, or in-kind support to any candidate or campaign. Violations incur immediate </w:t>
+        <w:t xml:space="preserve">No corporate entity, special interest group, foreign actor, or non-citizen may provide any form of donation, funding, endorsement, or in-kind support to any candidate or campaign. Violations incur immediate disqualification, fines up to ten times the violation amount payable to the sovereign wealth fund, and potential criminal charges for fraud. Candidates </w:t>
       </w:r>
       <w:r>
         <w:lastRenderedPageBreak/>
-        <w:t>disqualification, fines up to ten times the violation amount payable to the sovereign wealth fund, and potential criminal charges for fraud. Candidates may self-fund personal expenses only up to twice the national median wage per election cycle; all expenditures must be publicly disclosed in real time.</w:t>
+        <w:t>may self-fund personal expenses only up to twice the national median wage per election cycle; all expenditures must be publicly disclosed in real time.</w:t>
       </w:r>
     </w:p>
     <w:p>
@@ -11454,42 +11439,45 @@
         <w:ind w:left="720" w:hanging="360"/>
       </w:pPr>
       <w:r>
+        <w:t>e)</w:t>
+      </w:r>
+      <w:r>
+        <w:tab/>
+      </w:r>
+      <w:r>
+        <w:t>may dissolve the House and call early elections once per term if the budget or supply bill fails twice. The Prime Minister may not introduce legislation or vote in the House.</w:t>
+      </w:r>
+    </w:p>
+    <w:p>
+      <w:pPr>
+        <w:ind w:left="360" w:hanging="360"/>
+      </w:pPr>
+      <w:r>
+        <w:t>10)</w:t>
+      </w:r>
+      <w:r>
+        <w:tab/>
+      </w:r>
+      <w:r>
+        <w:t>Any minister may be removed by a simple majority vote of no confidence on a motion that names the minister personally. The Prime Minister must dismiss that minister within 48 hours.</w:t>
+      </w:r>
+    </w:p>
+    <w:p>
+      <w:pPr>
+        <w:ind w:left="360" w:hanging="360"/>
+      </w:pPr>
+      <w:r>
+        <w:t>11)</w:t>
+      </w:r>
+      <w:r>
+        <w:tab/>
+      </w:r>
+      <w:r>
+        <w:t xml:space="preserve">The House may remove the Prime Minister by a constructive vote of no confidence: a three-quarters majority that simultaneously names a </w:t>
+      </w:r>
+      <w:r>
         <w:lastRenderedPageBreak/>
-        <w:t>e)</w:t>
-      </w:r>
-      <w:r>
-        <w:tab/>
-      </w:r>
-      <w:r>
-        <w:t>may dissolve the House and call early elections once per term if the budget or supply bill fails twice. The Prime Minister may not introduce legislation or vote in the House.</w:t>
-      </w:r>
-    </w:p>
-    <w:p>
-      <w:pPr>
-        <w:ind w:left="360" w:hanging="360"/>
-      </w:pPr>
-      <w:r>
-        <w:t>10)</w:t>
-      </w:r>
-      <w:r>
-        <w:tab/>
-      </w:r>
-      <w:r>
-        <w:t>Any minister may be removed by a simple majority vote of no confidence on a motion that names the minister personally. The Prime Minister must dismiss that minister within 48 hours.</w:t>
-      </w:r>
-    </w:p>
-    <w:p>
-      <w:pPr>
-        <w:ind w:left="360" w:hanging="360"/>
-      </w:pPr>
-      <w:r>
-        <w:t>11)</w:t>
-      </w:r>
-      <w:r>
-        <w:tab/>
-      </w:r>
-      <w:r>
-        <w:t>The House may remove the Prime Minister by a constructive vote of no confidence: a three-quarters majority that simultaneously names a replacement Prime Minister who is immediately sworn in. This power may be used only once per term.</w:t>
+        <w:t>replacement Prime Minister who is immediately sworn in. This power may be used only once per term.</w:t>
       </w:r>
     </w:p>
     <w:p>
@@ -11531,14 +11519,135 @@
         <w:tab/>
       </w:r>
       <w:r>
-        <w:t xml:space="preserve">Question Period is abolished in its current theatrical form. Instead, every Wednesday the Prime Minister and every minister shall appear in person before the House for a maximum of three hours of direct, unscripted questioning by any member. Questions are limited to two minutes; answers </w:t>
+        <w:t xml:space="preserve">Question Period is abolished in its current theatrical form. Instead, every Wednesday the Prime Minister and every minister shall appear in person before the House for a maximum of three hours of direct, unscripted questioning by any member. Questions are limited to two minutes; answers to four minutes. No points of order, no props, no applause, no prepared talking points. </w:t>
+      </w:r>
+      <w:r>
+        <w:t>Sessions are live-streamed and permanently archived.</w:t>
+      </w:r>
+      <w:r>
+        <w:t xml:space="preserve"> </w:t>
+      </w:r>
+    </w:p>
+    <w:p>
+      <w:pPr>
+        <w:ind w:left="360" w:hanging="360"/>
+      </w:pPr>
+      <w:r>
+        <w:t>15)</w:t>
+      </w:r>
+      <w:r>
+        <w:tab/>
+      </w:r>
+      <w:r>
+        <w:t>The Speaker of the House is elected by the members at the opening of each new House cohort cycle and serves for six years. The Speaker may not be removed except by a two-thirds vote for cause. The Speaker’s role is time-keeping and enforcing decorum. Members shall conduct themselves professionally at all times, focusing on substantive issues, facts, and policy matters. Decorum violations include, but are not limited to, personal insults, innuendo, character assassination, deliberate falsehoods, lies by omission, or any disruptive behavior that undermines meritocratic</w:t>
+      </w:r>
+      <w:r>
+        <w:t xml:space="preserve">, professional, civil, </w:t>
+      </w:r>
+      <w:r>
+        <w:t>or</w:t>
+      </w:r>
+      <w:r>
+        <w:t xml:space="preserve"> </w:t>
+      </w:r>
+      <w:r>
+        <w:t>rational</w:t>
+      </w:r>
+      <w:r>
+        <w:t xml:space="preserve"> discourse. The Speaker shall have the </w:t>
       </w:r>
       <w:r>
         <w:lastRenderedPageBreak/>
-        <w:t xml:space="preserve">to four minutes. No points of order, no props, no applause, no prepared talking points. </w:t>
-      </w:r>
-      <w:r>
-        <w:t>Sessions are live-streamed and permanently archived.</w:t>
+        <w:t xml:space="preserve">authority to enforce decorum by the following measures, applied progressively: </w:t>
+      </w:r>
+    </w:p>
+    <w:p>
+      <w:pPr>
+        <w:ind w:left="1080" w:hanging="360"/>
+      </w:pPr>
+      <w:r>
+        <w:t>i)</w:t>
+      </w:r>
+      <w:r>
+        <w:tab/>
+      </w:r>
+      <w:r>
+        <w:t xml:space="preserve">verbal warning; </w:t>
+      </w:r>
+    </w:p>
+    <w:p>
+      <w:pPr>
+        <w:ind w:left="1080" w:hanging="360"/>
+      </w:pPr>
+      <w:r>
+        <w:t>ii)</w:t>
+      </w:r>
+      <w:r>
+        <w:tab/>
+      </w:r>
+      <w:r>
+        <w:t xml:space="preserve">deduction of the member’s remaining question or answer time in that session; </w:t>
+      </w:r>
+    </w:p>
+    <w:p>
+      <w:pPr>
+        <w:ind w:left="1080" w:hanging="360"/>
+      </w:pPr>
+      <w:r>
+        <w:t>iii)</w:t>
+      </w:r>
+      <w:r>
+        <w:tab/>
+      </w:r>
+      <w:r>
+        <w:t xml:space="preserve">temporary expulsion from the chamber for the remainder of the day’s sitting; </w:t>
+      </w:r>
+    </w:p>
+    <w:p>
+      <w:pPr>
+        <w:ind w:left="1080" w:hanging="360"/>
+      </w:pPr>
+      <w:r>
+        <w:t>iv)</w:t>
+      </w:r>
+      <w:r>
+        <w:tab/>
+      </w:r>
+      <w:r>
+        <w:t xml:space="preserve">in cases of repeated or egregious violation, suspension of the member’s right to pose questions for up to four consecutive Wednesdays. </w:t>
+      </w:r>
+    </w:p>
+    <w:p>
+      <w:r>
+        <w:t>All disciplinary actions shall be recorded in the minutes and published immediately. Appeals against the Speaker’s ruling may be made to the full House, but only by written motion requiring a two-thirds vote to overturn.</w:t>
+      </w:r>
+    </w:p>
+    <w:p>
+      <w:pPr>
+        <w:ind w:left="360" w:hanging="360"/>
+      </w:pPr>
+      <w:r>
+        <w:t>16)</w:t>
+      </w:r>
+      <w:r>
+        <w:tab/>
+      </w:r>
+      <w:r>
+        <w:t>All votes in the House are recorded by name and published within one hour. There is no secret ballot for any legislative matter.</w:t>
+      </w:r>
+    </w:p>
+    <w:p>
+      <w:pPr>
+        <w:ind w:left="360" w:hanging="360"/>
+      </w:pPr>
+      <w:r>
+        <w:t>17)</w:t>
+      </w:r>
+      <w:r>
+        <w:tab/>
+      </w:r>
+      <w:r>
+        <w:t>Members of the House may not serve simultaneously as ministers or as provincial legislators. Members receive a salary fixed at twice the national median wage and are subject to immediate recall by petition of ten percent of their riding’s electors.</w:t>
       </w:r>
       <w:r>
         <w:t xml:space="preserve"> </w:t>
@@ -11549,204 +11658,83 @@
         <w:ind w:left="360" w:hanging="360"/>
       </w:pPr>
       <w:r>
-        <w:t>15)</w:t>
-      </w:r>
-      <w:r>
-        <w:tab/>
-      </w:r>
-      <w:r>
-        <w:t>The Speaker of the House is elected by the members at the opening of each new House cohort cycle and serves for six years. The Speaker may not be removed except by a two-thirds vote for cause. The Speaker’s role is time-keeping and enforcing decorum. Members shall conduct themselves professionally at all times, focusing on substantive issues, facts, and policy matters. Decorum violations include, but are not limited to, personal insults, innuendo, character assassination, deliberate falsehoods, lies by omission, or any disruptive behavior that undermines meritocratic</w:t>
-      </w:r>
-      <w:r>
-        <w:t xml:space="preserve">, professional, civil, </w:t>
-      </w:r>
-      <w:r>
-        <w:t>or</w:t>
-      </w:r>
-      <w:r>
-        <w:t xml:space="preserve"> </w:t>
-      </w:r>
-      <w:r>
-        <w:t>rational</w:t>
-      </w:r>
-      <w:r>
-        <w:t xml:space="preserve"> discourse. The Speaker shall have the authority to enforce decorum by the following measures, applied progressively: </w:t>
-      </w:r>
-    </w:p>
-    <w:p>
-      <w:pPr>
-        <w:ind w:left="1080" w:hanging="360"/>
-      </w:pPr>
-      <w:r>
-        <w:t>i)</w:t>
-      </w:r>
-      <w:r>
-        <w:tab/>
-      </w:r>
-      <w:r>
-        <w:t xml:space="preserve">verbal warning; </w:t>
-      </w:r>
-    </w:p>
-    <w:p>
-      <w:pPr>
-        <w:ind w:left="1080" w:hanging="360"/>
-      </w:pPr>
-      <w:r>
-        <w:t>ii)</w:t>
-      </w:r>
-      <w:r>
-        <w:tab/>
-      </w:r>
-      <w:r>
-        <w:t xml:space="preserve">deduction of the member’s remaining question or answer time in that session; </w:t>
-      </w:r>
-    </w:p>
-    <w:p>
-      <w:pPr>
-        <w:ind w:left="1080" w:hanging="360"/>
-      </w:pPr>
-      <w:r>
-        <w:t>iii)</w:t>
-      </w:r>
-      <w:r>
-        <w:tab/>
-      </w:r>
-      <w:r>
-        <w:t xml:space="preserve">temporary expulsion from the chamber for the remainder of the day’s sitting; </w:t>
-      </w:r>
-    </w:p>
-    <w:p>
-      <w:pPr>
-        <w:ind w:left="1080" w:hanging="360"/>
-      </w:pPr>
-      <w:r>
-        <w:t>iv)</w:t>
-      </w:r>
-      <w:r>
-        <w:tab/>
-      </w:r>
-      <w:r>
-        <w:t xml:space="preserve">in cases of repeated or egregious violation, suspension of the member’s right to pose questions for up to four consecutive Wednesdays. </w:t>
-      </w:r>
-    </w:p>
-    <w:p>
-      <w:r>
-        <w:t>All disciplinary actions shall be recorded in the minutes and published immediately. Appeals against the Speaker’s ruling may be made to the full House, but only by written motion requiring a two-thirds vote to overturn.</w:t>
-      </w:r>
-    </w:p>
-    <w:p>
-      <w:pPr>
-        <w:ind w:left="360" w:hanging="360"/>
-      </w:pPr>
-      <w:r>
-        <w:t>16)</w:t>
-      </w:r>
-      <w:r>
-        <w:tab/>
-      </w:r>
-      <w:r>
-        <w:t>All votes in the House are recorded by name and published within one hour. There is no secret ballot for any legislative matter.</w:t>
-      </w:r>
-    </w:p>
-    <w:p>
-      <w:pPr>
-        <w:ind w:left="360" w:hanging="360"/>
-      </w:pPr>
-      <w:r>
-        <w:t>17)</w:t>
-      </w:r>
-      <w:r>
-        <w:tab/>
-      </w:r>
-      <w:r>
-        <w:t>Members of the House may not serve simultaneously as ministers or as provincial legislators. Members receive a salary fixed at twice the national median wage and are subject to immediate recall by petition of ten percent of their riding’s electors.</w:t>
-      </w:r>
-      <w:r>
-        <w:t xml:space="preserve"> </w:t>
-      </w:r>
-    </w:p>
-    <w:p>
-      <w:pPr>
-        <w:ind w:left="360" w:hanging="360"/>
+        <w:t>18)</w:t>
+      </w:r>
+      <w:r>
+        <w:tab/>
+      </w:r>
+      <w:r>
+        <w:t>The provinces retain exclusive jurisdiction over education, health, municipal institutions, property and civil rights, natural resources within their boundaries, and all matters of a purely local or private nature. All residual powers belong to the national government. No concurrent powers exist except where explicitly stated in this Constitution.</w:t>
+      </w:r>
+    </w:p>
+    <w:p>
+      <w:pPr>
+        <w:ind w:left="360" w:hanging="360"/>
+      </w:pPr>
+      <w:r>
+        <w:t>19)</w:t>
+      </w:r>
+      <w:r>
+        <w:tab/>
+      </w:r>
+      <w:r>
+        <w:t>All other rules and procedures for the consideration and enactment of legislation shall be determined by the House of the Republic in standing orders adopted and amendable by simple majority vote of its members.</w:t>
+      </w:r>
+    </w:p>
+    <w:p>
+      <w:pPr>
+        <w:ind w:left="360" w:hanging="360"/>
+      </w:pPr>
+      <w:r>
+        <w:t>20)</w:t>
+      </w:r>
+      <w:r>
+        <w:tab/>
+      </w:r>
+      <w:r>
+        <w:t xml:space="preserve">Legislative Clarity </w:t>
+      </w:r>
+    </w:p>
+    <w:p>
+      <w:pPr>
+        <w:ind w:left="720" w:hanging="360"/>
+      </w:pPr>
+      <w:r>
+        <w:t>a)</w:t>
+      </w:r>
+      <w:r>
+        <w:tab/>
+      </w:r>
+      <w:r>
+        <w:t xml:space="preserve">Every bill or resolution introduced in the House shall embrace but a single subject, which shall be clearly and accurately expressed in its title. </w:t>
+      </w:r>
+    </w:p>
+    <w:p>
+      <w:pPr>
+        <w:ind w:left="720" w:hanging="360"/>
+      </w:pPr>
+      <w:r>
+        <w:t>b)</w:t>
+      </w:r>
+      <w:r>
+        <w:tab/>
+      </w:r>
+      <w:r>
+        <w:t xml:space="preserve">Immediately following the title, each bill shall contain a Statement of Purpose consisting of </w:t>
+      </w:r>
+      <w:r>
+        <w:t>several</w:t>
+      </w:r>
+      <w:r>
+        <w:t xml:space="preserve"> plain-language sentences that fully and honestly describe its intended effect. </w:t>
+      </w:r>
+    </w:p>
+    <w:p>
+      <w:pPr>
+        <w:ind w:left="720" w:hanging="360"/>
       </w:pPr>
       <w:r>
         <w:lastRenderedPageBreak/>
-        <w:t>18)</w:t>
-      </w:r>
-      <w:r>
-        <w:tab/>
-      </w:r>
-      <w:r>
-        <w:t>The provinces retain exclusive jurisdiction over education, health, municipal institutions, property and civil rights, natural resources within their boundaries, and all matters of a purely local or private nature. All residual powers belong to the national government. No concurrent powers exist except where explicitly stated in this Constitution.</w:t>
-      </w:r>
-    </w:p>
-    <w:p>
-      <w:pPr>
-        <w:ind w:left="360" w:hanging="360"/>
-      </w:pPr>
-      <w:r>
-        <w:t>19)</w:t>
-      </w:r>
-      <w:r>
-        <w:tab/>
-      </w:r>
-      <w:r>
-        <w:t>All other rules and procedures for the consideration and enactment of legislation shall be determined by the House of the Republic in standing orders adopted and amendable by simple majority vote of its members.</w:t>
-      </w:r>
-    </w:p>
-    <w:p>
-      <w:pPr>
-        <w:ind w:left="360" w:hanging="360"/>
-      </w:pPr>
-      <w:r>
-        <w:t>20)</w:t>
-      </w:r>
-      <w:r>
-        <w:tab/>
-      </w:r>
-      <w:r>
-        <w:t xml:space="preserve">Legislative Clarity </w:t>
-      </w:r>
-    </w:p>
-    <w:p>
-      <w:pPr>
-        <w:ind w:left="720" w:hanging="360"/>
-      </w:pPr>
-      <w:r>
-        <w:t>a)</w:t>
-      </w:r>
-      <w:r>
-        <w:tab/>
-      </w:r>
-      <w:r>
-        <w:t xml:space="preserve">Every bill or resolution introduced in the House shall embrace but a single subject, which shall be clearly and accurately expressed in its title. </w:t>
-      </w:r>
-    </w:p>
-    <w:p>
-      <w:pPr>
-        <w:ind w:left="720" w:hanging="360"/>
-      </w:pPr>
-      <w:r>
-        <w:t>b)</w:t>
-      </w:r>
-      <w:r>
-        <w:tab/>
-      </w:r>
-      <w:r>
-        <w:t xml:space="preserve">Immediately following the title, each bill shall contain a Statement of Purpose consisting of </w:t>
-      </w:r>
-      <w:r>
-        <w:t>several</w:t>
-      </w:r>
-      <w:r>
-        <w:t xml:space="preserve"> plain-language sentences that fully and honestly describe its intended effect. </w:t>
-      </w:r>
-    </w:p>
-    <w:p>
-      <w:pPr>
-        <w:ind w:left="720" w:hanging="360"/>
-      </w:pPr>
-      <w:r>
         <w:t>c)</w:t>
       </w:r>
       <w:r>
@@ -12026,14 +12014,17 @@
         <w:ind w:left="360" w:hanging="360"/>
       </w:pPr>
       <w:r>
+        <w:t>5.</w:t>
+      </w:r>
+      <w:r>
+        <w:tab/>
+      </w:r>
+      <w:r>
+        <w:t xml:space="preserve">No person may be appointed or elected to public office or the judiciary who has ever been convicted of any criminal offence involving moral turpitude, sexual offence, fraud, embezzlement, perjury, or treason. Discovery of any such conviction or of undisclosed offences after </w:t>
+      </w:r>
+      <w:r>
         <w:lastRenderedPageBreak/>
-        <w:t>5.</w:t>
-      </w:r>
-      <w:r>
-        <w:tab/>
-      </w:r>
-      <w:r>
-        <w:t>No person may be appointed or elected to public office or the judiciary who has ever been convicted of any criminal offence involving moral turpitude, sexual offence, fraud, embezzlement, perjury, or treason. Discovery of any such conviction or of undisclosed offences after appointment shall result in immediate removal and permanent disqualification</w:t>
+        <w:t>appointment shall result in immediate removal and permanent disqualification</w:t>
       </w:r>
       <w:r>
         <w:t xml:space="preserve"> from any</w:t>
@@ -12189,42 +12180,45 @@
         <w:ind w:left="720" w:hanging="360"/>
       </w:pPr>
       <w:r>
+        <w:t>b)</w:t>
+      </w:r>
+      <w:r>
+        <w:tab/>
+      </w:r>
+      <w:r>
+        <w:t>Anonymous or unsworn accusations shall be dismissed out of hand and may subject the source, if discovered, to the same penalties.</w:t>
+      </w:r>
+    </w:p>
+    <w:p>
+      <w:pPr>
+        <w:ind w:left="720" w:hanging="360"/>
+      </w:pPr>
+      <w:r>
+        <w:t>c)</w:t>
+      </w:r>
+      <w:r>
+        <w:tab/>
+      </w:r>
+      <w:r>
+        <w:t>Until conviction by unanimous jury verdict beyond reasonable doubt, the accused retains all office, salary, and presumption of innocence; no suspension, gag order, or media blackout may be imposed.</w:t>
+      </w:r>
+    </w:p>
+    <w:p>
+      <w:pPr>
+        <w:ind w:left="360" w:hanging="360"/>
+      </w:pPr>
+      <w:r>
+        <w:t>10.</w:t>
+      </w:r>
+      <w:r>
+        <w:tab/>
+      </w:r>
+      <w:r>
+        <w:t xml:space="preserve">Any elected or appointed official who knowingly makes a false statement of material fact to the public or the House concerning policy, qualifications, past conduct, or the state of the nation, with intent to </w:t>
+      </w:r>
+      <w:r>
         <w:lastRenderedPageBreak/>
-        <w:t>b)</w:t>
-      </w:r>
-      <w:r>
-        <w:tab/>
-      </w:r>
-      <w:r>
-        <w:t>Anonymous or unsworn accusations shall be dismissed out of hand and may subject the source, if discovered, to the same penalties.</w:t>
-      </w:r>
-    </w:p>
-    <w:p>
-      <w:pPr>
-        <w:ind w:left="720" w:hanging="360"/>
-      </w:pPr>
-      <w:r>
-        <w:t>c)</w:t>
-      </w:r>
-      <w:r>
-        <w:tab/>
-      </w:r>
-      <w:r>
-        <w:t>Until conviction by unanimous jury verdict beyond reasonable doubt, the accused retains all office, salary, and presumption of innocence; no suspension, gag order, or media blackout may be imposed.</w:t>
-      </w:r>
-    </w:p>
-    <w:p>
-      <w:pPr>
-        <w:ind w:left="360" w:hanging="360"/>
-      </w:pPr>
-      <w:r>
-        <w:t>10.</w:t>
-      </w:r>
-      <w:r>
-        <w:tab/>
-      </w:r>
-      <w:r>
-        <w:t>Any elected or appointed official who knowingly makes a false statement of material fact to the public or the House concerning policy, qualifications, past conduct, or the state of the nation, with intent to deceive the electors or induce legislative action, commits the offence of Public Deception, punishable by immediate removal from office, permanent disqualification from public trust, and imprisonment for not less than five years.</w:t>
+        <w:t>deceive the electors or induce legislative action, commits the offence of Public Deception, punishable by immediate removal from office, permanent disqualification from public trust, and imprisonment for not less than five years.</w:t>
       </w:r>
     </w:p>
     <w:p>
@@ -12477,204 +12471,7 @@
         <w:pStyle w:val="ListParagraph"/>
       </w:pPr>
       <w:r>
-        <w:lastRenderedPageBreak/>
         <w:t>Provincial superior court judges serve until mandatory retirement at age 75. Removal occurs only by a two-thirds vote of the provincial legislature for proven misbehaviour or incapacity.</w:t>
-      </w:r>
-    </w:p>
-    <w:p>
-      <w:pPr>
-        <w:ind w:left="720" w:hanging="360"/>
-      </w:pPr>
-      <w:r>
-        <w:t>c)</w:t>
-      </w:r>
-      <w:r>
-        <w:tab/>
-      </w:r>
-      <w:r>
-        <w:t xml:space="preserve">Members of the Judicial Appointments Commissions, whether federal or provincial, who serve in their capacity as senior judges or as members of the House or provincial legislature, receive no additional compensation beyond their existing salaries. Citizen members selected by lot receive full reimbursement of any wages lost during the period of service, plus a daily honorarium equal to twice the national median daily wage. Each commission convenes only for the time required to evaluate candidates and produce the mandated shortlist for the vacancy or vacancies under consideration, </w:t>
-      </w:r>
-      <w:r>
-        <w:t>never to exceed four weeks</w:t>
-      </w:r>
-      <w:r>
-        <w:t>.</w:t>
-      </w:r>
-      <w:r>
-        <w:t xml:space="preserve"> </w:t>
-      </w:r>
-    </w:p>
-    <w:p>
-      <w:pPr>
-        <w:ind w:left="360" w:hanging="360"/>
-      </w:pPr>
-      <w:r>
-        <w:t>5.</w:t>
-      </w:r>
-      <w:r>
-        <w:tab/>
-      </w:r>
-      <w:r>
-        <w:t xml:space="preserve">Any judge, parole board member, prosecutor, or official who orders or facilitates the early release (or imposes manifestly inadequate sentence) on a violent offender who then reoffends shall themselves be prosecuted as an accessory before the fact and imprisoned for a term no less than that of the subsequent crime.  </w:t>
-      </w:r>
-    </w:p>
-    <w:p>
-      <w:pPr>
-        <w:ind w:left="360" w:hanging="360"/>
-      </w:pPr>
-      <w:r>
-        <w:t>6.</w:t>
-      </w:r>
-      <w:r>
-        <w:tab/>
-      </w:r>
-      <w:r>
-        <w:t>The death penalty is restored for premeditated murder, child rape, child trafficking, child sexual abuse, possession of child sexual abuse material (CSAM),</w:t>
-      </w:r>
-      <w:r>
-        <w:t xml:space="preserve"> rape,</w:t>
-      </w:r>
-      <w:r>
-        <w:t xml:space="preserve"> high treason, and for extreme, provably intentional financial, medical, religious, scientific or any other fraud that directly causes widespread death or irreversible ruin, upon unanimous jury verdict beyond reasonable doubt. Any person who makes a false accusation of any of these offences with premeditated intent to deceive or to cause harm shall, upon unanimous jury verdict proving that intent beyond reasonable doubt, suffer the exact same penalty that would have applied to the accused.</w:t>
-      </w:r>
-    </w:p>
-    <w:p>
-      <w:pPr>
-        <w:ind w:left="360" w:hanging="360"/>
-      </w:pPr>
-      <w:r>
-        <w:t>7.</w:t>
-      </w:r>
-      <w:r>
-        <w:tab/>
-      </w:r>
-      <w:r>
-        <w:t>All executions shall be carried out solely by firing squad with hand-held lethal arms within seven days of final sentencing. For convictions of child trafficking, child sexual abuse, or possession of child sexual abuse materia</w:t>
-      </w:r>
-      <w:r>
-        <w:t>l,</w:t>
-      </w:r>
-      <w:r>
-        <w:t xml:space="preserve"> the timeline is mandatory and non-extendable.</w:t>
-      </w:r>
-    </w:p>
-    <w:p>
-      <w:pPr>
-        <w:ind w:left="360" w:hanging="360"/>
-      </w:pPr>
-      <w:r>
-        <w:lastRenderedPageBreak/>
-        <w:t>8.</w:t>
-      </w:r>
-      <w:r>
-        <w:tab/>
-      </w:r>
-      <w:r>
-        <w:t xml:space="preserve">The criminal justice system of the Republic exists first to protect the innocent and second to restore the offender to lawful life wherever this is compatible with public safety. </w:t>
-      </w:r>
-    </w:p>
-    <w:p>
-      <w:pPr>
-        <w:ind w:left="720" w:hanging="360"/>
-      </w:pPr>
-      <w:r>
-        <w:t>a)</w:t>
-      </w:r>
-      <w:r>
-        <w:tab/>
-      </w:r>
-      <w:r>
-        <w:t xml:space="preserve">Every person sentenced to imprisonment shall be offered intensive, evidence-based rehabilitation programmes (psychological, educational, vocational, moral, and, where appropriate, medical or pharmacological) chosen solely for proven efficacy in reducing recidivism. The state has a constitutional duty to research, develop, and implement the most effective methods available, without ideological preference or prohibition. </w:t>
-      </w:r>
-    </w:p>
-    <w:p>
-      <w:pPr>
-        <w:ind w:left="720" w:hanging="360"/>
-      </w:pPr>
-      <w:r>
-        <w:t>b)</w:t>
-      </w:r>
-      <w:r>
-        <w:tab/>
-      </w:r>
-      <w:r>
-        <w:t xml:space="preserve">For offenders convicted of premeditated murder, child rape, or high treason, rehabilitation may be attempted only under the strictest conditions of permanent physical isolation from the general population and from any position of trust or authority. </w:t>
-      </w:r>
-    </w:p>
-    <w:p>
-      <w:pPr>
-        <w:ind w:left="720" w:hanging="360"/>
-      </w:pPr>
-      <w:r>
-        <w:t>c)</w:t>
-      </w:r>
-      <w:r>
-        <w:tab/>
-      </w:r>
-      <w:r>
-        <w:t xml:space="preserve">The death penalty or irrevocable life imprisonment without parole remains mandatory when a special Rehabilitation Review Board (composed of three senior judges, three forensic psychologists, and three citizen members chosen by lot) unanimously determines, after no fewer than seven years of observed behaviour and treatment, that the offender remains an incurable danger to human life. Such determination must be reviewed and reaffirmed every five years thereafter. </w:t>
-      </w:r>
-    </w:p>
-    <w:p>
-      <w:pPr>
-        <w:ind w:left="720" w:hanging="360"/>
-      </w:pPr>
-      <w:r>
-        <w:t>d)</w:t>
-      </w:r>
-      <w:r>
-        <w:tab/>
-      </w:r>
-      <w:r>
-        <w:t>No offender may ever be released if there exists any reasonable doubt about public safety. The protection of the innocent is the supreme law.</w:t>
-      </w:r>
-    </w:p>
-    <w:p>
-      <w:pPr>
-        <w:ind w:left="360" w:hanging="360"/>
-      </w:pPr>
-      <w:r>
-        <w:t>9.</w:t>
-      </w:r>
-      <w:r>
-        <w:tab/>
-      </w:r>
-      <w:r>
-        <w:t>Swift Justice for Child Crimes</w:t>
-      </w:r>
-    </w:p>
-    <w:p>
-      <w:pPr>
-        <w:ind w:left="720" w:hanging="360"/>
-      </w:pPr>
-      <w:r>
-        <w:t>a)</w:t>
-      </w:r>
-      <w:r>
-        <w:tab/>
-      </w:r>
-      <w:r>
-        <w:t xml:space="preserve">Any person arrested for child trafficking, child sexual abuse, or possession of child sexual abuse material </w:t>
-      </w:r>
-      <w:r>
-        <w:t>on</w:t>
-      </w:r>
-      <w:r>
-        <w:t xml:space="preserve"> substantial evidence shall be denied bail and held in solitary confinement pending trial.</w:t>
-      </w:r>
-    </w:p>
-    <w:p>
-      <w:pPr>
-        <w:ind w:left="720" w:hanging="360"/>
-      </w:pPr>
-      <w:r>
-        <w:t>b)</w:t>
-      </w:r>
-      <w:r>
-        <w:tab/>
-      </w:r>
-      <w:r>
-        <w:t>Trial shall begin no later than thirty days after arrest and conclude no later than sixty days after arrest.</w:t>
       </w:r>
     </w:p>
     <w:p>
@@ -12689,6 +12486,205 @@
         <w:tab/>
       </w:r>
       <w:r>
+        <w:t xml:space="preserve">Members of the Judicial Appointments Commissions, whether federal or provincial, who serve in their capacity as senior judges or as members of the House or provincial legislature, receive no additional compensation beyond their existing salaries. Citizen members selected by lot receive full reimbursement of any wages lost during the period of service, plus a daily honorarium equal to twice the national median daily wage. Each commission convenes only for the time required to evaluate candidates and produce the mandated shortlist for the vacancy or vacancies under consideration, </w:t>
+      </w:r>
+      <w:r>
+        <w:t>never to exceed four weeks</w:t>
+      </w:r>
+      <w:r>
+        <w:t>.</w:t>
+      </w:r>
+      <w:r>
+        <w:t xml:space="preserve"> </w:t>
+      </w:r>
+    </w:p>
+    <w:p>
+      <w:pPr>
+        <w:ind w:left="360" w:hanging="360"/>
+      </w:pPr>
+      <w:r>
+        <w:t>5.</w:t>
+      </w:r>
+      <w:r>
+        <w:tab/>
+      </w:r>
+      <w:r>
+        <w:t xml:space="preserve">Any judge, parole board member, prosecutor, or official who orders or facilitates the early release (or imposes manifestly inadequate sentence) on a violent offender who then reoffends shall themselves be prosecuted as an accessory before the fact and imprisoned for a term no less than that of the subsequent crime.  </w:t>
+      </w:r>
+    </w:p>
+    <w:p>
+      <w:pPr>
+        <w:ind w:left="360" w:hanging="360"/>
+      </w:pPr>
+      <w:r>
+        <w:t>6.</w:t>
+      </w:r>
+      <w:r>
+        <w:tab/>
+      </w:r>
+      <w:r>
+        <w:t>The death penalty is restored for premeditated murder, child rape, child trafficking, child sexual abuse, possession of child sexual abuse material (CSAM),</w:t>
+      </w:r>
+      <w:r>
+        <w:t xml:space="preserve"> rape,</w:t>
+      </w:r>
+      <w:r>
+        <w:t xml:space="preserve"> high treason, and for extreme, provably intentional financial, medical, religious, scientific or any other fraud that directly causes widespread death or irreversible ruin, upon unanimous jury verdict beyond reasonable doubt. Any person who makes a false accusation of any of these offences with premeditated intent to deceive or to cause harm shall, upon unanimous jury verdict proving that intent beyond reasonable doubt, suffer the exact same penalty that would have applied to the accused.</w:t>
+      </w:r>
+    </w:p>
+    <w:p>
+      <w:pPr>
+        <w:ind w:left="360" w:hanging="360"/>
+      </w:pPr>
+      <w:r>
+        <w:t>7.</w:t>
+      </w:r>
+      <w:r>
+        <w:tab/>
+      </w:r>
+      <w:r>
+        <w:t>All executions shall be carried out solely by firing squad with hand-held lethal arms within seven days of final sentencing. For convictions of child trafficking, child sexual abuse, or possession of child sexual abuse materia</w:t>
+      </w:r>
+      <w:r>
+        <w:t>l,</w:t>
+      </w:r>
+      <w:r>
+        <w:t xml:space="preserve"> the timeline is mandatory and non-extendable.</w:t>
+      </w:r>
+    </w:p>
+    <w:p>
+      <w:pPr>
+        <w:ind w:left="360" w:hanging="360"/>
+      </w:pPr>
+      <w:r>
+        <w:t>8.</w:t>
+      </w:r>
+      <w:r>
+        <w:tab/>
+      </w:r>
+      <w:r>
+        <w:t xml:space="preserve">The criminal justice system of the Republic exists first to protect the innocent and second to restore the offender to lawful life wherever this is compatible with public safety. </w:t>
+      </w:r>
+    </w:p>
+    <w:p>
+      <w:pPr>
+        <w:ind w:left="720" w:hanging="360"/>
+      </w:pPr>
+      <w:r>
+        <w:t>a)</w:t>
+      </w:r>
+      <w:r>
+        <w:tab/>
+      </w:r>
+      <w:r>
+        <w:t xml:space="preserve">Every person sentenced to imprisonment shall be offered intensive, evidence-based rehabilitation programmes (psychological, educational, vocational, moral, and, where appropriate, medical or pharmacological) chosen solely for proven efficacy in reducing recidivism. The state has a constitutional duty to research, develop, </w:t>
+      </w:r>
+      <w:r>
+        <w:lastRenderedPageBreak/>
+        <w:t xml:space="preserve">and implement the most effective methods available, without ideological preference or prohibition. </w:t>
+      </w:r>
+    </w:p>
+    <w:p>
+      <w:pPr>
+        <w:ind w:left="720" w:hanging="360"/>
+      </w:pPr>
+      <w:r>
+        <w:t>b)</w:t>
+      </w:r>
+      <w:r>
+        <w:tab/>
+      </w:r>
+      <w:r>
+        <w:t xml:space="preserve">For offenders convicted of premeditated murder, child rape, or high treason, rehabilitation may be attempted only under the strictest conditions of permanent physical isolation from the general population and from any position of trust or authority. </w:t>
+      </w:r>
+    </w:p>
+    <w:p>
+      <w:pPr>
+        <w:ind w:left="720" w:hanging="360"/>
+      </w:pPr>
+      <w:r>
+        <w:t>c)</w:t>
+      </w:r>
+      <w:r>
+        <w:tab/>
+      </w:r>
+      <w:r>
+        <w:t xml:space="preserve">The death penalty or irrevocable life imprisonment without parole remains mandatory when a special Rehabilitation Review Board (composed of three senior judges, three forensic psychologists, and three citizen members chosen by lot) unanimously determines, after no fewer than seven years of observed behaviour and treatment, that the offender remains an incurable danger to human life. Such determination must be reviewed and reaffirmed every five years thereafter. </w:t>
+      </w:r>
+    </w:p>
+    <w:p>
+      <w:pPr>
+        <w:ind w:left="720" w:hanging="360"/>
+      </w:pPr>
+      <w:r>
+        <w:t>d)</w:t>
+      </w:r>
+      <w:r>
+        <w:tab/>
+      </w:r>
+      <w:r>
+        <w:t>No offender may ever be released if there exists any reasonable doubt about public safety. The protection of the innocent is the supreme law.</w:t>
+      </w:r>
+    </w:p>
+    <w:p>
+      <w:pPr>
+        <w:ind w:left="360" w:hanging="360"/>
+      </w:pPr>
+      <w:r>
+        <w:t>9.</w:t>
+      </w:r>
+      <w:r>
+        <w:tab/>
+      </w:r>
+      <w:r>
+        <w:t>Swift Justice for Child Crimes</w:t>
+      </w:r>
+    </w:p>
+    <w:p>
+      <w:pPr>
+        <w:ind w:left="720" w:hanging="360"/>
+      </w:pPr>
+      <w:r>
+        <w:t>a)</w:t>
+      </w:r>
+      <w:r>
+        <w:tab/>
+      </w:r>
+      <w:r>
+        <w:t xml:space="preserve">Any person arrested for child trafficking, child sexual abuse, or possession of child sexual abuse material </w:t>
+      </w:r>
+      <w:r>
+        <w:t>on</w:t>
+      </w:r>
+      <w:r>
+        <w:t xml:space="preserve"> substantial evidence shall be denied bail and held in solitary confinement pending trial.</w:t>
+      </w:r>
+    </w:p>
+    <w:p>
+      <w:pPr>
+        <w:ind w:left="720" w:hanging="360"/>
+      </w:pPr>
+      <w:r>
+        <w:t>b)</w:t>
+      </w:r>
+      <w:r>
+        <w:tab/>
+      </w:r>
+      <w:r>
+        <w:t>Trial shall begin no later than thirty days after arrest and conclude no later than sixty days after arrest.</w:t>
+      </w:r>
+    </w:p>
+    <w:p>
+      <w:pPr>
+        <w:ind w:left="720" w:hanging="360"/>
+      </w:pPr>
+      <w:r>
+        <w:t>c)</w:t>
+      </w:r>
+      <w:r>
+        <w:tab/>
+      </w:r>
+      <w:r>
         <w:t>The proceedings shall be public, adversarial, and conducted before a jury of twelve citizens chosen by blind lot. Conviction requires a unanimous verdict.</w:t>
       </w:r>
     </w:p>
@@ -12717,7 +12713,11 @@
         <w:tab/>
       </w:r>
       <w:r>
-        <w:t>No administrative tribunal, human rights commission, equity or inclusion board, diversity enforcement body, or any similar quasi-judicial or regulatory entity shall be created or maintained at the national, provincial, municipal, or any other level of government. All disputes involving alleged discrimination, expression, conscience, association, employment practices, housing, or public accommodations shall be adjudicated exclusively in the regular courts established under this Article, subject to the full protections of presumption of innocence, jury trial where applicable, and proof beyond reasonable doubt for any penalty or restriction.</w:t>
+        <w:t xml:space="preserve">No administrative tribunal, human rights commission, equity or inclusion board, diversity enforcement body, or any similar quasi-judicial or regulatory entity shall be created or maintained at the national, provincial, municipal, or any other level of government. All disputes involving alleged discrimination, expression, conscience, association, employment practices, housing, or public accommodations shall be adjudicated exclusively in the </w:t>
+      </w:r>
+      <w:r>
+        <w:lastRenderedPageBreak/>
+        <w:t>regular courts established under this Article, subject to the full protections of presumption of innocence, jury trial where applicable, and proof beyond reasonable doubt for any penalty or restriction.</w:t>
       </w:r>
     </w:p>
     <w:p>
@@ -12954,21 +12954,21 @@
         <w:ind w:left="720" w:hanging="360"/>
       </w:pPr>
       <w:r>
+        <w:t>a)</w:t>
+      </w:r>
+      <w:r>
+        <w:tab/>
+      </w:r>
+      <w:r>
+        <w:t xml:space="preserve">No national election or binding national referendum shall be deemed valid unless at least sixty percent of eligible citizens cast a vote. </w:t>
+      </w:r>
+    </w:p>
+    <w:p>
+      <w:pPr>
+        <w:ind w:left="720" w:hanging="360"/>
+      </w:pPr>
+      <w:r>
         <w:lastRenderedPageBreak/>
-        <w:t>a)</w:t>
-      </w:r>
-      <w:r>
-        <w:tab/>
-      </w:r>
-      <w:r>
-        <w:t xml:space="preserve">No national election or binding national referendum shall be deemed valid unless at least sixty percent of eligible citizens cast a vote. </w:t>
-      </w:r>
-    </w:p>
-    <w:p>
-      <w:pPr>
-        <w:ind w:left="720" w:hanging="360"/>
-      </w:pPr>
-      <w:r>
         <w:t>b)</w:t>
       </w:r>
       <w:r>
@@ -13242,11 +13242,14 @@
     </w:p>
     <w:p>
       <w:r>
+        <w:t xml:space="preserve">Benefits are non-means-tested beyond contributions and the clawback. </w:t>
+      </w:r>
+      <w:r>
+        <w:t xml:space="preserve">If one parent remains home full-time thereafter to raise the couple’s minor children until the youngest child reaches the age of fourteen, that parent qualifies for </w:t>
+      </w:r>
+      <w:r>
         <w:lastRenderedPageBreak/>
-        <w:t xml:space="preserve">Benefits are non-means-tested beyond contributions and the clawback. </w:t>
-      </w:r>
-      <w:r>
-        <w:t>If one parent remains home full-time thereafter to raise the couple’s minor children until the youngest child reaches the age of fourteen, that parent qualifies for the means-tested support under Article 27, section 4, assessed against total family assets and income, for the duration of that period.</w:t>
+        <w:t>the means-tested support under Article 27, section 4, assessed against total family assets and income, for the duration of that period.</w:t>
       </w:r>
     </w:p>
     <w:p>
@@ -13350,14 +13353,37 @@
         <w:ind w:left="360" w:hanging="360"/>
       </w:pPr>
       <w:r>
+        <w:t>4.</w:t>
+      </w:r>
+      <w:r>
+        <w:tab/>
+      </w:r>
+      <w:r>
+        <w:t>Fraud and Multiple Claims Prohibited</w:t>
+      </w:r>
+    </w:p>
+    <w:p>
+      <w:pPr>
+        <w:ind w:left="720" w:hanging="360"/>
+      </w:pPr>
+      <w:r>
+        <w:t>a)</w:t>
+      </w:r>
+      <w:r>
+        <w:tab/>
+      </w:r>
+      <w:r>
+        <w:t>No individual may receive more than one form of support under this Article or related provisions (including parental leave benefits or ongoing family-carer support cross-referenced to Article 27, section 4), and each support claim shall apply solely to the care of a single dependent unit, defined as either one infirm relative or the claimant</w:t>
+      </w:r>
+      <w:r>
+        <w:t>’</w:t>
+      </w:r>
+      <w:r>
+        <w:t xml:space="preserve">s own minor children as a collective group. Overlapping claims, such as </w:t>
+      </w:r>
+      <w:r>
         <w:lastRenderedPageBreak/>
-        <w:t>4.</w:t>
-      </w:r>
-      <w:r>
-        <w:tab/>
-      </w:r>
-      <w:r>
-        <w:t>Fraud and Multiple Claims Prohibited</w:t>
+        <w:t>simultaneous support for child-rearing and infirm relatives, are prohibited.</w:t>
       </w:r>
     </w:p>
     <w:p>
@@ -13365,165 +13391,145 @@
         <w:ind w:left="720" w:hanging="360"/>
       </w:pPr>
       <w:r>
+        <w:t>b)</w:t>
+      </w:r>
+      <w:r>
+        <w:tab/>
+      </w:r>
+      <w:r>
+        <w:t>Fraudulent claims, including but not limited to false representations of eligibility, non-delivery of claimed care, or circumvention of means-testing, shall be classified as aggravated theft from the common treasury and the Family Insurance Fund. Upon conviction, the offender shall be punished by imprisonment of five to fifteen years, immediate repayment of all benefits received plus treble damages payable to the sovereign wealth fund, and permanent ineligibility for all public assistance programmes under this Constitution.</w:t>
+      </w:r>
+    </w:p>
+    <w:p>
+      <w:pPr>
+        <w:ind w:left="360" w:hanging="360"/>
+      </w:pPr>
+      <w:r>
+        <w:t>5.</w:t>
+      </w:r>
+      <w:r>
+        <w:tab/>
+      </w:r>
+      <w:r>
+        <w:t xml:space="preserve">Divorce </w:t>
+      </w:r>
+    </w:p>
+    <w:p>
+      <w:pPr>
+        <w:pStyle w:val="ListParagraph"/>
+      </w:pPr>
+      <w:r>
+        <w:t>Divorce exists solely as a remedy for marriages irretrievably broken on legitimate grounds, never as a state-sanctioned instrument of vengeance, spite, retribution, or legal warfare between spouses. The Republic prohibits the use of divorce proceedings</w:t>
+      </w:r>
+      <w:r>
+        <w:t xml:space="preserve"> </w:t>
+      </w:r>
+      <w:r>
+        <w:t>or any claims, motions, or accusations therein</w:t>
+      </w:r>
+      <w:r>
+        <w:t xml:space="preserve"> </w:t>
+      </w:r>
+      <w:r>
+        <w:t>primarily motivated by personal malice, punishment of a spurned partner, or intent to harass, defame, impoverish, or otherwise harm the other party absent proven grounds. Courts shall dismiss with prejudice any filings or elements found to be frivolous, malicious, or in bad faith, imposing sanctions on the offending party, including full costs, financial penalties, and potential loss of custodial or property considerations. Such abuses undermine the sanctity of marriage and family; the State shall neither facilitate nor tolerate them.</w:t>
+      </w:r>
+    </w:p>
+    <w:p>
+      <w:pPr>
+        <w:pStyle w:val="ListParagraph"/>
+      </w:pPr>
+      <w:r>
+        <w:t>Divorce shall be granted solely on the grounds and according to the procedures set forth in the subsections below. Contested cases shall be resolved swiftly by a dedicated Family Court.</w:t>
+      </w:r>
+    </w:p>
+    <w:p>
+      <w:pPr>
+        <w:ind w:left="720" w:hanging="360"/>
+      </w:pPr>
+      <w:r>
         <w:t>a)</w:t>
       </w:r>
       <w:r>
         <w:tab/>
       </w:r>
       <w:r>
-        <w:t>No individual may receive more than one form of support under this Article or related provisions (including parental leave benefits or ongoing family-carer support cross-referenced to Article 27, section 4), and each support claim shall apply solely to the care of a single dependent unit, defined as either one infirm relative or the claimant</w:t>
-      </w:r>
-      <w:r>
-        <w:t>’</w:t>
-      </w:r>
-      <w:r>
-        <w:t>s own minor children as a collective group. Overlapping claims, such as simultaneous support for child-rearing and infirm relatives, are prohibited.</w:t>
-      </w:r>
-    </w:p>
-    <w:p>
-      <w:pPr>
-        <w:ind w:left="720" w:hanging="360"/>
-      </w:pPr>
-      <w:r>
-        <w:t>b)</w:t>
-      </w:r>
-      <w:r>
-        <w:tab/>
-      </w:r>
-      <w:r>
-        <w:t>Fraudulent claims, including but not limited to false representations of eligibility, non-delivery of claimed care, or circumvention of means-testing, shall be classified as aggravated theft from the common treasury and the Family Insurance Fund. Upon conviction, the offender shall be punished by imprisonment of five to fifteen years, immediate repayment of all benefits received plus treble damages payable to the sovereign wealth fund, and permanent ineligibility for all public assistance programmes under this Constitution.</w:t>
-      </w:r>
-    </w:p>
-    <w:p>
-      <w:pPr>
-        <w:ind w:left="360" w:hanging="360"/>
-      </w:pPr>
-      <w:r>
-        <w:t>5.</w:t>
-      </w:r>
-      <w:r>
-        <w:tab/>
-      </w:r>
-      <w:r>
-        <w:t xml:space="preserve">Divorce </w:t>
-      </w:r>
-    </w:p>
-    <w:p>
-      <w:pPr>
-        <w:pStyle w:val="ListParagraph"/>
-      </w:pPr>
-      <w:r>
-        <w:t>Divorce exists solely as a remedy for marriages irretrievably broken on legitimate grounds, never as a state-sanctioned instrument of vengeance, spite, retribution, or legal warfare between spouses. The Republic prohibits the use of divorce proceedings</w:t>
-      </w:r>
-      <w:r>
-        <w:t xml:space="preserve"> </w:t>
-      </w:r>
-      <w:r>
-        <w:t>or any claims, motions, or accusations therein</w:t>
-      </w:r>
-      <w:r>
-        <w:t xml:space="preserve"> </w:t>
-      </w:r>
-      <w:r>
-        <w:t>primarily motivated by personal malice, punishment of a spurned partner, or intent to harass, defame, impoverish, or otherwise harm the other party absent proven grounds. Courts shall dismiss with prejudice any filings or elements found to be frivolous, malicious, or in bad faith, imposing sanctions on the offending party, including full costs, financial penalties, and potential loss of custodial or property considerations. Such abuses undermine the sanctity of marriage and family; the State shall neither facilitate nor tolerate them.</w:t>
-      </w:r>
-    </w:p>
-    <w:p>
-      <w:pPr>
-        <w:pStyle w:val="ListParagraph"/>
-      </w:pPr>
-      <w:r>
-        <w:t>Divorce shall be granted solely on the grounds and according to the procedures set forth in the subsections below. Contested cases shall be resolved swiftly by a dedicated Family Court.</w:t>
-      </w:r>
-    </w:p>
-    <w:p>
-      <w:pPr>
-        <w:ind w:left="720" w:hanging="360"/>
-      </w:pPr>
+        <w:t>Grounds for Divorce</w:t>
+      </w:r>
+    </w:p>
+    <w:p>
+      <w:pPr>
+        <w:ind w:left="1080" w:hanging="360"/>
+      </w:pPr>
+      <w:r>
+        <w:t>i)</w:t>
+      </w:r>
+      <w:r>
+        <w:tab/>
+      </w:r>
+      <w:r>
+        <w:t xml:space="preserve">proven physical or psychological abuse of spouse or child; </w:t>
+      </w:r>
+    </w:p>
+    <w:p>
+      <w:pPr>
+        <w:ind w:left="1080" w:hanging="360"/>
+      </w:pPr>
+      <w:r>
+        <w:t>ii)</w:t>
+      </w:r>
+      <w:r>
+        <w:tab/>
+      </w:r>
+      <w:r>
+        <w:t xml:space="preserve">proven infidelity;  </w:t>
+      </w:r>
+    </w:p>
+    <w:p>
+      <w:pPr>
+        <w:ind w:left="1080" w:hanging="360"/>
+      </w:pPr>
+      <w:r>
+        <w:t>iii)</w:t>
+      </w:r>
+      <w:r>
+        <w:tab/>
+      </w:r>
+      <w:r>
+        <w:t xml:space="preserve">mutual consent;  </w:t>
+      </w:r>
+    </w:p>
+    <w:p>
+      <w:pPr>
+        <w:ind w:left="1080" w:hanging="360"/>
+      </w:pPr>
+      <w:r>
+        <w:t>iv)</w:t>
+      </w:r>
+      <w:r>
+        <w:tab/>
+      </w:r>
+      <w:r>
+        <w:t xml:space="preserve">unilateral petition where the petitioner forfeits all claims to custody, visitation, and marital assets;  </w:t>
+      </w:r>
+    </w:p>
+    <w:p>
+      <w:pPr>
+        <w:ind w:left="1080" w:hanging="360"/>
+      </w:pPr>
+      <w:r>
+        <w:t>v)</w:t>
+      </w:r>
+      <w:r>
+        <w:tab/>
+      </w:r>
+      <w:r>
+        <w:t>unilateral petition when the other party has provably abandoned the family for more than six months</w:t>
+      </w:r>
+      <w:r>
+        <w:t xml:space="preserve">, to be treated as forfeiture to </w:t>
+      </w:r>
       <w:r>
         <w:lastRenderedPageBreak/>
-        <w:t>a)</w:t>
-      </w:r>
-      <w:r>
-        <w:tab/>
-      </w:r>
-      <w:r>
-        <w:t>Grounds for Divorce</w:t>
-      </w:r>
-    </w:p>
-    <w:p>
-      <w:pPr>
-        <w:ind w:left="1080" w:hanging="360"/>
-      </w:pPr>
-      <w:r>
-        <w:t>i)</w:t>
-      </w:r>
-      <w:r>
-        <w:tab/>
-      </w:r>
-      <w:r>
-        <w:t xml:space="preserve">proven physical or psychological abuse of spouse or child; </w:t>
-      </w:r>
-    </w:p>
-    <w:p>
-      <w:pPr>
-        <w:ind w:left="1080" w:hanging="360"/>
-      </w:pPr>
-      <w:r>
-        <w:t>ii)</w:t>
-      </w:r>
-      <w:r>
-        <w:tab/>
-      </w:r>
-      <w:r>
-        <w:t xml:space="preserve">proven infidelity;  </w:t>
-      </w:r>
-    </w:p>
-    <w:p>
-      <w:pPr>
-        <w:ind w:left="1080" w:hanging="360"/>
-      </w:pPr>
-      <w:r>
-        <w:t>iii)</w:t>
-      </w:r>
-      <w:r>
-        <w:tab/>
-      </w:r>
-      <w:r>
-        <w:t xml:space="preserve">mutual consent;  </w:t>
-      </w:r>
-    </w:p>
-    <w:p>
-      <w:pPr>
-        <w:ind w:left="1080" w:hanging="360"/>
-      </w:pPr>
-      <w:r>
-        <w:t>iv)</w:t>
-      </w:r>
-      <w:r>
-        <w:tab/>
-      </w:r>
-      <w:r>
-        <w:t xml:space="preserve">unilateral petition where the petitioner forfeits all claims to custody, visitation, and marital assets;  </w:t>
-      </w:r>
-    </w:p>
-    <w:p>
-      <w:pPr>
-        <w:ind w:left="1080" w:hanging="360"/>
-      </w:pPr>
-      <w:r>
-        <w:t>v)</w:t>
-      </w:r>
-      <w:r>
-        <w:tab/>
-      </w:r>
-      <w:r>
-        <w:t>unilateral petition when the other party has provably abandoned the family for more than six months</w:t>
-      </w:r>
-      <w:r>
-        <w:t xml:space="preserve">, to be treated as forfeiture to </w:t>
-      </w:r>
-      <w:r>
         <w:t>all claims to custody, visitation, and marital assets</w:t>
       </w:r>
       <w:r>
@@ -13616,28 +13622,197 @@
         <w:t xml:space="preserve"> </w:t>
       </w:r>
       <w:r>
-        <w:t xml:space="preserve">Any party who deliberately obstructs or delays proceedings through bad-faith actions, such as frivolous filings or evasion of service, shall be held in contempt, fined up to 10 % of their share of the marital estate per instance, and may forfeit </w:t>
+        <w:t>Any party who deliberately obstructs or delays proceedings through bad-faith actions, such as frivolous filings or evasion of service, shall be held in contempt, fined up to 10 % of their share of the marital estate per instance, and may forfeit additional claims to assets, custody, or visitation at the court's discretion.</w:t>
+      </w:r>
+      <w:r>
+        <w:t xml:space="preserve"> </w:t>
+      </w:r>
+    </w:p>
+    <w:p>
+      <w:pPr>
+        <w:ind w:left="720" w:hanging="360"/>
+      </w:pPr>
+      <w:r>
+        <w:t>c)</w:t>
+      </w:r>
+      <w:r>
+        <w:tab/>
+      </w:r>
+      <w:r>
+        <w:t>Automatic Protections Upon Filing or Separation</w:t>
+      </w:r>
+    </w:p>
+    <w:p>
+      <w:pPr>
+        <w:pStyle w:val="ListParagraph"/>
+      </w:pPr>
+      <w:r>
+        <w:t>From the moment one spouse files for divorce or legally separates, or from the moment one spouse is involuntarily excluded from the marital home or from joint financial accounts (whichever occurs first), the following automatic protections take effect by operation of law, without need for court order:</w:t>
+      </w:r>
+    </w:p>
+    <w:p>
+      <w:pPr>
+        <w:ind w:left="1080" w:hanging="360"/>
+      </w:pPr>
+      <w:r>
+        <w:t>i)</w:t>
+      </w:r>
+      <w:r>
+        <w:tab/>
+      </w:r>
+      <w:r>
+        <w:t>All joint credit cards, bank accounts, and lines of credit remain fully accessible to both spouses until final settlement. Unilateral cancellation or restriction is a felony punishable by 5–10 years’ imprisonment.</w:t>
+      </w:r>
+      <w:r>
+        <w:t xml:space="preserve"> </w:t>
+      </w:r>
+    </w:p>
+    <w:p>
+      <w:pPr>
+        <w:ind w:left="1080" w:hanging="360"/>
+      </w:pPr>
+      <w:r>
+        <w:t>ii)</w:t>
+      </w:r>
+      <w:r>
+        <w:tab/>
+      </w:r>
+      <w:r>
+        <w:t xml:space="preserve">The higher-earning or asset-holding spouse shall, commencing within 72 hours of separation or filing (whichever is earlier) and continuing monthly until final settlement, directly pay provisional </w:t>
       </w:r>
       <w:r>
         <w:lastRenderedPageBreak/>
-        <w:t>additional claims to assets, custody, or visitation at the court's discretion.</w:t>
+        <w:t>support equal to fifty percent (50 %) of the marital standard of living (or the national median wage, whichever is higher) into any bank account designated by the dependent spouse.</w:t>
+      </w:r>
+    </w:p>
+    <w:p>
+      <w:pPr>
+        <w:pStyle w:val="ListParagraph"/>
+      </w:pPr>
+      <w:r>
+        <w:t>Failure to make any payment on time, or payment of less than the required amount, triggers an automatic daily penalty of 5 % of the missed amount (compounded) plus immediate forfeiture of an additional 10 % of the delinquent spouse’s final share of the marital estate for each missed or partial payment.</w:t>
+      </w:r>
+    </w:p>
+    <w:p>
+      <w:pPr>
+        <w:pStyle w:val="ListParagraph"/>
+      </w:pPr>
+      <w:r>
+        <w:t>Proof of payment (bank transfer records) is presumptive; deliberate non-compliance or evasion is punishable as felony theft from the dependent spouse.</w:t>
+      </w:r>
+    </w:p>
+    <w:p>
+      <w:pPr>
+        <w:ind w:left="1080" w:hanging="360"/>
+      </w:pPr>
+      <w:r>
+        <w:t>iii)</w:t>
+      </w:r>
+      <w:r>
+        <w:tab/>
+      </w:r>
+      <w:r>
+        <w:t>Neither spouse may sell, transfer, encumber, hide, dissipate, deplete, or wastefully expend marital assets. Violation triggers immediate forfeiture of that spouse’s entire claim to the affected asset, plus treble damages payable to the aggrieved spouse</w:t>
       </w:r>
       <w:r>
         <w:t xml:space="preserve"> </w:t>
       </w:r>
+      <w:r>
+        <w:t>deducted from the offending spouse’s share of the remaining marital estate</w:t>
+      </w:r>
+      <w:r>
+        <w:t>.</w:t>
+      </w:r>
+      <w:r>
+        <w:t xml:space="preserve"> </w:t>
+      </w:r>
+      <w:r>
+        <w:t>If the deduction exceeds the offending spouse</w:t>
+      </w:r>
+      <w:r>
+        <w:t>’</w:t>
+      </w:r>
+      <w:r>
+        <w:t>s share, the shortfall shall become a personal debt owed to the aggrieved spouse, enforceable as a judgment lien against the offending spouse</w:t>
+      </w:r>
+      <w:r>
+        <w:t>’</w:t>
+      </w:r>
+      <w:r>
+        <w:t>s future earnings and non-marital assets.</w:t>
+      </w:r>
+      <w:r>
+        <w:t xml:space="preserve"> </w:t>
+      </w:r>
+    </w:p>
+    <w:p>
+      <w:pPr>
+        <w:ind w:left="1080" w:hanging="360"/>
+      </w:pPr>
+      <w:r>
+        <w:t>iv)</w:t>
+      </w:r>
+      <w:r>
+        <w:tab/>
+      </w:r>
+      <w:r>
+        <w:t>Any vehicle regularly used by the dependent spouse or for child transport may not be repossessed or disabled</w:t>
+      </w:r>
+      <w:r>
+        <w:t xml:space="preserve"> or have its license</w:t>
+      </w:r>
+      <w:r>
+        <w:t xml:space="preserve"> or insurance</w:t>
+      </w:r>
+      <w:r>
+        <w:t xml:space="preserve"> cancelled</w:t>
+      </w:r>
+      <w:r>
+        <w:t xml:space="preserve"> or </w:t>
+      </w:r>
+      <w:r>
+        <w:t xml:space="preserve">be </w:t>
+      </w:r>
+      <w:r>
+        <w:t>otherwise made inaccessible</w:t>
+      </w:r>
+      <w:r>
+        <w:t xml:space="preserve"> or legally or physically inoperable</w:t>
+      </w:r>
+      <w:r>
+        <w:t xml:space="preserve">. Violation </w:t>
+      </w:r>
+      <w:r>
+        <w:t>shall be considered</w:t>
+      </w:r>
+      <w:r>
+        <w:t xml:space="preserve"> grand theft</w:t>
+      </w:r>
+      <w:r>
+        <w:t xml:space="preserve"> and triggers immediate forfeiture of t</w:t>
+      </w:r>
+      <w:r>
+        <w:t>he offending spouse’s entire claim to that vehicle</w:t>
+      </w:r>
+      <w:r>
+        <w:t>.</w:t>
+      </w:r>
+      <w:r>
+        <w:t xml:space="preserve"> </w:t>
+      </w:r>
     </w:p>
     <w:p>
       <w:pPr>
         <w:ind w:left="720" w:hanging="360"/>
       </w:pPr>
       <w:r>
-        <w:t>c)</w:t>
-      </w:r>
-      <w:r>
-        <w:tab/>
-      </w:r>
-      <w:r>
-        <w:t>Automatic Protections Upon Filing or Separation</w:t>
+        <w:t>d)</w:t>
+      </w:r>
+      <w:r>
+        <w:tab/>
+      </w:r>
+      <w:r>
+        <w:t>Interim Orders</w:t>
       </w:r>
     </w:p>
     <w:p>
@@ -13645,7 +13820,7 @@
         <w:pStyle w:val="ListParagraph"/>
       </w:pPr>
       <w:r>
-        <w:t>From the moment one spouse files for divorce or legally separates, or from the moment one spouse is involuntarily excluded from the marital home or from joint financial accounts (whichever occurs first), the following automatic protections take effect by operation of law, without need for court order:</w:t>
+        <w:t xml:space="preserve">Within 30 days of filing or involuntary separation, the Family Court shall issue an interim order distributing: </w:t>
       </w:r>
     </w:p>
     <w:p>
@@ -13659,10 +13834,7 @@
         <w:tab/>
       </w:r>
       <w:r>
-        <w:t>All joint credit cards, bank accounts, and lines of credit remain fully accessible to both spouses until final settlement. Unilateral cancellation or restriction is a felony punishable by 5–10 years’ imprisonment.</w:t>
-      </w:r>
-      <w:r>
-        <w:t xml:space="preserve"> </w:t>
+        <w:t xml:space="preserve">sole interim use of the marital home to the primary caregiver of minor children (or to the lower-earning spouse if no minor children), and </w:t>
       </w:r>
     </w:p>
     <w:p>
@@ -13676,177 +13848,11 @@
         <w:tab/>
       </w:r>
       <w:r>
-        <w:t>The higher-earning or asset-holding spouse shall, commencing within 72 hours of separation or filing (whichever is earlier) and continuing monthly until final settlement, directly pay provisional support equal to fifty percent (50 %) of the marital standard of living (or the national median wage, whichever is higher) into any bank account designated by the dependent spouse.</w:t>
-      </w:r>
-    </w:p>
-    <w:p>
-      <w:pPr>
-        <w:pStyle w:val="ListParagraph"/>
-      </w:pPr>
-      <w:r>
-        <w:t>Failure to make any payment on time, or payment of less than the required amount, triggers an automatic daily penalty of 5 % of the missed amount (compounded) plus immediate forfeiture of an additional 10 % of the delinquent spouse’s final share of the marital estate for each missed or partial payment.</w:t>
-      </w:r>
-    </w:p>
-    <w:p>
-      <w:pPr>
-        <w:pStyle w:val="ListParagraph"/>
-      </w:pPr>
-      <w:r>
-        <w:t>Proof of payment (bank transfer records) is presumptive; deliberate non-compliance or evasion is punishable as felony theft from the dependent spouse.</w:t>
-      </w:r>
-    </w:p>
-    <w:p>
-      <w:pPr>
-        <w:ind w:left="1080" w:hanging="360"/>
-      </w:pPr>
-      <w:r>
-        <w:t>iii)</w:t>
-      </w:r>
-      <w:r>
-        <w:tab/>
-      </w:r>
-      <w:r>
-        <w:t>Neither spouse may sell, transfer, encumber, hide, dissipate, deplete, or wastefully expend marital assets. Violation triggers immediate forfeiture of that spouse’s entire claim to the affected asset, plus treble damages payable to the aggrieved spouse</w:t>
-      </w:r>
-      <w:r>
-        <w:t xml:space="preserve"> </w:t>
-      </w:r>
-      <w:r>
-        <w:t>deducted from the offending spouse’s share of the remaining marital estate</w:t>
-      </w:r>
-      <w:r>
-        <w:t>.</w:t>
-      </w:r>
-      <w:r>
-        <w:t xml:space="preserve"> </w:t>
-      </w:r>
-      <w:r>
-        <w:t>If the deduction exceeds the offending spouse</w:t>
-      </w:r>
-      <w:r>
-        <w:t>’</w:t>
-      </w:r>
-      <w:r>
-        <w:t xml:space="preserve">s share, the shortfall shall become a personal debt owed to the </w:t>
+        <w:t xml:space="preserve">an immediate 50 % cash advance of all liquid marital assets (bank accounts, investments, crypto, etc.) to the dependent spouse, with final accounting at settlement. Deliberate delay by either party or </w:t>
       </w:r>
       <w:r>
         <w:lastRenderedPageBreak/>
-        <w:t>aggrieved spouse, enforceable as a judgment lien against the offending spouse</w:t>
-      </w:r>
-      <w:r>
-        <w:t>’</w:t>
-      </w:r>
-      <w:r>
-        <w:t>s future earnings and non-marital assets.</w:t>
-      </w:r>
-      <w:r>
-        <w:t xml:space="preserve"> </w:t>
-      </w:r>
-    </w:p>
-    <w:p>
-      <w:pPr>
-        <w:ind w:left="1080" w:hanging="360"/>
-      </w:pPr>
-      <w:r>
-        <w:t>iv)</w:t>
-      </w:r>
-      <w:r>
-        <w:tab/>
-      </w:r>
-      <w:r>
-        <w:t>Any vehicle regularly used by the dependent spouse or for child transport may not be repossessed or disabled</w:t>
-      </w:r>
-      <w:r>
-        <w:t xml:space="preserve"> or have its license</w:t>
-      </w:r>
-      <w:r>
-        <w:t xml:space="preserve"> or insurance</w:t>
-      </w:r>
-      <w:r>
-        <w:t xml:space="preserve"> cancelled</w:t>
-      </w:r>
-      <w:r>
-        <w:t xml:space="preserve"> or </w:t>
-      </w:r>
-      <w:r>
-        <w:t xml:space="preserve">be </w:t>
-      </w:r>
-      <w:r>
-        <w:t>otherwise made inaccessible</w:t>
-      </w:r>
-      <w:r>
-        <w:t xml:space="preserve"> or legally or physically inoperable</w:t>
-      </w:r>
-      <w:r>
-        <w:t xml:space="preserve">. Violation </w:t>
-      </w:r>
-      <w:r>
-        <w:t>shall be considered</w:t>
-      </w:r>
-      <w:r>
-        <w:t xml:space="preserve"> grand theft</w:t>
-      </w:r>
-      <w:r>
-        <w:t xml:space="preserve"> and triggers immediate forfeiture of t</w:t>
-      </w:r>
-      <w:r>
-        <w:t>he offending spouse’s entire claim to that vehicle</w:t>
-      </w:r>
-      <w:r>
-        <w:t>.</w:t>
-      </w:r>
-      <w:r>
-        <w:t xml:space="preserve"> </w:t>
-      </w:r>
-    </w:p>
-    <w:p>
-      <w:pPr>
-        <w:ind w:left="720" w:hanging="360"/>
-      </w:pPr>
-      <w:r>
-        <w:t>d)</w:t>
-      </w:r>
-      <w:r>
-        <w:tab/>
-      </w:r>
-      <w:r>
-        <w:t>Interim Orders</w:t>
-      </w:r>
-    </w:p>
-    <w:p>
-      <w:pPr>
-        <w:pStyle w:val="ListParagraph"/>
-      </w:pPr>
-      <w:r>
-        <w:t xml:space="preserve">Within 30 days of filing or involuntary separation, the Family Court shall issue an interim order distributing: </w:t>
-      </w:r>
-    </w:p>
-    <w:p>
-      <w:pPr>
-        <w:ind w:left="1080" w:hanging="360"/>
-      </w:pPr>
-      <w:r>
-        <w:t>i)</w:t>
-      </w:r>
-      <w:r>
-        <w:tab/>
-      </w:r>
-      <w:r>
-        <w:t xml:space="preserve">sole interim use of the marital home to the primary caregiver of minor children (or to the lower-earning spouse if no minor children), and </w:t>
-      </w:r>
-    </w:p>
-    <w:p>
-      <w:pPr>
-        <w:ind w:left="1080" w:hanging="360"/>
-      </w:pPr>
-      <w:r>
-        <w:t>ii)</w:t>
-      </w:r>
-      <w:r>
-        <w:tab/>
-      </w:r>
-      <w:r>
-        <w:t>an immediate 50 % cash advance of all liquid marital assets (bank accounts, investments, crypto, etc.) to the dependent spouse, with final accounting at settlement. Deliberate delay by either party or by the court is punishable by contempt and personal financial liability of the delaying judge or lawyer.</w:t>
+        <w:t>by the court is punishable by contempt and personal financial liability of the delaying judge or lawyer.</w:t>
       </w:r>
     </w:p>
     <w:p>
@@ -14112,14 +14118,213 @@
         <w:ind w:left="720" w:hanging="360"/>
       </w:pPr>
       <w:r>
+        <w:t>c)</w:t>
+      </w:r>
+      <w:r>
+        <w:tab/>
+      </w:r>
+      <w:r>
+        <w:t xml:space="preserve">No standardised testing, pre-approved curriculum, or ideological conformity shall be required. </w:t>
+      </w:r>
+    </w:p>
+    <w:p>
+      <w:pPr>
+        <w:ind w:left="720" w:hanging="360"/>
+      </w:pPr>
+      <w:r>
+        <w:t>d)</w:t>
+      </w:r>
+      <w:r>
+        <w:tab/>
+      </w:r>
+      <w:r>
+        <w:t xml:space="preserve">Upon a satisfactory visit, the family immediately receives the full semester’s portion of the education grant. An unsatisfactory visit </w:t>
+      </w:r>
+      <w:r>
         <w:lastRenderedPageBreak/>
+        <w:t>triggers one</w:t>
+      </w:r>
+      <w:r>
+        <w:t xml:space="preserve"> additional</w:t>
+      </w:r>
+      <w:r>
+        <w:t xml:space="preserve"> remedial visit the following semester; only repeated and obvious neglect (not disagreement over method or content) may lead to further intervention, which must be approved by a family-court judge. </w:t>
+      </w:r>
+    </w:p>
+    <w:p>
+      <w:pPr>
+        <w:ind w:left="360" w:hanging="360"/>
+      </w:pPr>
+      <w:r>
+        <w:t>5.</w:t>
+      </w:r>
+      <w:r>
+        <w:tab/>
+      </w:r>
+      <w:r>
+        <w:t xml:space="preserve">Any teacher, administrator, or official who violates </w:t>
+      </w:r>
+      <w:r>
+        <w:t>sections 2</w:t>
+      </w:r>
+      <w:r>
+        <w:t xml:space="preserve"> or 4 of this Article shall be permanently barred from the profession and liable for civil damages to the affected family.</w:t>
+      </w:r>
+    </w:p>
+    <w:p>
+      <w:pPr>
+        <w:ind w:left="360" w:hanging="360"/>
+      </w:pPr>
+      <w:r>
+        <w:t>6.</w:t>
+      </w:r>
+      <w:r>
+        <w:tab/>
+      </w:r>
+      <w:r>
+        <w:t>Education in the Republic shall be deliberately structured to produce citizens who are capable, in the absence of digital systems or artificial aids, of performing all essential functions of civilisation: reading and producing sophisticated prose; advanced mathematics; mechanical and electrical repair; agricultural production; marksmanship and basic infantry tactics; childbirth and infant care; civic oratory; and the maintenance of republican institutions.</w:t>
+      </w:r>
+    </w:p>
+    <w:p>
+      <w:pPr>
+        <w:ind w:left="360" w:hanging="360"/>
+      </w:pPr>
+      <w:r>
+        <w:t>7.</w:t>
+      </w:r>
+      <w:r>
+        <w:tab/>
+      </w:r>
+      <w:r>
+        <w:t>Every public and publicly funded school shall allocate no fewer than 30 % of instructional time to practical, non-digital arts not limited to: manual drafting, carpentry, metalwork, engine repair, farming or gardening, textiles, cooking, physical training</w:t>
+      </w:r>
+      <w:r>
+        <w:t xml:space="preserve"> including sports and fitness</w:t>
+      </w:r>
+      <w:r>
+        <w:t>, fieldcraft, and firearms proficiency. Examinations in these subjects shall be entirely practical and performed without electronic assistance.</w:t>
+      </w:r>
+    </w:p>
+    <w:p>
+      <w:pPr>
+        <w:ind w:left="360" w:hanging="360"/>
+      </w:pPr>
+      <w:r>
+        <w:t>8.</w:t>
+      </w:r>
+      <w:r>
+        <w:tab/>
+      </w:r>
+      <w:r>
+        <w:t>The deliberate design of curricula or technologies that produce generations incapable of sustaining civilisation without artificial aids is prohibited as a crime against the posterity of the nation.</w:t>
+      </w:r>
+    </w:p>
+    <w:p>
+      <w:pPr>
+        <w:ind w:left="360" w:hanging="360"/>
+      </w:pPr>
+      <w:r>
+        <w:t>9.</w:t>
+      </w:r>
+      <w:r>
+        <w:tab/>
+      </w:r>
+      <w:r>
+        <w:t>Fraud and Multiple Claims Prohibited</w:t>
+      </w:r>
+    </w:p>
+    <w:p>
+      <w:pPr>
+        <w:ind w:left="720" w:hanging="360"/>
+      </w:pPr>
+      <w:r>
+        <w:t>a)</w:t>
+      </w:r>
+      <w:r>
+        <w:tab/>
+      </w:r>
+      <w:r>
+        <w:t>No individual may receive more than one form of support under this Article (including education vouchers or grants for homeschooling or alternative education), and each support claim shall apply solely to the education of a single child or, in the case of multiple children in the same household, the claimant</w:t>
+      </w:r>
+      <w:r>
+        <w:t>’</w:t>
+      </w:r>
+      <w:r>
+        <w:t>s own children as a collective unit. Overlapping claims with other care or assistance provisions, such as those under Article 17 or Article 27, are prohibited.</w:t>
+      </w:r>
+    </w:p>
+    <w:p>
+      <w:pPr>
+        <w:ind w:left="720" w:hanging="360"/>
+      </w:pPr>
+      <w:r>
+        <w:t>b)</w:t>
+      </w:r>
+      <w:r>
+        <w:tab/>
+      </w:r>
+      <w:r>
+        <w:t xml:space="preserve">Fraudulent claims, including but not limited to false representations of homeschooling activities, non-delivery of education, or misuse of voucher funds, shall be classified as aggravated theft from the common treasury. Upon conviction, the offender shall be punished by imprisonment of five to fifteen years, immediate repayment of all </w:t>
+      </w:r>
+      <w:r>
+        <w:lastRenderedPageBreak/>
+        <w:t>benefits received plus treble damages payable to the sovereign wealth fund, and permanent ineligibility for all public assistance programmes under this Constitution.</w:t>
+      </w:r>
+    </w:p>
+    <w:p>
+      <w:pPr>
+        <w:ind w:left="360" w:hanging="360"/>
+      </w:pPr>
+      <w:r>
+        <w:t>10.</w:t>
+      </w:r>
+      <w:r>
+        <w:tab/>
+      </w:r>
+      <w:r>
+        <w:t>Higher Education and Meritocratic Accountability</w:t>
+      </w:r>
+    </w:p>
+    <w:p>
+      <w:pPr>
+        <w:ind w:left="720" w:hanging="360"/>
+      </w:pPr>
+      <w:r>
+        <w:t>a)</w:t>
+      </w:r>
+      <w:r>
+        <w:tab/>
+      </w:r>
+      <w:r>
+        <w:t>Universities and post-secondary institutions shall operate as autonomous centres of advanced learning, research, and intellectual development, funded primarily through tuition, private endowment, competitive research grants, and revenue from intellectual property or consulting, rather than unconditional public subsidy.</w:t>
+      </w:r>
+    </w:p>
+    <w:p>
+      <w:pPr>
+        <w:ind w:left="720" w:hanging="360"/>
+      </w:pPr>
+      <w:r>
+        <w:t>b)</w:t>
+      </w:r>
+      <w:r>
+        <w:tab/>
+      </w:r>
+      <w:r>
+        <w:t>Public loan guarantees or direct financing for student tuition shall be conditional: institutions must co-guarantee a portion of loans for each program, proportional to historical graduate employment and income outcomes in fields related to the degree. In cases of sustained underperformance (defined by regulation as below-threshold employment rates or income repayment capacity over a multi-year period), the institution shall assume liability for repayment of the unguaranteed portion, ensuring alignment of institutional incentives with student and national merit.</w:t>
+      </w:r>
+    </w:p>
+    <w:p>
+      <w:pPr>
+        <w:ind w:left="720" w:hanging="360"/>
+      </w:pPr>
+      <w:r>
         <w:t>c)</w:t>
       </w:r>
       <w:r>
         <w:tab/>
       </w:r>
       <w:r>
-        <w:t xml:space="preserve">No standardised testing, pre-approved curriculum, or ideological conformity shall be required. </w:t>
+        <w:t>Admission to degree programs shall be merit-based, determined by demonstrated academic ability and aptitude, without quotas or preferences unrelated to intellectual capacity or program relevance. Institutions retain full freedom to establish rigorous selection criteria.</w:t>
       </w:r>
     </w:p>
     <w:p>
@@ -14133,207 +14338,7 @@
         <w:tab/>
       </w:r>
       <w:r>
-        <w:t>Upon a satisfactory visit, the family immediately receives the full semester’s portion of the education grant. An unsatisfactory visit triggers one</w:t>
-      </w:r>
-      <w:r>
-        <w:t xml:space="preserve"> additional</w:t>
-      </w:r>
-      <w:r>
-        <w:t xml:space="preserve"> remedial visit the following semester; only repeated and obvious neglect (not disagreement over method or content) may lead to further intervention, which must be approved by a family-court judge. </w:t>
-      </w:r>
-    </w:p>
-    <w:p>
-      <w:pPr>
-        <w:ind w:left="360" w:hanging="360"/>
-      </w:pPr>
-      <w:r>
-        <w:t>5.</w:t>
-      </w:r>
-      <w:r>
-        <w:tab/>
-      </w:r>
-      <w:r>
-        <w:t xml:space="preserve">Any teacher, administrator, or official who violates </w:t>
-      </w:r>
-      <w:r>
-        <w:t>sections 2</w:t>
-      </w:r>
-      <w:r>
-        <w:t xml:space="preserve"> or 4 of this Article shall be permanently barred from the profession and liable for civil damages to the affected family.</w:t>
-      </w:r>
-    </w:p>
-    <w:p>
-      <w:pPr>
-        <w:ind w:left="360" w:hanging="360"/>
-      </w:pPr>
-      <w:r>
-        <w:t>6.</w:t>
-      </w:r>
-      <w:r>
-        <w:tab/>
-      </w:r>
-      <w:r>
-        <w:t>Education in the Republic shall be deliberately structured to produce citizens who are capable, in the absence of digital systems or artificial aids, of performing all essential functions of civilisation: reading and producing sophisticated prose; advanced mathematics; mechanical and electrical repair; agricultural production; marksmanship and basic infantry tactics; childbirth and infant care; civic oratory; and the maintenance of republican institutions.</w:t>
-      </w:r>
-    </w:p>
-    <w:p>
-      <w:pPr>
-        <w:ind w:left="360" w:hanging="360"/>
-      </w:pPr>
-      <w:r>
-        <w:t>7.</w:t>
-      </w:r>
-      <w:r>
-        <w:tab/>
-      </w:r>
-      <w:r>
-        <w:t>Every public and publicly funded school shall allocate no fewer than 30 % of instructional time to practical, non-digital arts not limited to: manual drafting, carpentry, metalwork, engine repair, farming or gardening, textiles, cooking, physical training</w:t>
-      </w:r>
-      <w:r>
-        <w:t xml:space="preserve"> including sports and fitness</w:t>
-      </w:r>
-      <w:r>
-        <w:t>, fieldcraft, and firearms proficiency. Examinations in these subjects shall be entirely practical and performed without electronic assistance.</w:t>
-      </w:r>
-    </w:p>
-    <w:p>
-      <w:pPr>
-        <w:ind w:left="360" w:hanging="360"/>
-      </w:pPr>
-      <w:r>
-        <w:t>8.</w:t>
-      </w:r>
-      <w:r>
-        <w:tab/>
-      </w:r>
-      <w:r>
-        <w:t>The deliberate design of curricula or technologies that produce generations incapable of sustaining civilisation without artificial aids is prohibited as a crime against the posterity of the nation.</w:t>
-      </w:r>
-    </w:p>
-    <w:p>
-      <w:pPr>
-        <w:ind w:left="360" w:hanging="360"/>
-      </w:pPr>
-      <w:r>
-        <w:t>9.</w:t>
-      </w:r>
-      <w:r>
-        <w:tab/>
-      </w:r>
-      <w:r>
-        <w:t>Fraud and Multiple Claims Prohibited</w:t>
-      </w:r>
-    </w:p>
-    <w:p>
-      <w:pPr>
-        <w:ind w:left="720" w:hanging="360"/>
-      </w:pPr>
-      <w:r>
-        <w:t>a)</w:t>
-      </w:r>
-      <w:r>
-        <w:tab/>
-      </w:r>
-      <w:r>
-        <w:t xml:space="preserve">No individual may receive more than one form of support under this Article (including education vouchers or grants for homeschooling or alternative education), and each support claim shall apply solely to the education of a single child or, in the case of multiple children in the </w:t>
-      </w:r>
-      <w:r>
-        <w:lastRenderedPageBreak/>
-        <w:t>same household, the claimant</w:t>
-      </w:r>
-      <w:r>
-        <w:t>’</w:t>
-      </w:r>
-      <w:r>
-        <w:t>s own children as a collective unit. Overlapping claims with other care or assistance provisions, such as those under Article 17 or Article 27, are prohibited.</w:t>
-      </w:r>
-    </w:p>
-    <w:p>
-      <w:pPr>
-        <w:ind w:left="720" w:hanging="360"/>
-      </w:pPr>
-      <w:r>
-        <w:t>b)</w:t>
-      </w:r>
-      <w:r>
-        <w:tab/>
-      </w:r>
-      <w:r>
-        <w:t>Fraudulent claims, including but not limited to false representations of homeschooling activities, non-delivery of education, or misuse of voucher funds, shall be classified as aggravated theft from the common treasury. Upon conviction, the offender shall be punished by imprisonment of five to fifteen years, immediate repayment of all benefits received plus treble damages payable to the sovereign wealth fund, and permanent ineligibility for all public assistance programmes under this Constitution.</w:t>
-      </w:r>
-    </w:p>
-    <w:p>
-      <w:pPr>
-        <w:ind w:left="360" w:hanging="360"/>
-      </w:pPr>
-      <w:r>
-        <w:t>10.</w:t>
-      </w:r>
-      <w:r>
-        <w:tab/>
-      </w:r>
-      <w:r>
-        <w:t>Higher Education and Meritocratic Accountability</w:t>
-      </w:r>
-    </w:p>
-    <w:p>
-      <w:pPr>
-        <w:ind w:left="720" w:hanging="360"/>
-      </w:pPr>
-      <w:r>
-        <w:t>a)</w:t>
-      </w:r>
-      <w:r>
-        <w:tab/>
-      </w:r>
-      <w:r>
-        <w:t>Universities and post-secondary institutions shall operate as autonomous centres of advanced learning, research, and intellectual development, funded primarily through tuition, private endowment, competitive research grants, and revenue from intellectual property or consulting, rather than unconditional public subsidy.</w:t>
-      </w:r>
-    </w:p>
-    <w:p>
-      <w:pPr>
-        <w:ind w:left="720" w:hanging="360"/>
-      </w:pPr>
-      <w:r>
-        <w:t>b)</w:t>
-      </w:r>
-      <w:r>
-        <w:tab/>
-      </w:r>
-      <w:r>
-        <w:t>Public loan guarantees or direct financing for student tuition shall be conditional: institutions must co-guarantee a portion of loans for each program, proportional to historical graduate employment and income outcomes in fields related to the degree. In cases of sustained underperformance (defined by regulation as below-threshold employment rates or income repayment capacity over a multi-year period), the institution shall assume liability for repayment of the unguaranteed portion, ensuring alignment of institutional incentives with student and national merit.</w:t>
-      </w:r>
-    </w:p>
-    <w:p>
-      <w:pPr>
-        <w:ind w:left="720" w:hanging="360"/>
-      </w:pPr>
-      <w:r>
-        <w:t>c)</w:t>
-      </w:r>
-      <w:r>
-        <w:tab/>
-      </w:r>
-      <w:r>
-        <w:t>Admission to degree programs shall be merit-based, determined by demonstrated academic ability and aptitude, without quotas or preferences unrelated to intellectual capacity or program relevance. Institutions retain full freedom to establish rigorous selection criteria.</w:t>
-      </w:r>
-    </w:p>
-    <w:p>
-      <w:pPr>
-        <w:ind w:left="720" w:hanging="360"/>
-      </w:pPr>
-      <w:r>
-        <w:t>d)</w:t>
-      </w:r>
-      <w:r>
-        <w:tab/>
-      </w:r>
-      <w:r>
-        <w:t xml:space="preserve">Pure research, philosophy, and foundational disciplines essential to civilizational continuity shall be supported through merit-awarded fellowships, endowed chairs, and internal university revenue. Mass </w:t>
-      </w:r>
-      <w:r>
-        <w:lastRenderedPageBreak/>
-        <w:t>enrolment in programs with persistently poor economic viability shall not qualify for public loan backing unless privately funded.</w:t>
+        <w:t>Pure research, philosophy, and foundational disciplines essential to civilizational continuity shall be supported through merit-awarded fellowships, endowed chairs, and internal university revenue. Mass enrolment in programs with persistently poor economic viability shall not qualify for public loan backing unless privately funded.</w:t>
       </w:r>
     </w:p>
     <w:p>
@@ -14527,21 +14532,18 @@
         <w:tab/>
       </w:r>
       <w:r>
-        <w:t xml:space="preserve">No federal or provincial law, regulation, licence, quota, marketing board, supply-management system, or any other instrument may prohibit or unreasonably restrict the direct sale by family farmers of raw milk and raw-milk products (including cheese, butter, and cream) or their pasteurized equivalents, farm-fresh eggs, meat, poultry, honey, vegetables, fruit, or any other whole, unprocessed food produced on the farm to willing consumers. Simple sanitary guidelines may be issued for the protection of public health, but no pasteurisation mandate, inspection fee regime, production quota, or licensing barrier may be used to suppress or eliminate </w:t>
-      </w:r>
+        <w:t>No federal or provincial law, regulation, licence, quota, marketing board, supply-management system, or any other instrument may prohibit or unreasonably restrict the direct sale by family farmers of raw milk and raw-milk products (including cheese, butter, and cream) or their pasteurized equivalents, farm-fresh eggs, meat, poultry, honey, vegetables, fruit, or any other whole, unprocessed food produced on the farm to willing consumers. Simple sanitary guidelines may be issued for the protection of public health, but no pasteurisation mandate, inspection fee regime, production quota, or licensing barrier may be used to suppress or eliminate small-scale or traditional production and direct farm-to-consumer commerce.</w:t>
+      </w:r>
+      <w:r>
+        <w:t xml:space="preserve"> </w:t>
+      </w:r>
+    </w:p>
+    <w:p>
+      <w:pPr>
+        <w:ind w:left="360" w:hanging="360"/>
+      </w:pPr>
       <w:r>
         <w:lastRenderedPageBreak/>
-        <w:t>small-scale or traditional production and direct farm-to-consumer commerce.</w:t>
-      </w:r>
-      <w:r>
-        <w:t xml:space="preserve"> </w:t>
-      </w:r>
-    </w:p>
-    <w:p>
-      <w:pPr>
-        <w:ind w:left="360" w:hanging="360"/>
-      </w:pPr>
-      <w:r>
         <w:t>7.</w:t>
       </w:r>
       <w:r>
@@ -14925,17 +14927,42 @@
         <w:tab/>
       </w:r>
       <w:r>
-        <w:t xml:space="preserve">Every nominee must be a citizen of unmixed European descent, born in Canada, with no dual citizenship and no financial or familial ties to </w:t>
-      </w:r>
+        <w:t>Every nominee must be a citizen of unmixed European descent, born in Canada, with no dual citizenship and no financial or familial ties to any private banking institution in the previous twenty years</w:t>
+      </w:r>
+      <w:r>
+        <w:t xml:space="preserve"> nor during tenure of term</w:t>
+      </w:r>
+      <w:r>
+        <w:t xml:space="preserve">. </w:t>
+      </w:r>
+    </w:p>
+    <w:p>
+      <w:pPr>
+        <w:ind w:left="720" w:hanging="360"/>
+      </w:pPr>
+      <w:r>
+        <w:t>c)</w:t>
+      </w:r>
+      <w:r>
+        <w:tab/>
+      </w:r>
+      <w:r>
+        <w:t xml:space="preserve">Annual compensation shall be fixed at three times the national median wage. </w:t>
+      </w:r>
+    </w:p>
+    <w:p>
+      <w:pPr>
+        <w:ind w:left="720" w:hanging="360"/>
+      </w:pPr>
       <w:r>
         <w:lastRenderedPageBreak/>
-        <w:t>any private banking institution in the previous twenty years</w:t>
-      </w:r>
-      <w:r>
-        <w:t xml:space="preserve"> nor during tenure of term</w:t>
-      </w:r>
-      <w:r>
-        <w:t xml:space="preserve">. </w:t>
+        <w:t>d)</w:t>
+      </w:r>
+      <w:r>
+        <w:tab/>
+      </w:r>
+      <w:r>
+        <w:t>Any Governor or Director who knowingly permits the creation of money as interest-bearing debt to private entities, or who accepts any benefit from private or foreign financial interests, commits high treason punishable by death.</w:t>
       </w:r>
     </w:p>
     <w:p>
@@ -14943,96 +14970,68 @@
         <w:ind w:left="720" w:hanging="360"/>
       </w:pPr>
       <w:r>
+        <w:t>e)</w:t>
+      </w:r>
+      <w:r>
+        <w:tab/>
+      </w:r>
+      <w:r>
+        <w:t>The Governor and the eight Directors shall collectively constitute the Monetary Policy Committee, responsible for all decisions on interest rates, credit creation, and other monetary instruments consistent with this Article. Decisions shall require a simple majority unless otherwise specified herein.</w:t>
+      </w:r>
+    </w:p>
+    <w:p>
+      <w:pPr>
+        <w:ind w:left="360" w:hanging="360"/>
+      </w:pPr>
+      <w:r>
+        <w:t>9.</w:t>
+      </w:r>
+      <w:r>
+        <w:tab/>
+      </w:r>
+      <w:r>
+        <w:t xml:space="preserve">Transparency and Public Audit </w:t>
+      </w:r>
+    </w:p>
+    <w:p>
+      <w:pPr>
+        <w:ind w:left="720" w:hanging="360"/>
+      </w:pPr>
+      <w:r>
+        <w:t>a)</w:t>
+      </w:r>
+      <w:r>
+        <w:tab/>
+      </w:r>
+      <w:r>
+        <w:t xml:space="preserve">All meetings of the Monetary Policy Committee shall be live-streamed with a ten-minute delay for national-security redactions only. </w:t>
+      </w:r>
+    </w:p>
+    <w:p>
+      <w:pPr>
+        <w:ind w:left="720" w:hanging="360"/>
+      </w:pPr>
+      <w:r>
+        <w:t>b)</w:t>
+      </w:r>
+      <w:r>
+        <w:tab/>
+      </w:r>
+      <w:r>
+        <w:t xml:space="preserve">Full minutes and voting records shall be published within 24 hours. </w:t>
+      </w:r>
+    </w:p>
+    <w:p>
+      <w:pPr>
+        <w:ind w:left="720" w:hanging="360"/>
+      </w:pPr>
+      <w:r>
         <w:t>c)</w:t>
       </w:r>
       <w:r>
         <w:tab/>
       </w:r>
       <w:r>
-        <w:t xml:space="preserve">Annual compensation shall be fixed at three times the national median wage. </w:t>
-      </w:r>
-    </w:p>
-    <w:p>
-      <w:pPr>
-        <w:ind w:left="720" w:hanging="360"/>
-      </w:pPr>
-      <w:r>
-        <w:t>d)</w:t>
-      </w:r>
-      <w:r>
-        <w:tab/>
-      </w:r>
-      <w:r>
-        <w:t>Any Governor or Director who knowingly permits the creation of money as interest-bearing debt to private entities, or who accepts any benefit from private or foreign financial interests, commits high treason punishable by death.</w:t>
-      </w:r>
-    </w:p>
-    <w:p>
-      <w:pPr>
-        <w:ind w:left="720" w:hanging="360"/>
-      </w:pPr>
-      <w:r>
-        <w:t>e)</w:t>
-      </w:r>
-      <w:r>
-        <w:tab/>
-      </w:r>
-      <w:r>
-        <w:t>The Governor and the eight Directors shall collectively constitute the Monetary Policy Committee, responsible for all decisions on interest rates, credit creation, and other monetary instruments consistent with this Article. Decisions shall require a simple majority unless otherwise specified herein.</w:t>
-      </w:r>
-    </w:p>
-    <w:p>
-      <w:pPr>
-        <w:ind w:left="360" w:hanging="360"/>
-      </w:pPr>
-      <w:r>
-        <w:t>9.</w:t>
-      </w:r>
-      <w:r>
-        <w:tab/>
-      </w:r>
-      <w:r>
-        <w:t xml:space="preserve">Transparency and Public Audit </w:t>
-      </w:r>
-    </w:p>
-    <w:p>
-      <w:pPr>
-        <w:ind w:left="720" w:hanging="360"/>
-      </w:pPr>
-      <w:r>
-        <w:t>a)</w:t>
-      </w:r>
-      <w:r>
-        <w:tab/>
-      </w:r>
-      <w:r>
-        <w:t xml:space="preserve">All meetings of the Monetary Policy Committee shall be live-streamed with a ten-minute delay for national-security redactions only. </w:t>
-      </w:r>
-    </w:p>
-    <w:p>
-      <w:pPr>
-        <w:ind w:left="720" w:hanging="360"/>
-      </w:pPr>
-      <w:r>
-        <w:t>b)</w:t>
-      </w:r>
-      <w:r>
-        <w:tab/>
-      </w:r>
-      <w:r>
-        <w:t xml:space="preserve">Full minutes and voting records shall be published within 24 hours. </w:t>
-      </w:r>
-    </w:p>
-    <w:p>
-      <w:pPr>
-        <w:ind w:left="720" w:hanging="360"/>
-      </w:pPr>
-      <w:r>
-        <w:t>c)</w:t>
-      </w:r>
-      <w:r>
-        <w:tab/>
-      </w:r>
-      <w:r>
         <w:t>An independent Public Monetary Auditor, elected by national referendum every seven years, shall have unrestricted access to all Bank records and may initiate criminal investigations.</w:t>
       </w:r>
     </w:p>
@@ -15061,45 +15060,45 @@
         <w:tab/>
       </w:r>
       <w:r>
-        <w:t xml:space="preserve">No Canadian government, province, municipality, crown corporation, or public pension fund may ever borrow from, lend to, or enter into derivative contracts with the Bank for International Settlements, the International Monetary Fund, the World Bank, or any banking cartel. Existing obligations to such entities shall be subject to immediate merit-based review by a special parliamentary committee upon ratification, with the authority to declare them odious and void where appropriate, or to </w:t>
+        <w:t>No Canadian government, province, municipality, crown corporation, or public pension fund may ever borrow from, lend to, or enter into derivative contracts with the Bank for International Settlements, the International Monetary Fund, the World Bank, or any banking cartel. Existing obligations to such entities shall be subject to immediate merit-based review by a special parliamentary committee upon ratification, with the authority to declare them odious and void where appropriate, or to pursue analysis, international arbitration, phased repudiation, negotiation, or structured settlements that prioritize the Republic</w:t>
+      </w:r>
+      <w:r>
+        <w:t>’</w:t>
+      </w:r>
+      <w:r>
+        <w:t>s sovereign interests and the prosperity of its citizens.</w:t>
+      </w:r>
+    </w:p>
+    <w:p>
+      <w:pPr>
+        <w:ind w:left="360" w:hanging="360"/>
+      </w:pPr>
+      <w:r>
+        <w:t>12.</w:t>
+      </w:r>
+      <w:r>
+        <w:tab/>
+      </w:r>
+      <w:r>
+        <w:t>Parliament may at any time require partial or full backing of the currency by gold, silver, strategic commodities, or land, but may never delegate that decision to any private or foreign entity.</w:t>
+      </w:r>
+    </w:p>
+    <w:p>
+      <w:pPr>
+        <w:ind w:left="360" w:hanging="360"/>
+      </w:pPr>
+      <w:r>
+        <w:t>13.</w:t>
+      </w:r>
+      <w:r>
+        <w:tab/>
+      </w:r>
+      <w:r>
+        <w:t xml:space="preserve">Any person, Canadian or foreign, who attempts to re-establish private creation of Canadian money as debt, or who conspires to re-impose </w:t>
       </w:r>
       <w:r>
         <w:lastRenderedPageBreak/>
-        <w:t>pursue analysis, international arbitration, phased repudiation, negotiation, or structured settlements that prioritize the Republic</w:t>
-      </w:r>
-      <w:r>
-        <w:t>’</w:t>
-      </w:r>
-      <w:r>
-        <w:t>s sovereign interests and the prosperity of its citizens.</w:t>
-      </w:r>
-    </w:p>
-    <w:p>
-      <w:pPr>
-        <w:ind w:left="360" w:hanging="360"/>
-      </w:pPr>
-      <w:r>
-        <w:t>12.</w:t>
-      </w:r>
-      <w:r>
-        <w:tab/>
-      </w:r>
-      <w:r>
-        <w:t>Parliament may at any time require partial or full backing of the currency by gold, silver, strategic commodities, or land, but may never delegate that decision to any private or foreign entity.</w:t>
-      </w:r>
-    </w:p>
-    <w:p>
-      <w:pPr>
-        <w:ind w:left="360" w:hanging="360"/>
-      </w:pPr>
-      <w:r>
-        <w:t>13.</w:t>
-      </w:r>
-      <w:r>
-        <w:tab/>
-      </w:r>
-      <w:r>
-        <w:t>Any person, Canadian or foreign, who attempts to re-establish private creation of Canadian money as debt, or who conspires to re-impose foreign or private control over the nation’s credit, commits the crime of “Usury Against the Nation”</w:t>
+        <w:t>foreign or private control over the nation’s credit, commits the crime of “Usury Against the Nation”</w:t>
       </w:r>
       <w:r>
         <w:t>,</w:t>
@@ -15368,14 +15367,157 @@
         <w:ind w:left="720" w:hanging="360"/>
       </w:pPr>
       <w:r>
+        <w:t>b)</w:t>
+      </w:r>
+      <w:r>
+        <w:tab/>
+      </w:r>
+      <w:r>
+        <w:t xml:space="preserve">refusal to publish transparent, all-in pricing in advance of treatment; </w:t>
+      </w:r>
+    </w:p>
+    <w:p>
+      <w:pPr>
+        <w:ind w:left="720" w:hanging="360"/>
+      </w:pPr>
+      <w:r>
+        <w:t>c)</w:t>
+      </w:r>
+      <w:r>
+        <w:tab/>
+      </w:r>
+      <w:r>
+        <w:t xml:space="preserve">balance-billing patients beyond published prices; </w:t>
+      </w:r>
+    </w:p>
+    <w:p>
+      <w:pPr>
+        <w:ind w:left="720" w:hanging="360"/>
+      </w:pPr>
+      <w:r>
+        <w:t>d)</w:t>
+      </w:r>
+      <w:r>
+        <w:tab/>
+      </w:r>
+      <w:r>
+        <w:t xml:space="preserve">tying or bundling of services to force purchase of unnecessary procedures or products; </w:t>
+      </w:r>
+    </w:p>
+    <w:p>
+      <w:pPr>
+        <w:ind w:left="720" w:hanging="360"/>
+      </w:pPr>
+      <w:r>
         <w:lastRenderedPageBreak/>
+        <w:t>e)</w:t>
+      </w:r>
+      <w:r>
+        <w:tab/>
+      </w:r>
+      <w:r>
+        <w:t xml:space="preserve">paying or receiving kickbacks, referral fees, or any inducement for patient steering. </w:t>
+      </w:r>
+    </w:p>
+    <w:p>
+      <w:r>
+        <w:t>Violation by any licensed provider or corporate officer shall result in permanent loss of licence to practise or sell in the Republic, personal fines of up to ten times the illicit gain, and imprisonment for repeat or egregious offences.</w:t>
+      </w:r>
+    </w:p>
+    <w:p>
+      <w:pPr>
+        <w:ind w:left="360" w:hanging="360"/>
+      </w:pPr>
+      <w:r>
+        <w:t>6.</w:t>
+      </w:r>
+      <w:r>
+        <w:tab/>
+      </w:r>
+      <w:r>
+        <w:t>The Medical Price and Practice Board shall consist of five members appointed for single ten-year terms</w:t>
+      </w:r>
+      <w:r>
+        <w:t>.</w:t>
+      </w:r>
+      <w:r>
+        <w:t xml:space="preserve"> </w:t>
+      </w:r>
+    </w:p>
+    <w:p>
+      <w:pPr>
+        <w:ind w:left="720" w:hanging="360"/>
+      </w:pPr>
+      <w:r>
+        <w:t>a)</w:t>
+      </w:r>
+      <w:r>
+        <w:tab/>
+      </w:r>
+      <w:r>
+        <w:t xml:space="preserve">two </w:t>
+      </w:r>
+      <w:r>
+        <w:t xml:space="preserve">qualified </w:t>
+      </w:r>
+      <w:r>
+        <w:t xml:space="preserve">health </w:t>
+      </w:r>
+      <w:r>
+        <w:t>expert</w:t>
+      </w:r>
+      <w:r>
+        <w:t>s</w:t>
+      </w:r>
+      <w:r>
+        <w:t xml:space="preserve"> chosen by </w:t>
+      </w:r>
+      <w:r>
+        <w:t xml:space="preserve">lot from the </w:t>
+      </w:r>
+      <w:r>
+        <w:t xml:space="preserve">National </w:t>
+      </w:r>
+      <w:r>
+        <w:t>Registry of Qualified Experts</w:t>
+      </w:r>
+      <w:r>
+        <w:t>;</w:t>
+      </w:r>
+    </w:p>
+    <w:p>
+      <w:pPr>
+        <w:ind w:left="720" w:hanging="360"/>
+      </w:pPr>
+      <w:r>
         <w:t>b)</w:t>
       </w:r>
       <w:r>
         <w:tab/>
       </w:r>
       <w:r>
-        <w:t xml:space="preserve">refusal to publish transparent, all-in pricing in advance of treatment; </w:t>
+        <w:t xml:space="preserve">one </w:t>
+      </w:r>
+      <w:r>
+        <w:t>lay-</w:t>
+      </w:r>
+      <w:r>
+        <w:t>citizen chosen by lot</w:t>
+      </w:r>
+      <w:r>
+        <w:t xml:space="preserve"> from the </w:t>
+      </w:r>
+      <w:r>
+        <w:t xml:space="preserve">National </w:t>
+      </w:r>
+      <w:r>
+        <w:t>Registry of Citizens</w:t>
+      </w:r>
+      <w:r>
+        <w:t>;</w:t>
+      </w:r>
+      <w:r>
+        <w:t xml:space="preserve"> </w:t>
       </w:r>
     </w:p>
     <w:p>
@@ -15389,7 +15531,16 @@
         <w:tab/>
       </w:r>
       <w:r>
-        <w:t xml:space="preserve">balance-billing patients beyond published prices; </w:t>
+        <w:t>one economist or actuary chosen by</w:t>
+      </w:r>
+      <w:r>
+        <w:t xml:space="preserve"> lot from National Registry of Qualified Experts</w:t>
+      </w:r>
+      <w:r>
+        <w:t>;</w:t>
+      </w:r>
+      <w:r>
+        <w:t xml:space="preserve"> and </w:t>
       </w:r>
     </w:p>
     <w:p>
@@ -15403,40 +15554,27 @@
         <w:tab/>
       </w:r>
       <w:r>
-        <w:t xml:space="preserve">tying or bundling of services to force purchase of unnecessary procedures or products; </w:t>
-      </w:r>
-    </w:p>
-    <w:p>
-      <w:pPr>
-        <w:ind w:left="720" w:hanging="360"/>
-      </w:pPr>
-      <w:r>
-        <w:t>e)</w:t>
-      </w:r>
-      <w:r>
-        <w:tab/>
-      </w:r>
-      <w:r>
-        <w:t xml:space="preserve">paying or receiving kickbacks, referral fees, or any inducement for patient steering. </w:t>
-      </w:r>
-    </w:p>
-    <w:p>
-      <w:r>
-        <w:t>Violation by any licensed provider or corporate officer shall result in permanent loss of licence to practise or sell in the Republic, personal fines of up to ten times the illicit gain, and imprisonment for repeat or egregious offences.</w:t>
-      </w:r>
-    </w:p>
-    <w:p>
-      <w:pPr>
-        <w:ind w:left="360" w:hanging="360"/>
-      </w:pPr>
-      <w:r>
-        <w:t>6.</w:t>
-      </w:r>
-      <w:r>
-        <w:tab/>
-      </w:r>
-      <w:r>
-        <w:t>The Medical Price and Practice Board shall consist of five members appointed for single ten-year terms</w:t>
+        <w:t xml:space="preserve">one member chosen by the Supreme Court from the senior judiciary. </w:t>
+      </w:r>
+    </w:p>
+    <w:p>
+      <w:r>
+        <w:t>No member may have held any financial interest in a medical or pharmaceutical</w:t>
+      </w:r>
+      <w:r>
+        <w:t xml:space="preserve"> or any health-related</w:t>
+      </w:r>
+      <w:r>
+        <w:t xml:space="preserve"> enterprise in the previous five years</w:t>
+      </w:r>
+      <w:r>
+        <w:t xml:space="preserve"> nor </w:t>
+      </w:r>
+      <w:r>
+        <w:t xml:space="preserve">may they </w:t>
+      </w:r>
+      <w:r>
+        <w:t>during tenure of term</w:t>
       </w:r>
       <w:r>
         <w:t>.</w:t>
@@ -15444,145 +15582,6 @@
       <w:r>
         <w:t xml:space="preserve"> </w:t>
       </w:r>
-    </w:p>
-    <w:p>
-      <w:pPr>
-        <w:ind w:left="720" w:hanging="360"/>
-      </w:pPr>
-      <w:r>
-        <w:t>a)</w:t>
-      </w:r>
-      <w:r>
-        <w:tab/>
-      </w:r>
-      <w:r>
-        <w:t xml:space="preserve">two </w:t>
-      </w:r>
-      <w:r>
-        <w:t xml:space="preserve">qualified </w:t>
-      </w:r>
-      <w:r>
-        <w:t xml:space="preserve">health </w:t>
-      </w:r>
-      <w:r>
-        <w:t>expert</w:t>
-      </w:r>
-      <w:r>
-        <w:t>s</w:t>
-      </w:r>
-      <w:r>
-        <w:t xml:space="preserve"> chosen by </w:t>
-      </w:r>
-      <w:r>
-        <w:t xml:space="preserve">lot from the </w:t>
-      </w:r>
-      <w:r>
-        <w:t xml:space="preserve">National </w:t>
-      </w:r>
-      <w:r>
-        <w:t>Registry of Qualified Experts</w:t>
-      </w:r>
-      <w:r>
-        <w:t>;</w:t>
-      </w:r>
-    </w:p>
-    <w:p>
-      <w:pPr>
-        <w:ind w:left="720" w:hanging="360"/>
-      </w:pPr>
-      <w:r>
-        <w:t>b)</w:t>
-      </w:r>
-      <w:r>
-        <w:tab/>
-      </w:r>
-      <w:r>
-        <w:t xml:space="preserve">one </w:t>
-      </w:r>
-      <w:r>
-        <w:t>lay-</w:t>
-      </w:r>
-      <w:r>
-        <w:t>citizen chosen by lot</w:t>
-      </w:r>
-      <w:r>
-        <w:t xml:space="preserve"> from the </w:t>
-      </w:r>
-      <w:r>
-        <w:t xml:space="preserve">National </w:t>
-      </w:r>
-      <w:r>
-        <w:t>Registry of Citizens</w:t>
-      </w:r>
-      <w:r>
-        <w:t>;</w:t>
-      </w:r>
-      <w:r>
-        <w:t xml:space="preserve"> </w:t>
-      </w:r>
-    </w:p>
-    <w:p>
-      <w:pPr>
-        <w:ind w:left="720" w:hanging="360"/>
-      </w:pPr>
-      <w:r>
-        <w:t>c)</w:t>
-      </w:r>
-      <w:r>
-        <w:tab/>
-      </w:r>
-      <w:r>
-        <w:t>one economist or actuary chosen by</w:t>
-      </w:r>
-      <w:r>
-        <w:t xml:space="preserve"> lot from National Registry of Qualified Experts</w:t>
-      </w:r>
-      <w:r>
-        <w:t>;</w:t>
-      </w:r>
-      <w:r>
-        <w:t xml:space="preserve"> and </w:t>
-      </w:r>
-    </w:p>
-    <w:p>
-      <w:pPr>
-        <w:ind w:left="720" w:hanging="360"/>
-      </w:pPr>
-      <w:r>
-        <w:t>d)</w:t>
-      </w:r>
-      <w:r>
-        <w:tab/>
-      </w:r>
-      <w:r>
-        <w:t xml:space="preserve">one member chosen by the Supreme Court from the senior judiciary. </w:t>
-      </w:r>
-    </w:p>
-    <w:p>
-      <w:r>
-        <w:t>No member may have held any financial interest in a medical or pharmaceutical</w:t>
-      </w:r>
-      <w:r>
-        <w:t xml:space="preserve"> or any health-related</w:t>
-      </w:r>
-      <w:r>
-        <w:t xml:space="preserve"> enterprise in the previous five years</w:t>
-      </w:r>
-      <w:r>
-        <w:t xml:space="preserve"> nor </w:t>
-      </w:r>
-      <w:r>
-        <w:t xml:space="preserve">may they </w:t>
-      </w:r>
-      <w:r>
-        <w:t>during tenure of term</w:t>
-      </w:r>
-      <w:r>
-        <w:t>.</w:t>
-      </w:r>
-      <w:r>
-        <w:t xml:space="preserve"> </w:t>
-      </w:r>
       <w:r>
         <w:t>Members shall serve full-time, except the judicial member who may retain concurrent duties. Non-judicial members shall receive annual compensation fixed at three times the national median wage. The judicial member shall retain their standard judicial compensation as per Article 14.</w:t>
       </w:r>
@@ -15606,40 +15605,43 @@
         <w:ind w:left="360" w:hanging="360"/>
       </w:pPr>
       <w:r>
+        <w:t>8.</w:t>
+      </w:r>
+      <w:r>
+        <w:tab/>
+      </w:r>
+      <w:r>
+        <w:t>Coerced or fraudulent harvesting of organs</w:t>
+      </w:r>
+      <w:r>
+        <w:t>, tissues,</w:t>
+      </w:r>
+      <w:r>
+        <w:t xml:space="preserve"> or placentas shall be punishable as a crime involving force or fraud, with penalties including up to </w:t>
+      </w:r>
+      <w:r>
+        <w:t>execution</w:t>
+      </w:r>
+      <w:r>
+        <w:t xml:space="preserve"> for acts causing death or irreversible harm. Institutions or professionals found in violation shall face dissolution, licence revocation, and treble damages to affected parties or their heirs.</w:t>
+      </w:r>
+    </w:p>
+    <w:p>
+      <w:pPr>
+        <w:ind w:left="360" w:hanging="360"/>
+      </w:pPr>
+      <w:r>
+        <w:t>9.</w:t>
+      </w:r>
+      <w:r>
+        <w:tab/>
+      </w:r>
+      <w:r>
+        <w:t xml:space="preserve">Organ and tissue harvesting shall be prohibited except in cases of voluntary, informed donation by competent adults, and solely for merit-proven therapeutic or research purposes that advance the health and </w:t>
+      </w:r>
+      <w:r>
         <w:lastRenderedPageBreak/>
-        <w:t>8.</w:t>
-      </w:r>
-      <w:r>
-        <w:tab/>
-      </w:r>
-      <w:r>
-        <w:t>Coerced or fraudulent harvesting of organs</w:t>
-      </w:r>
-      <w:r>
-        <w:t>, tissues,</w:t>
-      </w:r>
-      <w:r>
-        <w:t xml:space="preserve"> or placentas shall be punishable as a crime involving force or fraud, with penalties including up to </w:t>
-      </w:r>
-      <w:r>
-        <w:t>execution</w:t>
-      </w:r>
-      <w:r>
-        <w:t xml:space="preserve"> for acts causing death or irreversible harm. Institutions or professionals found in violation shall face dissolution, licence revocation, and treble damages to affected parties or their heirs.</w:t>
-      </w:r>
-    </w:p>
-    <w:p>
-      <w:pPr>
-        <w:ind w:left="360" w:hanging="360"/>
-      </w:pPr>
-      <w:r>
-        <w:t>9.</w:t>
-      </w:r>
-      <w:r>
-        <w:tab/>
-      </w:r>
-      <w:r>
-        <w:t>Organ and tissue harvesting shall be prohibited except in cases of voluntary, informed donation by competent adults, and solely for merit-proven therapeutic or research purposes that advance the health and continuity of the Republic</w:t>
+        <w:t>continuity of the Republic</w:t>
       </w:r>
       <w:r>
         <w:t>’</w:t>
@@ -15890,14 +15892,76 @@
         <w:ind w:left="720" w:hanging="360"/>
       </w:pPr>
       <w:r>
+        <w:t>a)</w:t>
+      </w:r>
+      <w:r>
+        <w:tab/>
+      </w:r>
+      <w:r>
+        <w:t xml:space="preserve">Critical industries essential to national sovereignty, citizen employment, and supply-chain resilience shall receive targeted state </w:t>
+      </w:r>
+      <w:r>
         <w:lastRenderedPageBreak/>
+        <w:t>support, including protective tariffs, preferential public procurement, and investment from the sovereign wealth fund.</w:t>
+      </w:r>
+    </w:p>
+    <w:p>
+      <w:pPr>
+        <w:ind w:left="720" w:hanging="360"/>
+      </w:pPr>
+      <w:r>
+        <w:t>b)</w:t>
+      </w:r>
+      <w:r>
+        <w:tab/>
+      </w:r>
+      <w:r>
+        <w:t>No trade agreement may be entered that subordinates domestic industrial policy to foreign or supranational jurisdiction. Existing agreements incompatible with this provision shall be abrogated within two years of ratification.</w:t>
+      </w:r>
+    </w:p>
+    <w:p>
+      <w:pPr>
+        <w:ind w:left="720" w:hanging="360"/>
+      </w:pPr>
+      <w:r>
+        <w:t>c)</w:t>
+      </w:r>
+      <w:r>
+        <w:tab/>
+      </w:r>
+      <w:r>
+        <w:t>Priority shall be given to industries providing stable, high-skill employment for citizens, with national preference strictly applied.</w:t>
+      </w:r>
+      <w:r>
+        <w:t xml:space="preserve"> </w:t>
+      </w:r>
+    </w:p>
+    <w:p>
+      <w:pPr>
+        <w:ind w:left="360" w:hanging="360"/>
+      </w:pPr>
+      <w:r>
+        <w:t>7.</w:t>
+      </w:r>
+      <w:r>
+        <w:tab/>
+      </w:r>
+      <w:r>
+        <w:t xml:space="preserve">Drinking water </w:t>
+      </w:r>
+    </w:p>
+    <w:p>
+      <w:pPr>
+        <w:ind w:left="720" w:hanging="360"/>
+      </w:pPr>
+      <w:r>
         <w:t>a)</w:t>
       </w:r>
       <w:r>
         <w:tab/>
       </w:r>
       <w:r>
-        <w:t>Critical industries essential to national sovereignty, citizen employment, and supply-chain resilience shall receive targeted state support, including protective tariffs, preferential public procurement, and investment from the sovereign wealth fund.</w:t>
+        <w:t xml:space="preserve">Every municipality and public water utility shall deliver potable water that meets or exceeds the highest international biological and chemical purity standards. </w:t>
       </w:r>
     </w:p>
     <w:p>
@@ -15911,7 +15975,10 @@
         <w:tab/>
       </w:r>
       <w:r>
-        <w:t>No trade agreement may be entered that subordinates domestic industrial policy to foreign or supranational jurisdiction. Existing agreements incompatible with this provision shall be abrogated within two years of ratification.</w:t>
+        <w:t>W</w:t>
+      </w:r>
+      <w:r>
+        <w:t xml:space="preserve">ater shall be continuously monitored and publicly reported upon by three independent testing laboratories chosen annually by lot from a national registry of accredited facilities. Results shall be posted online in real time and archived permanently. </w:t>
       </w:r>
     </w:p>
     <w:p>
@@ -15925,24 +15992,7 @@
         <w:tab/>
       </w:r>
       <w:r>
-        <w:t>Priority shall be given to industries providing stable, high-skill employment for citizens, with national preference strictly applied.</w:t>
-      </w:r>
-      <w:r>
-        <w:t xml:space="preserve"> </w:t>
-      </w:r>
-    </w:p>
-    <w:p>
-      <w:pPr>
-        <w:ind w:left="360" w:hanging="360"/>
-      </w:pPr>
-      <w:r>
-        <w:t>7.</w:t>
-      </w:r>
-      <w:r>
-        <w:tab/>
-      </w:r>
-      <w:r>
-        <w:t xml:space="preserve">Drinking water </w:t>
+        <w:t xml:space="preserve">No substance, pharmaceutical (including hormonal contraceptives), fluoride, psychotropic compound, nano-material, or any other additive, may be introduced into public drinking water except for the minimum disinfectants strictly necessary for microbiological safety and only with explicit, recorded legislative approval renewable every five years. </w:t>
       </w:r>
     </w:p>
     <w:p>
@@ -15950,13 +16000,41 @@
         <w:ind w:left="720" w:hanging="360"/>
       </w:pPr>
       <w:r>
+        <w:t>d)</w:t>
+      </w:r>
+      <w:r>
+        <w:tab/>
+      </w:r>
+      <w:r>
+        <w:t xml:space="preserve">All systems capable of removing estrogens, pharmaceutical residues, PFAS, heavy metals, and industrial contaminants shall be deployed as technology and finance permit. Failure to upgrade within reasonable time after proven technology becomes available shall be punishable as criminal negligence by the responsible officials. </w:t>
+      </w:r>
+    </w:p>
+    <w:p>
+      <w:pPr>
+        <w:ind w:left="360" w:hanging="360"/>
+      </w:pPr>
+      <w:r>
+        <w:t>8.</w:t>
+      </w:r>
+      <w:r>
+        <w:tab/>
+      </w:r>
+      <w:r>
+        <w:t xml:space="preserve">Waste-water and industrial effluent </w:t>
+      </w:r>
+    </w:p>
+    <w:p>
+      <w:pPr>
+        <w:ind w:left="720" w:hanging="360"/>
+      </w:pPr>
+      <w:r>
         <w:t>a)</w:t>
       </w:r>
       <w:r>
         <w:tab/>
       </w:r>
       <w:r>
-        <w:t xml:space="preserve">Every municipality and public water utility shall deliver potable water that meets or exceeds the highest international biological and chemical purity standards. </w:t>
+        <w:t xml:space="preserve">All municipal and industrial waste-water treatment facilities shall employ best-available technology to remove biological pathogens, pharmaceutical residues, heavy metals, and persistent organic pollutants before discharge into rivers, lakes, aquifers, or the sea. </w:t>
       </w:r>
     </w:p>
     <w:p>
@@ -15970,10 +16048,7 @@
         <w:tab/>
       </w:r>
       <w:r>
-        <w:t>W</w:t>
-      </w:r>
-      <w:r>
-        <w:t xml:space="preserve">ater shall be continuously monitored and publicly reported upon by three independent testing laboratories chosen annually by lot from a national registry of accredited facilities. Results shall be posted online in real time and archived permanently. </w:t>
+        <w:t xml:space="preserve">Treated water returned to the environment must meet or exceed the purity of the receiving body upstream of the discharge point. </w:t>
       </w:r>
     </w:p>
     <w:p>
@@ -15987,7 +16062,95 @@
         <w:tab/>
       </w:r>
       <w:r>
-        <w:t xml:space="preserve">No substance, pharmaceutical (including hormonal contraceptives), fluoride, psychotropic compound, nano-material, or any other additive, may be introduced into public drinking water except for the minimum disinfectants strictly necessary for microbiological safety and only with explicit, recorded legislative approval renewable every five years. </w:t>
+        <w:t xml:space="preserve">Resource-extraction water use (including hydraulic fracturing and oil-sands processing) is permitted provided closed-loop systems or </w:t>
+      </w:r>
+      <w:r>
+        <w:lastRenderedPageBreak/>
+        <w:t xml:space="preserve">equivalent technologies are used wherever feasible and no irreversible contamination of freshwater aquifers occurs. Violations shall incur immediate shutdown and personal liability of corporate officers. </w:t>
+      </w:r>
+    </w:p>
+    <w:p>
+      <w:pPr>
+        <w:ind w:left="360" w:hanging="360"/>
+      </w:pPr>
+      <w:r>
+        <w:t>9.</w:t>
+      </w:r>
+      <w:r>
+        <w:tab/>
+      </w:r>
+      <w:r>
+        <w:t>All infrastructure, energy, water-purification, waste-water, and transportation projects authorised under this Article shall be financed primarily through direct, interest-free credit issued by the Bank of Canada as public money, or through the sovereign wealth fund. No such project may be delayed, scaled back, or cancelled on the pretext of fiscal incapacity or indebtedness to private banking institutions.</w:t>
+      </w:r>
+    </w:p>
+    <w:p>
+      <w:pPr>
+        <w:ind w:left="360" w:hanging="360"/>
+      </w:pPr>
+      <w:r>
+        <w:t>10.</w:t>
+      </w:r>
+      <w:r>
+        <w:tab/>
+      </w:r>
+      <w:r>
+        <w:t>The Republic shall maintain a resilient, decentralised, and human-operable electrical grid capable of indefinite operation even in the complete absence of AI, digital control systems, or foreign-sourced components. Every province shall retain analogue fallback control rooms staffed by trained human operators, and all critical substations shall be capable of islanded manual operation. Dependence on single-point-of-failure digital systems for basic power generation and distribution is prohibited.</w:t>
+      </w:r>
+    </w:p>
+    <w:p>
+      <w:pPr>
+        <w:ind w:left="360" w:hanging="360"/>
+      </w:pPr>
+      <w:r>
+        <w:t>11.</w:t>
+      </w:r>
+      <w:r>
+        <w:tab/>
+      </w:r>
+      <w:r>
+        <w:t xml:space="preserve">The Republic shall maintain a sovereign, cryptographically secure, and physically independent national communications grid encompassing telephone, cellular, internet backbone, and satellite services. </w:t>
+      </w:r>
+    </w:p>
+    <w:p>
+      <w:pPr>
+        <w:ind w:left="360" w:hanging="360"/>
+      </w:pPr>
+      <w:r>
+        <w:t>12.</w:t>
+      </w:r>
+      <w:r>
+        <w:tab/>
+      </w:r>
+      <w:r>
+        <w:t xml:space="preserve">Every citizen’s private communications whether voice, text, video, financial, medical, or any other, are inviolable. No government, corporation, or foreign entity may intercept, store, analyse, or compel the surrender of the content or metadata of any citizen’s communications without a judicial warrant issued on probable cause of a specific, serious crime of violence or fraud, naming the individual and the device, and expiring after ten days. </w:t>
+      </w:r>
+    </w:p>
+    <w:p>
+      <w:pPr>
+        <w:ind w:left="360" w:hanging="360"/>
+      </w:pPr>
+      <w:r>
+        <w:t>13.</w:t>
+      </w:r>
+      <w:r>
+        <w:tab/>
+      </w:r>
+      <w:r>
+        <w:t xml:space="preserve">End-to-end cryptographic protection of communications is a fundamental right. No law, regulation, licence, or court order may ever prohibit, weaken, or compel the disclosure of cryptographic keys, source code, or back-door access to any communications system used by citizens. </w:t>
+      </w:r>
+    </w:p>
+    <w:p>
+      <w:pPr>
+        <w:ind w:left="360" w:hanging="360"/>
+      </w:pPr>
+      <w:r>
+        <w:t>14.</w:t>
+      </w:r>
+      <w:r>
+        <w:tab/>
+      </w:r>
+      <w:r>
+        <w:t>All telecommunications carriers, internet service providers, cloud providers, and payment processors operating within the Republic must:</w:t>
       </w:r>
     </w:p>
     <w:p>
@@ -15995,27 +16158,13 @@
         <w:ind w:left="720" w:hanging="360"/>
       </w:pPr>
       <w:r>
-        <w:t>d)</w:t>
-      </w:r>
-      <w:r>
-        <w:tab/>
-      </w:r>
-      <w:r>
-        <w:t xml:space="preserve">All systems capable of removing estrogens, pharmaceutical residues, PFAS, heavy metals, and industrial contaminants shall be deployed as technology and finance permit. Failure to upgrade within reasonable time after proven technology becomes available shall be punishable as criminal negligence by the responsible officials. </w:t>
-      </w:r>
-    </w:p>
-    <w:p>
-      <w:pPr>
-        <w:ind w:left="360" w:hanging="360"/>
-      </w:pPr>
-      <w:r>
-        <w:t>8.</w:t>
-      </w:r>
-      <w:r>
-        <w:tab/>
-      </w:r>
-      <w:r>
-        <w:t xml:space="preserve">Waste-water and industrial effluent </w:t>
+        <w:t>a)</w:t>
+      </w:r>
+      <w:r>
+        <w:tab/>
+      </w:r>
+      <w:r>
+        <w:t>be incorporated in Canada,</w:t>
       </w:r>
     </w:p>
     <w:p>
@@ -16023,165 +16172,21 @@
         <w:ind w:left="720" w:hanging="360"/>
       </w:pPr>
       <w:r>
+        <w:t>b)</w:t>
+      </w:r>
+      <w:r>
+        <w:tab/>
+      </w:r>
+      <w:r>
+        <w:t>have a majority of directors who are citizens of unmixed European descent,</w:t>
+      </w:r>
+    </w:p>
+    <w:p>
+      <w:pPr>
+        <w:ind w:left="720" w:hanging="360"/>
+      </w:pPr>
+      <w:r>
         <w:lastRenderedPageBreak/>
-        <w:t>a)</w:t>
-      </w:r>
-      <w:r>
-        <w:tab/>
-      </w:r>
-      <w:r>
-        <w:t xml:space="preserve">All municipal and industrial waste-water treatment facilities shall employ best-available technology to remove biological pathogens, pharmaceutical residues, heavy metals, and persistent organic pollutants before discharge into rivers, lakes, aquifers, or the sea. </w:t>
-      </w:r>
-    </w:p>
-    <w:p>
-      <w:pPr>
-        <w:ind w:left="720" w:hanging="360"/>
-      </w:pPr>
-      <w:r>
-        <w:t>b)</w:t>
-      </w:r>
-      <w:r>
-        <w:tab/>
-      </w:r>
-      <w:r>
-        <w:t xml:space="preserve">Treated water returned to the environment must meet or exceed the purity of the receiving body upstream of the discharge point. </w:t>
-      </w:r>
-    </w:p>
-    <w:p>
-      <w:pPr>
-        <w:ind w:left="720" w:hanging="360"/>
-      </w:pPr>
-      <w:r>
-        <w:t>c)</w:t>
-      </w:r>
-      <w:r>
-        <w:tab/>
-      </w:r>
-      <w:r>
-        <w:t xml:space="preserve">Resource-extraction water use (including hydraulic fracturing and oil-sands processing) is permitted provided closed-loop systems or equivalent technologies are used wherever feasible and no irreversible contamination of freshwater aquifers occurs. Violations shall incur immediate shutdown and personal liability of corporate officers. </w:t>
-      </w:r>
-    </w:p>
-    <w:p>
-      <w:pPr>
-        <w:ind w:left="360" w:hanging="360"/>
-      </w:pPr>
-      <w:r>
-        <w:t>9.</w:t>
-      </w:r>
-      <w:r>
-        <w:tab/>
-      </w:r>
-      <w:r>
-        <w:t>All infrastructure, energy, water-purification, waste-water, and transportation projects authorised under this Article shall be financed primarily through direct, interest-free credit issued by the Bank of Canada as public money, or through the sovereign wealth fund. No such project may be delayed, scaled back, or cancelled on the pretext of fiscal incapacity or indebtedness to private banking institutions.</w:t>
-      </w:r>
-    </w:p>
-    <w:p>
-      <w:pPr>
-        <w:ind w:left="360" w:hanging="360"/>
-      </w:pPr>
-      <w:r>
-        <w:t>10.</w:t>
-      </w:r>
-      <w:r>
-        <w:tab/>
-      </w:r>
-      <w:r>
-        <w:t>The Republic shall maintain a resilient, decentralised, and human-operable electrical grid capable of indefinite operation even in the complete absence of AI, digital control systems, or foreign-sourced components. Every province shall retain analogue fallback control rooms staffed by trained human operators, and all critical substations shall be capable of islanded manual operation. Dependence on single-point-of-failure digital systems for basic power generation and distribution is prohibited.</w:t>
-      </w:r>
-    </w:p>
-    <w:p>
-      <w:pPr>
-        <w:ind w:left="360" w:hanging="360"/>
-      </w:pPr>
-      <w:r>
-        <w:t>11.</w:t>
-      </w:r>
-      <w:r>
-        <w:tab/>
-      </w:r>
-      <w:r>
-        <w:t xml:space="preserve">The Republic shall maintain a sovereign, cryptographically secure, and physically independent national communications grid encompassing telephone, cellular, internet backbone, and satellite services. </w:t>
-      </w:r>
-    </w:p>
-    <w:p>
-      <w:pPr>
-        <w:ind w:left="360" w:hanging="360"/>
-      </w:pPr>
-      <w:r>
-        <w:t>12.</w:t>
-      </w:r>
-      <w:r>
-        <w:tab/>
-      </w:r>
-      <w:r>
-        <w:t xml:space="preserve">Every citizen’s private communications whether voice, text, video, financial, medical, or any other, are inviolable. No government, corporation, or foreign entity may intercept, store, analyse, or compel the surrender of the content or metadata of any citizen’s communications without a judicial warrant issued on probable cause of a specific, serious </w:t>
-      </w:r>
-      <w:r>
-        <w:lastRenderedPageBreak/>
-        <w:t xml:space="preserve">crime of violence or fraud, naming the individual and the device, and expiring after ten days. </w:t>
-      </w:r>
-    </w:p>
-    <w:p>
-      <w:pPr>
-        <w:ind w:left="360" w:hanging="360"/>
-      </w:pPr>
-      <w:r>
-        <w:t>13.</w:t>
-      </w:r>
-      <w:r>
-        <w:tab/>
-      </w:r>
-      <w:r>
-        <w:t xml:space="preserve">End-to-end cryptographic protection of communications is a fundamental right. No law, regulation, licence, or court order may ever prohibit, weaken, or compel the disclosure of cryptographic keys, source code, or back-door access to any communications system used by citizens. </w:t>
-      </w:r>
-    </w:p>
-    <w:p>
-      <w:pPr>
-        <w:ind w:left="360" w:hanging="360"/>
-      </w:pPr>
-      <w:r>
-        <w:t>14.</w:t>
-      </w:r>
-      <w:r>
-        <w:tab/>
-      </w:r>
-      <w:r>
-        <w:t>All telecommunications carriers, internet service providers, cloud providers, and payment processors operating within the Republic must:</w:t>
-      </w:r>
-    </w:p>
-    <w:p>
-      <w:pPr>
-        <w:ind w:left="720" w:hanging="360"/>
-      </w:pPr>
-      <w:r>
-        <w:t>a)</w:t>
-      </w:r>
-      <w:r>
-        <w:tab/>
-      </w:r>
-      <w:r>
-        <w:t>be incorporated in Canada,</w:t>
-      </w:r>
-    </w:p>
-    <w:p>
-      <w:pPr>
-        <w:ind w:left="720" w:hanging="360"/>
-      </w:pPr>
-      <w:r>
-        <w:t>b)</w:t>
-      </w:r>
-      <w:r>
-        <w:tab/>
-      </w:r>
-      <w:r>
-        <w:t>have a majority of directors who are citizens of unmixed European descent,</w:t>
-      </w:r>
-    </w:p>
-    <w:p>
-      <w:pPr>
-        <w:ind w:left="720" w:hanging="360"/>
-      </w:pPr>
-      <w:r>
         <w:t>c)</w:t>
       </w:r>
       <w:r>
@@ -16493,46 +16498,49 @@
         <w:ind w:left="360" w:hanging="360"/>
       </w:pPr>
       <w:r>
+        <w:t>6.</w:t>
+      </w:r>
+      <w:r>
+        <w:tab/>
+      </w:r>
+      <w:r>
+        <w:t xml:space="preserve">Private citizens and enterprises remain free to develop and use AI to any degree they choose, provided it does not violate </w:t>
+      </w:r>
+      <w:r>
+        <w:t xml:space="preserve">sections </w:t>
+      </w:r>
+      <w:r>
+        <w:t>2–5 above or threaten the demographic continuity provisions of this Constitution.</w:t>
+      </w:r>
+    </w:p>
+    <w:p>
+      <w:pPr>
+        <w:ind w:left="360" w:hanging="360"/>
+      </w:pPr>
+      <w:r>
+        <w:t>7.</w:t>
+      </w:r>
+      <w:r>
+        <w:tab/>
+      </w:r>
+      <w:r>
+        <w:t xml:space="preserve">Every </w:t>
+      </w:r>
+      <w:r>
+        <w:t>five</w:t>
+      </w:r>
+      <w:r>
+        <w:t xml:space="preserve"> years, beginning five years after ratification, the Supreme Court shall convene a Human Primacy Review Tribunal (modelled exactly on the Special Tribunal of Scientific Review in Article </w:t>
+      </w:r>
+      <w:r>
+        <w:t>2</w:t>
+      </w:r>
+      <w:r>
+        <w:t xml:space="preserve">) to determine whether the combined and cumulative effects of the following are causing </w:t>
+      </w:r>
+      <w:r>
         <w:lastRenderedPageBreak/>
-        <w:t>6.</w:t>
-      </w:r>
-      <w:r>
-        <w:tab/>
-      </w:r>
-      <w:r>
-        <w:t xml:space="preserve">Private citizens and enterprises remain free to develop and use AI to any degree they choose, provided it does not violate </w:t>
-      </w:r>
-      <w:r>
-        <w:t xml:space="preserve">sections </w:t>
-      </w:r>
-      <w:r>
-        <w:t>2–5 above or threaten the demographic continuity provisions of this Constitution.</w:t>
-      </w:r>
-    </w:p>
-    <w:p>
-      <w:pPr>
-        <w:ind w:left="360" w:hanging="360"/>
-      </w:pPr>
-      <w:r>
-        <w:t>7.</w:t>
-      </w:r>
-      <w:r>
-        <w:tab/>
-      </w:r>
-      <w:r>
-        <w:t xml:space="preserve">Every </w:t>
-      </w:r>
-      <w:r>
-        <w:t>five</w:t>
-      </w:r>
-      <w:r>
-        <w:t xml:space="preserve"> years, beginning five years after ratification, the Supreme Court shall convene a Human Primacy Review Tribunal (modelled exactly on the Special Tribunal of Scientific Review in Article </w:t>
-      </w:r>
-      <w:r>
-        <w:t>2</w:t>
-      </w:r>
-      <w:r>
-        <w:t xml:space="preserve">) to determine whether the combined and cumulative effects of the following are causing measurable, population-wide decline in average citizen intelligence, practical competence, physical fitness (as measured by strength, endurance, and body-composition standards), fertility rates, family formation rates, or pairwise conversational ability: </w:t>
+        <w:t xml:space="preserve">measurable, population-wide decline in average citizen intelligence, practical competence, physical fitness (as measured by strength, endurance, and body-composition standards), fertility rates, family formation rates, or pairwise conversational ability: </w:t>
       </w:r>
     </w:p>
     <w:p>
@@ -16740,7 +16748,6 @@
           <w:rFonts w:ascii="Symbol" w:hAnsi="Symbol"/>
           <w:sz w:val="20"/>
         </w:rPr>
-        <w:lastRenderedPageBreak/>
         <w:t></w:t>
       </w:r>
       <w:r>
@@ -16821,7 +16828,11 @@
         <w:t>twelve</w:t>
       </w:r>
       <w:r>
-        <w:t xml:space="preserve"> months of reaching that threshold. If the Tribunal finds probable harm, the technology or platform may be restricted or prohibited by simple majority vote of the Tribunal until a full </w:t>
+        <w:t xml:space="preserve"> months of reaching that threshold. If the Tribunal finds probable harm, </w:t>
+      </w:r>
+      <w:r>
+        <w:lastRenderedPageBreak/>
+        <w:t xml:space="preserve">the technology or platform may be restricted or prohibited by simple majority vote of the Tribunal until a full </w:t>
       </w:r>
       <w:r>
         <w:t>bi-</w:t>
@@ -17008,11 +17019,11 @@
         <w:tab/>
       </w:r>
       <w:r>
-        <w:t xml:space="preserve">Any citizen of unmixed European descent aged twenty-one or older, of good character, and willing to occupy and improve the land personally, may stake a homestead claim of up to 160 acres (64 hectares) of unoccupied, unpatented land in the National Domain north of the 55th parallel or in designated frontier zones. After five continuous years of </w:t>
+        <w:t xml:space="preserve">Any citizen of unmixed European descent aged twenty-one or older, of good character, and willing to occupy and improve the land personally, may stake a homestead claim of up to 160 acres (64 hectares) of unoccupied, unpatented land in the National Domain north of the 55th parallel or in designated frontier zones. After five continuous years of residence and visible improvement (dwelling, fencing, clearing, or </w:t>
       </w:r>
       <w:r>
         <w:lastRenderedPageBreak/>
-        <w:t>residence and visible improvement (dwelling, fencing, clearing, or productive agriculture), full fee-simple title shall issue free of charge. Homestead land may never be sold or transferred to non-citizens or to any corporation. It descends to lineal heirs or reverts to the National Domain. Provinces may establish parallel homesteading programmes on provincial public land under the same terms.</w:t>
+        <w:t>productive agriculture), full fee-simple title shall issue free of charge. Homestead land may never be sold or transferred to non-citizens or to any corporation. It descends to lineal heirs or reverts to the National Domain. Provinces may establish parallel homesteading programmes on provincial public land under the same terms.</w:t>
       </w:r>
       <w:r>
         <w:t xml:space="preserve"> </w:t>
@@ -17094,28 +17105,28 @@
         <w:tab/>
       </w:r>
       <w:r>
-        <w:t xml:space="preserve">All government-funded or government-mandated software, communication protocols, and data formats shall be fully open-source and royalty-free in perpetuity. No citizen or enterprise may be compelled to use </w:t>
+        <w:t>All government-funded or government-mandated software, communication protocols, and data formats shall be fully open-source and royalty-free in perpetuity. No citizen or enterprise may be compelled to use proprietary, closed-source systems for any interaction with the state or for participation in the economy.</w:t>
+      </w:r>
+      <w:r>
+        <w:t xml:space="preserve"> </w:t>
+      </w:r>
+    </w:p>
+    <w:p>
+      <w:pPr>
+        <w:ind w:left="360" w:hanging="360"/>
+      </w:pPr>
+      <w:r>
+        <w:t>10.</w:t>
+      </w:r>
+      <w:r>
+        <w:tab/>
+      </w:r>
+      <w:r>
+        <w:t xml:space="preserve">Interest rates on secured loans for family homes or family farms may never exceed four percent simple interest per annum. Violation is a felony. </w:t>
       </w:r>
       <w:r>
         <w:lastRenderedPageBreak/>
-        <w:t>proprietary, closed-source systems for any interaction with the state or for participation in the economy.</w:t>
-      </w:r>
-      <w:r>
-        <w:t xml:space="preserve"> </w:t>
-      </w:r>
-    </w:p>
-    <w:p>
-      <w:pPr>
-        <w:ind w:left="360" w:hanging="360"/>
-      </w:pPr>
-      <w:r>
-        <w:t>10.</w:t>
-      </w:r>
-      <w:r>
-        <w:tab/>
-      </w:r>
-      <w:r>
-        <w:t>Interest rates on secured loans for family homes or family farms may never exceed four percent simple interest per annum. Violation is a felony. Predatory lending, payday loans, and revolving consumer debt at rates above ten percent simple interest are permanently banned.</w:t>
+        <w:t>Predatory lending, payday loans, and revolving consumer debt at rates above ten percent simple interest are permanently banned.</w:t>
       </w:r>
       <w:r>
         <w:t xml:space="preserve"> </w:t>
@@ -17378,11 +17389,11 @@
         <w:tab/>
       </w:r>
       <w:r>
-        <w:t xml:space="preserve">Provincial authorities may authorise temporary, localised hail-suppression or tornado-dissipation operations using established, non-persistent agents (e.g., silver iodide flares) only when a specific, imminent, and severe storm threatens a major population centre or critical infrastructure, and only for </w:t>
+        <w:t xml:space="preserve">Provincial authorities may authorise temporary, localised hail-suppression or tornado-dissipation operations using established, non-persistent agents (e.g., silver iodide flares) only when a specific, imminent, and severe storm threatens a major population centre or critical infrastructure, and only for the duration of that immediate threat. Every such operation must be publicly announced 24 hours in advance or immediately if urgency forbids, live-streamed when possible, independently monitored, and fully reported </w:t>
       </w:r>
       <w:r>
         <w:lastRenderedPageBreak/>
-        <w:t>the duration of that immediate threat. Every such operation must be publicly announced 24 hours in advance or immediately if urgency forbids, live-streamed when possible, independently monitored, and fully reported to the provincial legislature within seven days. Any use outside these strict limits shall be punished as treason.</w:t>
+        <w:t>to the provincial legislature within seven days. Any use outside these strict limits shall be punished as treason.</w:t>
       </w:r>
       <w:r>
         <w:t xml:space="preserve"> </w:t>
@@ -17482,14 +17493,42 @@
         <w:ind w:left="720" w:hanging="360"/>
       </w:pPr>
       <w:r>
+        <w:t>a)</w:t>
+      </w:r>
+      <w:r>
+        <w:tab/>
+      </w:r>
+      <w:r>
+        <w:t xml:space="preserve">issuance and management of hunting, fishing, and trapping licences and seasons; </w:t>
+      </w:r>
+    </w:p>
+    <w:p>
+      <w:pPr>
+        <w:ind w:left="720" w:hanging="360"/>
+      </w:pPr>
+      <w:r>
+        <w:t>b)</w:t>
+      </w:r>
+      <w:r>
+        <w:tab/>
+      </w:r>
+      <w:r>
+        <w:t xml:space="preserve">classification, protection, and active recovery of endangered or threatened native species; </w:t>
+      </w:r>
+    </w:p>
+    <w:p>
+      <w:pPr>
+        <w:ind w:left="720" w:hanging="360"/>
+      </w:pPr>
+      <w:r>
         <w:lastRenderedPageBreak/>
-        <w:t>a)</w:t>
-      </w:r>
-      <w:r>
-        <w:tab/>
-      </w:r>
-      <w:r>
-        <w:t xml:space="preserve">issuance and management of hunting, fishing, and trapping licences and seasons; </w:t>
+        <w:t>c)</w:t>
+      </w:r>
+      <w:r>
+        <w:tab/>
+      </w:r>
+      <w:r>
+        <w:t xml:space="preserve">setting and enforcement of air- and water-quality standards throughout the province, including industrial emissions, urban air pollution, and agricultural runoff; </w:t>
       </w:r>
     </w:p>
     <w:p>
@@ -17497,13 +17536,13 @@
         <w:ind w:left="720" w:hanging="360"/>
       </w:pPr>
       <w:r>
-        <w:t>b)</w:t>
-      </w:r>
-      <w:r>
-        <w:tab/>
-      </w:r>
-      <w:r>
-        <w:t xml:space="preserve">classification, protection, and active recovery of endangered or threatened native species; </w:t>
+        <w:t>d)</w:t>
+      </w:r>
+      <w:r>
+        <w:tab/>
+      </w:r>
+      <w:r>
+        <w:t xml:space="preserve">oversight of waste collection, recycling, treatment, and disposal (including hazardous and medical waste); </w:t>
       </w:r>
     </w:p>
     <w:p>
@@ -17511,13 +17550,13 @@
         <w:ind w:left="720" w:hanging="360"/>
       </w:pPr>
       <w:r>
-        <w:t>c)</w:t>
-      </w:r>
-      <w:r>
-        <w:tab/>
-      </w:r>
-      <w:r>
-        <w:t xml:space="preserve">setting and enforcement of air- and water-quality standards throughout the province, including industrial emissions, urban air pollution, and agricultural runoff; </w:t>
+        <w:t>e)</w:t>
+      </w:r>
+      <w:r>
+        <w:tab/>
+      </w:r>
+      <w:r>
+        <w:t xml:space="preserve">remediation of contaminated sites and brownfields; </w:t>
       </w:r>
     </w:p>
     <w:p>
@@ -17525,13 +17564,13 @@
         <w:ind w:left="720" w:hanging="360"/>
       </w:pPr>
       <w:r>
-        <w:t>d)</w:t>
-      </w:r>
-      <w:r>
-        <w:tab/>
-      </w:r>
-      <w:r>
-        <w:t xml:space="preserve">oversight of waste collection, recycling, treatment, and disposal (including hazardous and medical waste); </w:t>
+        <w:t>f)</w:t>
+      </w:r>
+      <w:r>
+        <w:tab/>
+      </w:r>
+      <w:r>
+        <w:t xml:space="preserve">establishment of bounties where necessary for invasive or overpopulated species; </w:t>
       </w:r>
     </w:p>
     <w:p>
@@ -17539,34 +17578,6 @@
         <w:ind w:left="720" w:hanging="360"/>
       </w:pPr>
       <w:r>
-        <w:t>e)</w:t>
-      </w:r>
-      <w:r>
-        <w:tab/>
-      </w:r>
-      <w:r>
-        <w:t xml:space="preserve">remediation of contaminated sites and brownfields; </w:t>
-      </w:r>
-    </w:p>
-    <w:p>
-      <w:pPr>
-        <w:ind w:left="720" w:hanging="360"/>
-      </w:pPr>
-      <w:r>
-        <w:t>f)</w:t>
-      </w:r>
-      <w:r>
-        <w:tab/>
-      </w:r>
-      <w:r>
-        <w:t xml:space="preserve">establishment of bounties where necessary for invasive or overpopulated species; </w:t>
-      </w:r>
-    </w:p>
-    <w:p>
-      <w:pPr>
-        <w:ind w:left="720" w:hanging="360"/>
-      </w:pPr>
-      <w:r>
         <w:t>g)</w:t>
       </w:r>
       <w:r>
@@ -17609,42 +17620,45 @@
         <w:pStyle w:val="ListParagraph"/>
       </w:pPr>
       <w:r>
+        <w:t>Hunting, fishing, and trapping for sustenance, recreation, or management shall remain honoured traditions, regulated to ensure thriving populations and fair access for competent citizens.</w:t>
+      </w:r>
+    </w:p>
+    <w:p>
+      <w:pPr>
+        <w:ind w:left="360" w:hanging="360"/>
+      </w:pPr>
+      <w:r>
+        <w:t>7.</w:t>
+      </w:r>
+      <w:r>
+        <w:tab/>
+      </w:r>
+      <w:r>
+        <w:t>No province may delegate, privatise, or transfer the core regulatory powers listed in</w:t>
+      </w:r>
+      <w:r>
+        <w:t xml:space="preserve"> this Article</w:t>
+      </w:r>
+      <w:r>
+        <w:t xml:space="preserve"> to any non-governmental or international entity.</w:t>
+      </w:r>
+    </w:p>
+    <w:p>
+      <w:pPr>
+        <w:ind w:left="360" w:hanging="360"/>
+      </w:pPr>
+      <w:r>
+        <w:t>8.</w:t>
+      </w:r>
+      <w:r>
+        <w:tab/>
+      </w:r>
+      <w:r>
+        <w:t xml:space="preserve">All subsoil resources, hydrocarbons, and strategic minerals within the territory of the Republic are the inalienable patrimony of the Canadian people and their posterity. No foreign person, foreign state, or corporation more than ten percent foreign-owned may ever acquire outright ownership of mineral rights or hold resource-extraction leases longer than twenty-five </w:t>
+      </w:r>
+      <w:r>
         <w:lastRenderedPageBreak/>
-        <w:t>Hunting, fishing, and trapping for sustenance, recreation, or management shall remain honoured traditions, regulated to ensure thriving populations and fair access for competent citizens.</w:t>
-      </w:r>
-    </w:p>
-    <w:p>
-      <w:pPr>
-        <w:ind w:left="360" w:hanging="360"/>
-      </w:pPr>
-      <w:r>
-        <w:t>7.</w:t>
-      </w:r>
-      <w:r>
-        <w:tab/>
-      </w:r>
-      <w:r>
-        <w:t>No province may delegate, privatise, or transfer the core regulatory powers listed in</w:t>
-      </w:r>
-      <w:r>
-        <w:t xml:space="preserve"> this Article</w:t>
-      </w:r>
-      <w:r>
-        <w:t xml:space="preserve"> to any non-governmental or international entity.</w:t>
-      </w:r>
-    </w:p>
-    <w:p>
-      <w:pPr>
-        <w:ind w:left="360" w:hanging="360"/>
-      </w:pPr>
-      <w:r>
-        <w:t>8.</w:t>
-      </w:r>
-      <w:r>
-        <w:tab/>
-      </w:r>
-      <w:r>
-        <w:t>All subsoil resources, hydrocarbons, and strategic minerals within the territory of the Republic are the inalienable patrimony of the Canadian people and their posterity. No foreign person, foreign state, or corporation more than ten percent foreign-owned may ever acquire outright ownership of mineral rights or hold resource-extraction leases longer than twenty-five years. All resource revenues, after reasonable production costs, accrue exclusively to the sovereign wealth fund created under Article 22 for the equal benefit of citizens.</w:t>
+        <w:t>years. All resource revenues, after reasonable production costs, accrue exclusively to the sovereign wealth fund created under Article 22 for the equal benefit of citizens.</w:t>
       </w:r>
     </w:p>
     <w:p>
@@ -18150,7 +18164,6 @@
           <w:lang w:eastAsia="en-CA"/>
           <w14:ligatures w14:val="none"/>
         </w:rPr>
-        <w:lastRenderedPageBreak/>
         <w:t>6.</w:t>
       </w:r>
       <w:r>
@@ -18177,6 +18190,7 @@
         <w:rPr>
           <w:lang w:eastAsia="en-CA"/>
         </w:rPr>
+        <w:lastRenderedPageBreak/>
         <w:t>7.</w:t>
       </w:r>
       <w:r>
@@ -18565,24 +18579,21 @@
         <w:tab/>
       </w:r>
       <w:r>
-        <w:t xml:space="preserve">The armed forces of the Republic shall maintain dedicated capabilities for the suppression of wildland fires threatening the territory, citizens, infrastructure, and ecological integrity of the nation. This mission includes procurement, maintenance, and operation of aerial water-bomber fleets, ground suppression units, and preventive fuel-management operations on public lands. During peacetime and compulsory service, personnel shall receive training in wildland firefighting techniques, aerial coordination, and environmental stewardship. Provincial authorities retain primary coordination of routine fire management, with military assets activated upon provincial request or national declaration when civilian resources are overwhelmed. Such fire-suppression forces may be deployed to foreign nations upon their request for humanitarian assistance in combating wildfires or similar natural disasters, without such deployment being </w:t>
-      </w:r>
+        <w:t>The armed forces of the Republic shall maintain dedicated capabilities for the suppression of wildland fires threatening the territory, citizens, infrastructure, and ecological integrity of the nation. This mission includes procurement, maintenance, and operation of aerial water-bomber fleets, ground suppression units, and preventive fuel-management operations on public lands. During peacetime and compulsory service, personnel shall receive training in wildland firefighting techniques, aerial coordination, and environmental stewardship. Provincial authorities retain primary coordination of routine fire management, with military assets activated upon provincial request or national declaration when civilian resources are overwhelmed. Such fire-suppression forces may be deployed to foreign nations upon their request for humanitarian assistance in combating wildfires or similar natural disasters, without such deployment being construed as a military action or implying any threat to the recipient nation</w:t>
+      </w:r>
+      <w:r>
+        <w:t>’</w:t>
+      </w:r>
+      <w:r>
+        <w:t>s sovereignty.</w:t>
+      </w:r>
+    </w:p>
+    <w:p>
+      <w:pPr>
+        <w:ind w:left="360" w:hanging="360"/>
+      </w:pPr>
       <w:r>
         <w:lastRenderedPageBreak/>
-        <w:t>construed as a military action or implying any threat to the recipient nation</w:t>
-      </w:r>
-      <w:r>
-        <w:t>’</w:t>
-      </w:r>
-      <w:r>
-        <w:t>s sovereignty.</w:t>
-      </w:r>
-    </w:p>
-    <w:p>
-      <w:pPr>
-        <w:ind w:left="360" w:hanging="360"/>
-      </w:pPr>
-      <w:r>
         <w:t>5)</w:t>
       </w:r>
       <w:r>
@@ -18688,135 +18699,197 @@
         <w:ind w:left="720" w:hanging="360"/>
       </w:pPr>
       <w:r>
+        <w:t>a)</w:t>
+      </w:r>
+      <w:r>
+        <w:tab/>
+      </w:r>
+      <w:r>
+        <w:t xml:space="preserve">The Republic of Canada Mounted Police (RCMP) is the sole national police force with exclusive jurisdiction over:  </w:t>
+      </w:r>
+    </w:p>
+    <w:p>
+      <w:pPr>
+        <w:ind w:left="1080" w:hanging="360"/>
+      </w:pPr>
+      <w:r>
+        <w:t>i)</w:t>
+      </w:r>
+      <w:r>
+        <w:tab/>
+      </w:r>
+      <w:r>
+        <w:t xml:space="preserve">high treason and crimes against the Constitution,  </w:t>
+      </w:r>
+    </w:p>
+    <w:p>
+      <w:pPr>
+        <w:ind w:left="1080" w:hanging="360"/>
+      </w:pPr>
+      <w:r>
+        <w:t>ii)</w:t>
+      </w:r>
+      <w:r>
+        <w:tab/>
+      </w:r>
+      <w:r>
+        <w:t xml:space="preserve">organised crime crossing provincial boundaries,  </w:t>
+      </w:r>
+    </w:p>
+    <w:p>
+      <w:pPr>
+        <w:ind w:left="1080" w:hanging="360"/>
+      </w:pPr>
+      <w:r>
+        <w:t>iii)</w:t>
+      </w:r>
+      <w:r>
+        <w:tab/>
+      </w:r>
+      <w:r>
+        <w:t xml:space="preserve">illicit drug manufacturing, trafficking, and importation,  </w:t>
+      </w:r>
+    </w:p>
+    <w:p>
+      <w:pPr>
+        <w:ind w:left="1080" w:hanging="360"/>
+      </w:pPr>
+      <w:r>
+        <w:t>iv)</w:t>
+      </w:r>
+      <w:r>
+        <w:tab/>
+      </w:r>
+      <w:r>
+        <w:t xml:space="preserve">terrorism,  </w:t>
+      </w:r>
+    </w:p>
+    <w:p>
+      <w:pPr>
+        <w:ind w:left="1080" w:hanging="360"/>
+      </w:pPr>
+      <w:r>
+        <w:t>v)</w:t>
+      </w:r>
+      <w:r>
+        <w:tab/>
+      </w:r>
+      <w:r>
+        <w:t xml:space="preserve">human trafficking and sexual exploitation,  </w:t>
+      </w:r>
+    </w:p>
+    <w:p>
+      <w:pPr>
+        <w:ind w:left="1080" w:hanging="360"/>
+      </w:pPr>
+      <w:r>
         <w:lastRenderedPageBreak/>
+        <w:t>vi)</w:t>
+      </w:r>
+      <w:r>
+        <w:tab/>
+      </w:r>
+      <w:r>
+        <w:t>all forms of telecommunications, financial, and cryptographic fraud and scams,</w:t>
+      </w:r>
+    </w:p>
+    <w:p>
+      <w:pPr>
+        <w:ind w:left="1080" w:hanging="360"/>
+      </w:pPr>
+      <w:r>
+        <w:t>vii)</w:t>
+      </w:r>
+      <w:r>
+        <w:tab/>
+      </w:r>
+      <w:r>
+        <w:t xml:space="preserve">protection of the </w:t>
+      </w:r>
+      <w:r>
+        <w:t>Prime Minister</w:t>
+      </w:r>
+      <w:r>
+        <w:t xml:space="preserve">, ministers, judges, and critical national infrastructure.  </w:t>
+      </w:r>
+    </w:p>
+    <w:p>
+      <w:r>
+        <w:t xml:space="preserve">The RCMP shall maintain an elite, heavily armed, rapid-response capability and shall be granted full statutory authority to investigate and dismantle any criminal organisation exploiting </w:t>
+      </w:r>
+      <w:r>
+        <w:t>Canadian</w:t>
+      </w:r>
+      <w:r>
+        <w:t xml:space="preserve"> citizens</w:t>
+      </w:r>
+      <w:r>
+        <w:t xml:space="preserve"> or territory</w:t>
+      </w:r>
+      <w:r>
+        <w:t>.</w:t>
+      </w:r>
+    </w:p>
+    <w:p>
+      <w:pPr>
+        <w:ind w:left="720" w:hanging="360"/>
+      </w:pPr>
+      <w:r>
+        <w:t>b)</w:t>
+      </w:r>
+      <w:r>
+        <w:tab/>
+      </w:r>
+      <w:r>
+        <w:t xml:space="preserve">Routine policing, traffic-law enforcement, provincial criminal code enforcement, and all other matters of public order remain the exclusive responsibility of provincial and municipal police services. Provinces may create or contract their own police </w:t>
+      </w:r>
+      <w:r>
+        <w:t>forces but</w:t>
+      </w:r>
+      <w:r>
+        <w:t xml:space="preserve"> may never delegate policing powers to private corporations or foreign entities.</w:t>
+      </w:r>
+    </w:p>
+    <w:p>
+      <w:pPr>
+        <w:ind w:left="360" w:hanging="360"/>
+      </w:pPr>
+      <w:r>
+        <w:t>11)</w:t>
+      </w:r>
+      <w:r>
+        <w:tab/>
+      </w:r>
+      <w:r>
+        <w:t>No military or police force may ever be used against peaceful citizens exercising rights guaranteed by this Constitution. Any officer who issues or obeys an order to do so commits high treason.</w:t>
+      </w:r>
+    </w:p>
+    <w:p>
+      <w:pPr>
+        <w:ind w:left="360" w:hanging="360"/>
+      </w:pPr>
+      <w:r>
+        <w:t>12)</w:t>
+      </w:r>
+      <w:r>
+        <w:tab/>
+      </w:r>
+      <w:r>
+        <w:t>The Republic shall maintain such intelligence and counter-intelligence agencies as the House of the Republic deems necessary for the defence of the Constitution and the continued existence of the nation.</w:t>
+      </w:r>
+    </w:p>
+    <w:p>
+      <w:pPr>
+        <w:ind w:left="720" w:hanging="360"/>
+      </w:pPr>
+      <w:r>
         <w:t>a)</w:t>
       </w:r>
       <w:r>
         <w:tab/>
       </w:r>
       <w:r>
-        <w:t xml:space="preserve">The Republic of Canada Mounted Police (RCMP) is the sole national police force with exclusive jurisdiction over:  </w:t>
-      </w:r>
-    </w:p>
-    <w:p>
-      <w:pPr>
-        <w:ind w:left="1080" w:hanging="360"/>
-      </w:pPr>
-      <w:r>
-        <w:t>i)</w:t>
-      </w:r>
-      <w:r>
-        <w:tab/>
-      </w:r>
-      <w:r>
-        <w:t xml:space="preserve">high treason and crimes against the Constitution,  </w:t>
-      </w:r>
-    </w:p>
-    <w:p>
-      <w:pPr>
-        <w:ind w:left="1080" w:hanging="360"/>
-      </w:pPr>
-      <w:r>
-        <w:t>ii)</w:t>
-      </w:r>
-      <w:r>
-        <w:tab/>
-      </w:r>
-      <w:r>
-        <w:t xml:space="preserve">organised crime crossing provincial boundaries,  </w:t>
-      </w:r>
-    </w:p>
-    <w:p>
-      <w:pPr>
-        <w:ind w:left="1080" w:hanging="360"/>
-      </w:pPr>
-      <w:r>
-        <w:t>iii)</w:t>
-      </w:r>
-      <w:r>
-        <w:tab/>
-      </w:r>
-      <w:r>
-        <w:t xml:space="preserve">illicit drug manufacturing, trafficking, and importation,  </w:t>
-      </w:r>
-    </w:p>
-    <w:p>
-      <w:pPr>
-        <w:ind w:left="1080" w:hanging="360"/>
-      </w:pPr>
-      <w:r>
-        <w:t>iv)</w:t>
-      </w:r>
-      <w:r>
-        <w:tab/>
-      </w:r>
-      <w:r>
-        <w:t xml:space="preserve">terrorism,  </w:t>
-      </w:r>
-    </w:p>
-    <w:p>
-      <w:pPr>
-        <w:ind w:left="1080" w:hanging="360"/>
-      </w:pPr>
-      <w:r>
-        <w:t>v)</w:t>
-      </w:r>
-      <w:r>
-        <w:tab/>
-      </w:r>
-      <w:r>
-        <w:t xml:space="preserve">human trafficking and sexual exploitation,  </w:t>
-      </w:r>
-    </w:p>
-    <w:p>
-      <w:pPr>
-        <w:ind w:left="1080" w:hanging="360"/>
-      </w:pPr>
-      <w:r>
-        <w:t>vi)</w:t>
-      </w:r>
-      <w:r>
-        <w:tab/>
-      </w:r>
-      <w:r>
-        <w:t>all forms of telecommunications, financial, and cryptographic fraud and scams,</w:t>
-      </w:r>
-    </w:p>
-    <w:p>
-      <w:pPr>
-        <w:ind w:left="1080" w:hanging="360"/>
-      </w:pPr>
-      <w:r>
-        <w:t>vii)</w:t>
-      </w:r>
-      <w:r>
-        <w:tab/>
-      </w:r>
-      <w:r>
-        <w:t xml:space="preserve">protection of the </w:t>
-      </w:r>
-      <w:r>
-        <w:t>Prime Minister</w:t>
-      </w:r>
-      <w:r>
-        <w:t xml:space="preserve">, ministers, judges, and critical national infrastructure.  </w:t>
-      </w:r>
-    </w:p>
-    <w:p>
-      <w:r>
-        <w:t xml:space="preserve">The RCMP shall maintain an elite, heavily armed, rapid-response capability and shall be granted full statutory authority to investigate and dismantle any criminal organisation exploiting </w:t>
-      </w:r>
-      <w:r>
-        <w:t>Canadian</w:t>
-      </w:r>
-      <w:r>
-        <w:t xml:space="preserve"> citizens</w:t>
-      </w:r>
-      <w:r>
-        <w:t xml:space="preserve"> or territory</w:t>
-      </w:r>
-      <w:r>
-        <w:t>.</w:t>
+        <w:t>All intelligence agencies are subordinate to civilian authority, accountable to the Prime Minister and the House, and prohibited from any domestic surveillance of lawful political activity or speech.</w:t>
       </w:r>
     </w:p>
     <w:p>
@@ -18830,41 +18903,7 @@
         <w:tab/>
       </w:r>
       <w:r>
-        <w:t xml:space="preserve">Routine policing, traffic-law enforcement, provincial criminal code enforcement, and all other matters of public order remain the exclusive responsibility of provincial and municipal police services. Provinces may create or contract their own police </w:t>
-      </w:r>
-      <w:r>
-        <w:t>forces but</w:t>
-      </w:r>
-      <w:r>
-        <w:t xml:space="preserve"> may never delegate policing powers to private corporations or foreign entities.</w:t>
-      </w:r>
-    </w:p>
-    <w:p>
-      <w:pPr>
-        <w:ind w:left="360" w:hanging="360"/>
-      </w:pPr>
-      <w:r>
-        <w:t>11)</w:t>
-      </w:r>
-      <w:r>
-        <w:tab/>
-      </w:r>
-      <w:r>
-        <w:t>No military or police force may ever be used against peaceful citizens exercising rights guaranteed by this Constitution. Any officer who issues or obeys an order to do so commits high treason.</w:t>
-      </w:r>
-    </w:p>
-    <w:p>
-      <w:pPr>
-        <w:ind w:left="360" w:hanging="360"/>
-      </w:pPr>
-      <w:r>
-        <w:t>12)</w:t>
-      </w:r>
-      <w:r>
-        <w:tab/>
-      </w:r>
-      <w:r>
-        <w:t>The Republic shall maintain such intelligence and counter-intelligence agencies as the House of the Republic deems necessary for the defence of the Constitution and the continued existence of the nation.</w:t>
+        <w:t>Their organisation, methods, capabilities, and budgets shall be determined by ordinary legislation and revised as technology and threats evolve.</w:t>
       </w:r>
     </w:p>
     <w:p>
@@ -18872,13 +18911,13 @@
         <w:ind w:left="720" w:hanging="360"/>
       </w:pPr>
       <w:r>
-        <w:t>a)</w:t>
-      </w:r>
-      <w:r>
-        <w:tab/>
-      </w:r>
-      <w:r>
-        <w:t>All intelligence agencies are subordinate to civilian authority, accountable to the Prime Minister and the House, and prohibited from any domestic surveillance of lawful political activity or speech.</w:t>
+        <w:t>c)</w:t>
+      </w:r>
+      <w:r>
+        <w:tab/>
+      </w:r>
+      <w:r>
+        <w:t>No offensive military deployment beyond the territory of the Republic may be ordered or commenced on the basis of an intelligence assessment that a foreign state or non-state actor has attacked the Republic or its citizens until that assessment has been subjected to an accelerated Special Tribunal of Review (modelled on Article 2) convened within 72 hours of the assessment being presented to the Prime Minister or the House. The Tribunal’s decision is binding, and any deployment commenced in violation of this section is unlawful.</w:t>
       </w:r>
     </w:p>
     <w:p>
@@ -18887,34 +18926,6 @@
       </w:pPr>
       <w:r>
         <w:lastRenderedPageBreak/>
-        <w:t>b)</w:t>
-      </w:r>
-      <w:r>
-        <w:tab/>
-      </w:r>
-      <w:r>
-        <w:t>Their organisation, methods, capabilities, and budgets shall be determined by ordinary legislation and revised as technology and threats evolve.</w:t>
-      </w:r>
-    </w:p>
-    <w:p>
-      <w:pPr>
-        <w:ind w:left="720" w:hanging="360"/>
-      </w:pPr>
-      <w:r>
-        <w:t>c)</w:t>
-      </w:r>
-      <w:r>
-        <w:tab/>
-      </w:r>
-      <w:r>
-        <w:t>No offensive military deployment beyond the territory of the Republic may be ordered or commenced on the basis of an intelligence assessment that a foreign state or non-state actor has attacked the Republic or its citizens until that assessment has been subjected to an accelerated Special Tribunal of Review (modelled on Article 2) convened within 72 hours of the assessment being presented to the Prime Minister or the House. The Tribunal’s decision is binding, and any deployment commenced in violation of this section is unlawful.</w:t>
-      </w:r>
-    </w:p>
-    <w:p>
-      <w:pPr>
-        <w:ind w:left="720" w:hanging="360"/>
-      </w:pPr>
-      <w:r>
         <w:t>d)</w:t>
       </w:r>
       <w:r>
@@ -19127,18 +19138,15 @@
         <w:t xml:space="preserve"> airspace,</w:t>
       </w:r>
       <w:r>
-        <w:t xml:space="preserve"> pipelines, power transmission lines, and telecommunications infrastructure. No province may impose </w:t>
-      </w:r>
+        <w:t xml:space="preserve"> pipelines, power transmission lines, and telecommunications infrastructure. No province may impose tariffs, blockades, discriminatory fees, or regulatory barriers on goods, services, energy, or persons in transit to or from another province.</w:t>
+      </w:r>
+    </w:p>
+    <w:p>
+      <w:pPr>
+        <w:ind w:left="360" w:hanging="360"/>
+      </w:pPr>
       <w:r>
         <w:lastRenderedPageBreak/>
-        <w:t>tariffs, blockades, discriminatory fees, or regulatory barriers on goods, services, energy, or persons in transit to or from another province.</w:t>
-      </w:r>
-    </w:p>
-    <w:p>
-      <w:pPr>
-        <w:ind w:left="360" w:hanging="360"/>
-      </w:pPr>
-      <w:r>
         <w:t>6.</w:t>
       </w:r>
       <w:r>
@@ -19225,7 +19233,6 @@
     <w:p/>
     <w:p>
       <w:r>
-        <w:lastRenderedPageBreak/>
         <w:br w:type="page"/>
       </w:r>
     </w:p>
@@ -19426,21 +19433,21 @@
         <w:ind w:left="360" w:hanging="360"/>
       </w:pPr>
       <w:r>
+        <w:t>6.</w:t>
+      </w:r>
+      <w:r>
+        <w:tab/>
+      </w:r>
+      <w:r>
+        <w:t>No amendment may be considered or voted upon more than once in any five-year period unless new wording differs substantially from the rejected version.</w:t>
+      </w:r>
+    </w:p>
+    <w:p>
+      <w:pPr>
+        <w:ind w:left="360" w:hanging="360"/>
+      </w:pPr>
+      <w:r>
         <w:lastRenderedPageBreak/>
-        <w:t>6.</w:t>
-      </w:r>
-      <w:r>
-        <w:tab/>
-      </w:r>
-      <w:r>
-        <w:t>No amendment may be considered or voted upon more than once in any five-year period unless new wording differs substantially from the rejected version.</w:t>
-      </w:r>
-    </w:p>
-    <w:p>
-      <w:pPr>
-        <w:ind w:left="360" w:hanging="360"/>
-      </w:pPr>
-      <w:r>
         <w:t>7.</w:t>
       </w:r>
       <w:r>
@@ -19639,11 +19646,11 @@
         <w:t xml:space="preserve"> and establishment</w:t>
       </w:r>
       <w:r>
-        <w:t xml:space="preserve"> of a free, European, meritocratic nation. We </w:t>
+        <w:t xml:space="preserve"> of a free, European, meritocratic nation. We expect that the act of ratification itself may invite covert, clandestine, or overt </w:t>
       </w:r>
       <w:r>
         <w:lastRenderedPageBreak/>
-        <w:t>expect that the act of ratification itself may invite covert, clandestine, or overt attack</w:t>
+        <w:t>attack</w:t>
       </w:r>
       <w:r>
         <w:t>,</w:t>
@@ -24118,11 +24125,11 @@
   <w:abstractNum w:abstractNumId="43" w15:restartNumberingAfterBreak="0">
     <w:nsid w:val="5C74105C"/>
     <w:multiLevelType w:val="multilevel"/>
-    <w:tmpl w:val="78B06D42"/>
+    <w:tmpl w:val="620038AA"/>
     <w:lvl w:ilvl="0">
       <w:start w:val="3"/>
       <w:numFmt w:val="decimal"/>
-      <w:lvlText w:val="%1)"/>
+      <w:lvlText w:val="%1."/>
       <w:lvlJc w:val="left"/>
       <w:pPr>
         <w:ind w:left="360" w:hanging="360"/>

</xml_diff>

<commit_message>
no homo public service
</commit_message>
<xml_diff>
--- a/completePDF/Meritocratic Republic of Canada.docx
+++ b/completePDF/Meritocratic Republic of Canada.docx
@@ -508,8 +508,8 @@
       <w:bookmarkEnd w:id="55"/>
     </w:p>
     <w:p/>
-    <w:bookmarkStart w:id="56" w:name="_Toc215664772" w:displacedByCustomXml="next"/>
-    <w:bookmarkStart w:id="57" w:name="_Toc215665027" w:displacedByCustomXml="next"/>
+    <w:bookmarkStart w:id="56" w:name="_Toc215665027" w:displacedByCustomXml="next"/>
+    <w:bookmarkStart w:id="57" w:name="_Toc215664772" w:displacedByCustomXml="next"/>
     <w:sdt>
       <w:sdtPr>
         <w:rPr>
@@ -4345,14 +4345,28 @@
         <w:ind w:left="360" w:hanging="360"/>
       </w:pPr>
       <w:r>
+        <w:t>4.</w:t>
+      </w:r>
+      <w:r>
+        <w:tab/>
+      </w:r>
+      <w:r>
+        <w:t xml:space="preserve">They have shielded violent offenders with leniency and early release while threatening citizens with imprisonment for words spoken or written.  </w:t>
+      </w:r>
+    </w:p>
+    <w:p>
+      <w:pPr>
+        <w:ind w:left="360" w:hanging="360"/>
+      </w:pPr>
+      <w:r>
         <w:lastRenderedPageBreak/>
-        <w:t>4.</w:t>
-      </w:r>
-      <w:r>
-        <w:tab/>
-      </w:r>
-      <w:r>
-        <w:t xml:space="preserve">They have shielded violent offenders with leniency and early release while threatening citizens with imprisonment for words spoken or written.  </w:t>
+        <w:t>5.</w:t>
+      </w:r>
+      <w:r>
+        <w:tab/>
+      </w:r>
+      <w:r>
+        <w:t xml:space="preserve">They have subjected the people to speech codes, digital censorship, frozen bank accounts, and algorithmic suppression for political dissent.  </w:t>
       </w:r>
     </w:p>
     <w:p>
@@ -4360,13 +4374,13 @@
         <w:ind w:left="360" w:hanging="360"/>
       </w:pPr>
       <w:r>
-        <w:t>5.</w:t>
-      </w:r>
-      <w:r>
-        <w:tab/>
-      </w:r>
-      <w:r>
-        <w:t xml:space="preserve">They have subjected the people to speech codes, digital censorship, frozen bank accounts, and algorithmic suppression for political dissent.  </w:t>
+        <w:t>6.</w:t>
+      </w:r>
+      <w:r>
+        <w:tab/>
+      </w:r>
+      <w:r>
+        <w:t>They have invoked so-called “emergency powers” without lawful justification, freezing the bank accounts of peaceful citizens, trampling ancient rights of assembly and expression, and threatening the use of lethal force against lawful protest, abuses later judicially determined to be illegal, yet for which no official has ever been punished, revealing the power to declare “emergency” as the master-key to tyranny.</w:t>
       </w:r>
     </w:p>
     <w:p>
@@ -4374,13 +4388,13 @@
         <w:ind w:left="360" w:hanging="360"/>
       </w:pPr>
       <w:r>
-        <w:t>6.</w:t>
-      </w:r>
-      <w:r>
-        <w:tab/>
-      </w:r>
-      <w:r>
-        <w:t>They have invoked so-called “emergency powers” without lawful justification, freezing the bank accounts of peaceful citizens, trampling ancient rights of assembly and expression, and threatening the use of lethal force against lawful protest, abuses later judicially determined to be illegal, yet for which no official has ever been punished, revealing the power to declare “emergency” as the master-key to tyranny.</w:t>
+        <w:t>7.</w:t>
+      </w:r>
+      <w:r>
+        <w:tab/>
+      </w:r>
+      <w:r>
+        <w:t xml:space="preserve">They have permitted and, in many cases, encouraged the organized sexual corruption and medical mutilation of children in taxpayer-funded schools under the guise of “inclusion” and “gender ideology.”  </w:t>
       </w:r>
     </w:p>
     <w:p>
@@ -4388,13 +4402,13 @@
         <w:ind w:left="360" w:hanging="360"/>
       </w:pPr>
       <w:r>
-        <w:t>7.</w:t>
-      </w:r>
-      <w:r>
-        <w:tab/>
-      </w:r>
-      <w:r>
-        <w:t xml:space="preserve">They have permitted and, in many cases, encouraged the organized sexual corruption and medical mutilation of children in taxpayer-funded schools under the guise of “inclusion” and “gender ideology.”  </w:t>
+        <w:t>8.</w:t>
+      </w:r>
+      <w:r>
+        <w:tab/>
+      </w:r>
+      <w:r>
+        <w:t xml:space="preserve">They have opened the borders to mass migration without the consent of the people, eroding wages, straining housing, shattering cultural cohesion and destroying historic continuity, and endangering public safety.  </w:t>
       </w:r>
     </w:p>
     <w:p>
@@ -4402,13 +4416,13 @@
         <w:ind w:left="360" w:hanging="360"/>
       </w:pPr>
       <w:r>
-        <w:t>8.</w:t>
-      </w:r>
-      <w:r>
-        <w:tab/>
-      </w:r>
-      <w:r>
-        <w:t xml:space="preserve">They have opened the borders to mass migration without the consent of the people, eroding wages, straining housing, shattering cultural cohesion and destroying historic continuity, and endangering public safety.  </w:t>
+        <w:t>9.</w:t>
+      </w:r>
+      <w:r>
+        <w:tab/>
+      </w:r>
+      <w:r>
+        <w:t xml:space="preserve">They have surrendered national sovereignty to foreign and supranational bodies under pretexts of politically manufactured pseudosciences while rendering the historic Crown powerless to protect even its own subjects, as the daughters of England are assaulted in their own streets with impunity.  </w:t>
       </w:r>
     </w:p>
     <w:p>
@@ -4416,13 +4430,13 @@
         <w:ind w:left="360" w:hanging="360"/>
       </w:pPr>
       <w:r>
-        <w:t>9.</w:t>
-      </w:r>
-      <w:r>
-        <w:tab/>
-      </w:r>
-      <w:r>
-        <w:t xml:space="preserve">They have surrendered national sovereignty to foreign and supranational bodies under pretexts of politically manufactured pseudosciences while rendering the historic Crown powerless to protect even its own subjects, as the daughters of England are assaulted in their own streets with impunity.  </w:t>
+        <w:t>10.</w:t>
+      </w:r>
+      <w:r>
+        <w:tab/>
+      </w:r>
+      <w:r>
+        <w:t xml:space="preserve">They have debased the currency, exploded unrepayable public debt, and laid the groundwork or openly threatened the imposition of central-bank digital currencies to enslave future generations under programmable money.  </w:t>
       </w:r>
     </w:p>
     <w:p>
@@ -4430,13 +4444,13 @@
         <w:ind w:left="360" w:hanging="360"/>
       </w:pPr>
       <w:r>
-        <w:t>10.</w:t>
-      </w:r>
-      <w:r>
-        <w:tab/>
-      </w:r>
-      <w:r>
-        <w:t xml:space="preserve">They have debased the currency, exploded unrepayable public debt, and laid the groundwork or openly threatened the imposition of central-bank digital currencies to enslave future generations under programmable money.  </w:t>
+        <w:t>11.</w:t>
+      </w:r>
+      <w:r>
+        <w:tab/>
+      </w:r>
+      <w:r>
+        <w:t xml:space="preserve">They have forfeited every vestige of legitimacy by scorning the immemorial rights of the European peoples who conquered and settled this land with their blood, while working tirelessly to effect the demographic replacement of their descendants.  </w:t>
       </w:r>
     </w:p>
     <w:p>
@@ -4444,13 +4458,13 @@
         <w:ind w:left="360" w:hanging="360"/>
       </w:pPr>
       <w:r>
-        <w:t>11.</w:t>
-      </w:r>
-      <w:r>
-        <w:tab/>
-      </w:r>
-      <w:r>
-        <w:t xml:space="preserve">They have forfeited every vestige of legitimacy by scorning the immemorial rights of the European peoples who conquered and settled this land with their blood, while working tirelessly to effect the demographic replacement of their descendants.  </w:t>
+        <w:t>12.</w:t>
+      </w:r>
+      <w:r>
+        <w:tab/>
+      </w:r>
+      <w:r>
+        <w:t>They have imposed racial and ideological preferences in every institution under the false banners of “diversity, equity, and inclusion,” punishing merit and competence while rewarding failure and foreign allegiance.</w:t>
       </w:r>
     </w:p>
     <w:p>
@@ -4458,39 +4472,25 @@
         <w:ind w:left="360" w:hanging="360"/>
       </w:pPr>
       <w:r>
-        <w:t>12.</w:t>
-      </w:r>
-      <w:r>
-        <w:tab/>
-      </w:r>
-      <w:r>
-        <w:t>They have imposed racial and ideological preferences in every institution under the false banners of “diversity, equity, and inclusion,” punishing merit and competence while rewarding failure and foreign allegiance.</w:t>
-      </w:r>
-    </w:p>
-    <w:p>
-      <w:pPr>
-        <w:ind w:left="360" w:hanging="360"/>
-      </w:pPr>
+        <w:t>13.</w:t>
+      </w:r>
+      <w:r>
+        <w:tab/>
+      </w:r>
+      <w:r>
+        <w:t>They have surrendered the ancient birthright of the European found</w:t>
+      </w:r>
+      <w:r>
+        <w:t>ers and settlers</w:t>
+      </w:r>
+      <w:r>
+        <w:t xml:space="preserve"> of this nation to demographic replacement and cultural erasure, an act that meets every legal and moral definition of genocide.</w:t>
+      </w:r>
+    </w:p>
+    <w:p/>
+    <w:p>
       <w:r>
         <w:lastRenderedPageBreak/>
-        <w:t>13.</w:t>
-      </w:r>
-      <w:r>
-        <w:tab/>
-      </w:r>
-      <w:r>
-        <w:t>They have surrendered the ancient birthright of the European found</w:t>
-      </w:r>
-      <w:r>
-        <w:t>ers and settlers</w:t>
-      </w:r>
-      <w:r>
-        <w:t xml:space="preserve"> of this nation to demographic replacement and cultural erasure, an act that meets every legal and moral definition of genocide.</w:t>
-      </w:r>
-    </w:p>
-    <w:p/>
-    <w:p>
-      <w:r>
         <w:t>A government that rules by emergency decree, that criminalizes truth-telling, and that places the feelings</w:t>
       </w:r>
       <w:r>
@@ -12132,6 +12132,9 @@
       <w:r>
         <w:t xml:space="preserve"> than merit shall be:</w:t>
       </w:r>
+      <w:r>
+        <w:t xml:space="preserve"> </w:t>
+      </w:r>
     </w:p>
     <w:p>
       <w:pPr>
@@ -12200,10 +12203,14 @@
       <w:r>
         <w:t xml:space="preserve"> is death by firing squad, to be carried out seven days after final lawful determination.</w:t>
       </w:r>
-    </w:p>
-    <w:p>
-      <w:pPr>
-        <w:ind w:left="360" w:hanging="357"/>
+      <w:r>
+        <w:t xml:space="preserve"> </w:t>
+      </w:r>
+    </w:p>
+    <w:p>
+      <w:pPr>
+        <w:spacing w:after="0"/>
+        <w:ind w:left="363" w:hanging="357"/>
       </w:pPr>
       <w:r>
         <w:t>8.</w:t>
@@ -12212,7 +12219,89 @@
         <w:tab/>
       </w:r>
       <w:r>
-        <w:t>Sexual offences against minors, any non-consensual sexual crime committed by a public servant (past or present), or possession of child sexual abuse material (CSAM) by a public servant shall be punished by death by firing squad under the provisions of Article 5 and Article 15, in addition to automatic removal and permanent disqualification.</w:t>
+        <w:t xml:space="preserve">Any </w:t>
+      </w:r>
+      <w:r>
+        <w:t xml:space="preserve">person </w:t>
+      </w:r>
+      <w:r>
+        <w:t>who engages in or openly professes homosexual conduct or identity</w:t>
+      </w:r>
+      <w:r>
+        <w:t xml:space="preserve"> is </w:t>
+      </w:r>
+      <w:r>
+        <w:t>permanent</w:t>
+      </w:r>
+      <w:r>
+        <w:t>ly</w:t>
+      </w:r>
+      <w:r>
+        <w:t xml:space="preserve"> disqualifi</w:t>
+      </w:r>
+      <w:r>
+        <w:t xml:space="preserve">ed </w:t>
+      </w:r>
+      <w:r>
+        <w:t xml:space="preserve">for public service in any </w:t>
+      </w:r>
+      <w:r>
+        <w:t>position</w:t>
+      </w:r>
+      <w:r>
+        <w:t xml:space="preserve"> </w:t>
+      </w:r>
+      <w:r>
+        <w:t>of</w:t>
+      </w:r>
+      <w:r>
+        <w:t xml:space="preserve"> government.</w:t>
+      </w:r>
+      <w:r>
+        <w:t xml:space="preserve"> Any person discovered</w:t>
+      </w:r>
+      <w:r>
+        <w:t xml:space="preserve"> beyond reasonable doubt</w:t>
+      </w:r>
+      <w:r>
+        <w:t xml:space="preserve"> in court of law</w:t>
+      </w:r>
+      <w:r>
+        <w:t xml:space="preserve"> to be in violation of this provision shall immediately </w:t>
+      </w:r>
+      <w:r>
+        <w:t>be barred from public service for life, immediately be removed from their position</w:t>
+      </w:r>
+      <w:r>
+        <w:t xml:space="preserve"> including all privileges and responsibilities therein</w:t>
+      </w:r>
+      <w:r>
+        <w:t>, imprisoned for 5 years</w:t>
+      </w:r>
+      <w:r>
+        <w:t xml:space="preserve">, and fined </w:t>
+      </w:r>
+      <w:r>
+        <w:t>one year’s wage</w:t>
+      </w:r>
+      <w:r>
+        <w:t>.</w:t>
+      </w:r>
+      <w:r>
+        <w:t xml:space="preserve"> </w:t>
+      </w:r>
+    </w:p>
+    <w:p>
+      <w:pPr>
+        <w:pStyle w:val="ListParagraph"/>
+        <w:ind w:left="363"/>
+        <w:contextualSpacing w:val="0"/>
+      </w:pPr>
+      <w:r>
+        <w:t>Sexual offences against minors, any non-consensual sexual crime committed by a public servant (past or present), or possession of child sexual abuse material by a public servant shall be punished by death by firing squad under the provisions of Article 5 and Article 15, in addition to automatic removal and permanent disqualification.</w:t>
+      </w:r>
+      <w:r>
+        <w:t xml:space="preserve"> </w:t>
       </w:r>
     </w:p>
     <w:p>
@@ -12234,6 +12323,7 @@
         <w:ind w:left="720" w:hanging="360"/>
       </w:pPr>
       <w:r>
+        <w:lastRenderedPageBreak/>
         <w:t>a)</w:t>
       </w:r>
       <w:r>
@@ -12254,7 +12344,6 @@
         <w:ind w:left="720" w:hanging="360"/>
       </w:pPr>
       <w:r>
-        <w:lastRenderedPageBreak/>
         <w:t>b)</w:t>
       </w:r>
       <w:r>

</xml_diff>